<commit_message>
feat: add action masks method for MaskablePPO support in GraphAssignmentEnv
</commit_message>
<xml_diff>
--- a/docs/Project status summary.docx
+++ b/docs/Project status summary.docx
@@ -5507,6 +5507,7 @@
       </w:pPr>
       <w:hyperlink r:id="rId25" w:history="1">
         <w:proofErr w:type="spellStart"/>
+        <w:proofErr w:type="gramStart"/>
         <w:r>
           <w:rPr>
             <w:rStyle w:val="Hyperlink"/>
@@ -5523,6 +5524,7 @@
           <w:t>(</w:t>
         </w:r>
         <w:proofErr w:type="spellStart"/>
+        <w:proofErr w:type="gramEnd"/>
         <w:r>
           <w:rPr>
             <w:rStyle w:val="Hyperlink"/>
@@ -10461,7 +10463,7 @@
     <w:p>
       <w:r>
         <w:pict w14:anchorId="5F7CF27E">
-          <v:rect id="_x0000_i1076" style="width:0;height:1.5pt" o:hralign="center" o:hrstd="t" o:hr="t" fillcolor="#a0a0a0" stroked="f"/>
+          <v:rect id="_x0000_i1046" style="width:0;height:1.5pt" o:hralign="center" o:hrstd="t" o:hr="t" fillcolor="#a0a0a0" stroked="f"/>
         </w:pict>
       </w:r>
     </w:p>
@@ -10876,7 +10878,7 @@
     <w:p>
       <w:r>
         <w:pict w14:anchorId="576FB532">
-          <v:rect id="_x0000_i1077" style="width:0;height:1.5pt" o:hralign="center" o:hrstd="t" o:hr="t" fillcolor="#a0a0a0" stroked="f"/>
+          <v:rect id="_x0000_i1047" style="width:0;height:1.5pt" o:hralign="center" o:hrstd="t" o:hr="t" fillcolor="#a0a0a0" stroked="f"/>
         </w:pict>
       </w:r>
     </w:p>
@@ -11505,7 +11507,7 @@
     <w:p>
       <w:r>
         <w:pict w14:anchorId="73872ECE">
-          <v:rect id="_x0000_i1078" style="width:0;height:1.5pt" o:hralign="center" o:hrstd="t" o:hr="t" fillcolor="#a0a0a0" stroked="f"/>
+          <v:rect id="_x0000_i1048" style="width:0;height:1.5pt" o:hralign="center" o:hrstd="t" o:hr="t" fillcolor="#a0a0a0" stroked="f"/>
         </w:pict>
       </w:r>
     </w:p>
@@ -11910,7 +11912,7 @@
     <w:p>
       <w:r>
         <w:pict w14:anchorId="241B8767">
-          <v:rect id="_x0000_i1079" style="width:0;height:1.5pt" o:hralign="center" o:hrstd="t" o:hr="t" fillcolor="#a0a0a0" stroked="f"/>
+          <v:rect id="_x0000_i1049" style="width:0;height:1.5pt" o:hralign="center" o:hrstd="t" o:hr="t" fillcolor="#a0a0a0" stroked="f"/>
         </w:pict>
       </w:r>
     </w:p>
@@ -12340,7 +12342,7 @@
     <w:p>
       <w:r>
         <w:pict w14:anchorId="4F2649EB">
-          <v:rect id="_x0000_i1080" style="width:0;height:1.5pt" o:hralign="center" o:hrstd="t" o:hr="t" fillcolor="#a0a0a0" stroked="f"/>
+          <v:rect id="_x0000_i1050" style="width:0;height:1.5pt" o:hralign="center" o:hrstd="t" o:hr="t" fillcolor="#a0a0a0" stroked="f"/>
         </w:pict>
       </w:r>
     </w:p>
@@ -12587,6 +12589,1423 @@
       <w:proofErr w:type="spellEnd"/>
       <w:r>
         <w:t>.</w:t>
+      </w:r>
+    </w:p>
+    <w:p>
+      <w:pPr>
+        <w:pBdr>
+          <w:bottom w:val="single" w:sz="6" w:space="1" w:color="auto"/>
+        </w:pBdr>
+      </w:pPr>
+    </w:p>
+    <w:p/>
+    <w:p/>
+    <w:p>
+      <w:pPr>
+        <w:rPr>
+          <w:b/>
+          <w:bCs/>
+        </w:rPr>
+      </w:pPr>
+      <w:r>
+        <w:rPr>
+          <w:b/>
+          <w:bCs/>
+        </w:rPr>
+        <w:t>Evolución de la arquitectura: antes vs ahora</w:t>
+      </w:r>
+    </w:p>
+    <w:p>
+      <w:pPr>
+        <w:rPr>
+          <w:b/>
+          <w:bCs/>
+        </w:rPr>
+      </w:pPr>
+      <w:r>
+        <w:rPr>
+          <w:b/>
+          <w:bCs/>
+        </w:rPr>
+        <w:t>Antes</w:t>
+      </w:r>
+    </w:p>
+    <w:p>
+      <w:pPr>
+        <w:numPr>
+          <w:ilvl w:val="0"/>
+          <w:numId w:val="124"/>
+        </w:numPr>
+        <w:rPr>
+          <w:lang w:val="en-US"/>
+        </w:rPr>
+      </w:pPr>
+      <w:r>
+        <w:rPr>
+          <w:b/>
+          <w:bCs/>
+          <w:lang w:val="en-US"/>
+        </w:rPr>
+        <w:t>Env “normal” para SB3</w:t>
+      </w:r>
+      <w:r>
+        <w:rPr>
+          <w:lang w:val="en-US"/>
+        </w:rPr>
+        <w:t xml:space="preserve">: GraphAssignmentEnv expone reset/step, action_space=MultiDiscrete. </w:t>
+      </w:r>
+    </w:p>
+    <w:p>
+      <w:pPr>
+        <w:numPr>
+          <w:ilvl w:val="0"/>
+          <w:numId w:val="124"/>
+        </w:numPr>
+      </w:pPr>
+      <w:r>
+        <w:rPr>
+          <w:b/>
+          <w:bCs/>
+        </w:rPr>
+        <w:t>Observación = vector fijo</w:t>
+      </w:r>
+      <w:r>
+        <w:t xml:space="preserve">: </w:t>
+      </w:r>
+    </w:p>
+    <w:p>
+      <w:pPr>
+        <w:numPr>
+          <w:ilvl w:val="1"/>
+          <w:numId w:val="124"/>
+        </w:numPr>
+      </w:pPr>
+      <w:proofErr w:type="spellStart"/>
+      <w:r>
+        <w:t>assignment</w:t>
+      </w:r>
+      <w:proofErr w:type="spellEnd"/>
+      <w:r>
+        <w:t xml:space="preserve"> (</w:t>
+      </w:r>
+      <w:proofErr w:type="spellStart"/>
+      <w:r>
+        <w:t>features</w:t>
+      </w:r>
+      <w:proofErr w:type="spellEnd"/>
+      <w:r>
+        <w:t xml:space="preserve"> directas) o </w:t>
+      </w:r>
+    </w:p>
+    <w:p>
+      <w:pPr>
+        <w:numPr>
+          <w:ilvl w:val="1"/>
+          <w:numId w:val="124"/>
+        </w:numPr>
+      </w:pPr>
+      <w:r>
+        <w:t xml:space="preserve">graph (grafo → proyección manual → vector). </w:t>
+      </w:r>
+    </w:p>
+    <w:p>
+      <w:pPr>
+        <w:numPr>
+          <w:ilvl w:val="0"/>
+          <w:numId w:val="124"/>
+        </w:numPr>
+      </w:pPr>
+      <w:r>
+        <w:rPr>
+          <w:b/>
+          <w:bCs/>
+        </w:rPr>
+        <w:t>PPO entrenaba solo la MLP</w:t>
+      </w:r>
+      <w:r>
+        <w:t xml:space="preserve"> (</w:t>
+      </w:r>
+      <w:proofErr w:type="spellStart"/>
+      <w:r>
+        <w:t>MlpPolicy</w:t>
+      </w:r>
+      <w:proofErr w:type="spellEnd"/>
+      <w:r>
+        <w:t xml:space="preserve">) sobre ese vector. </w:t>
+      </w:r>
+    </w:p>
+    <w:p>
+      <w:pPr>
+        <w:numPr>
+          <w:ilvl w:val="0"/>
+          <w:numId w:val="124"/>
+        </w:numPr>
+      </w:pPr>
+      <w:r>
+        <w:rPr>
+          <w:b/>
+          <w:bCs/>
+        </w:rPr>
+        <w:lastRenderedPageBreak/>
+        <w:t>La máscara existía conceptualmente</w:t>
+      </w:r>
+      <w:r>
+        <w:t xml:space="preserve">, pero </w:t>
+      </w:r>
+      <w:r>
+        <w:rPr>
+          <w:b/>
+          <w:bCs/>
+        </w:rPr>
+        <w:t>no se aplicaba al muestreo</w:t>
+      </w:r>
+      <w:r>
+        <w:t xml:space="preserve">: la </w:t>
+      </w:r>
+      <w:proofErr w:type="spellStart"/>
+      <w:r>
+        <w:t>policy</w:t>
+      </w:r>
+      <w:proofErr w:type="spellEnd"/>
+      <w:r>
+        <w:t xml:space="preserve"> podía proponer inválidos y el </w:t>
+      </w:r>
+      <w:proofErr w:type="spellStart"/>
+      <w:r>
+        <w:t>controller</w:t>
+      </w:r>
+      <w:proofErr w:type="spellEnd"/>
+      <w:r>
+        <w:t xml:space="preserve"> los “absorbía”. </w:t>
+      </w:r>
+    </w:p>
+    <w:p>
+      <w:r>
+        <w:rPr>
+          <w:b/>
+          <w:bCs/>
+        </w:rPr>
+        <w:t>Aporte</w:t>
+      </w:r>
+      <w:r>
+        <w:t>: pipeline estable y rápido, pero el aprendizaje estaba limitado por el “</w:t>
+      </w:r>
+      <w:proofErr w:type="spellStart"/>
+      <w:r>
+        <w:t>feature</w:t>
+      </w:r>
+      <w:proofErr w:type="spellEnd"/>
+      <w:r>
+        <w:t xml:space="preserve"> </w:t>
+      </w:r>
+      <w:proofErr w:type="spellStart"/>
+      <w:r>
+        <w:t>engineering</w:t>
+      </w:r>
+      <w:proofErr w:type="spellEnd"/>
+      <w:r>
+        <w:t>” (y exploración inválida).</w:t>
+      </w:r>
+    </w:p>
+    <w:p>
+      <w:r>
+        <w:pict w14:anchorId="5F78A751">
+          <v:rect id="_x0000_i1075" style="width:0;height:1.5pt" o:hralign="center" o:hrstd="t" o:hr="t" fillcolor="#a0a0a0" stroked="f"/>
+        </w:pict>
+      </w:r>
+    </w:p>
+    <w:p>
+      <w:pPr>
+        <w:rPr>
+          <w:b/>
+          <w:bCs/>
+        </w:rPr>
+      </w:pPr>
+      <w:r>
+        <w:rPr>
+          <w:b/>
+          <w:bCs/>
+        </w:rPr>
+        <w:t>Ahora (principales adiciones)</w:t>
+      </w:r>
+    </w:p>
+    <w:p>
+      <w:pPr>
+        <w:numPr>
+          <w:ilvl w:val="0"/>
+          <w:numId w:val="125"/>
+        </w:numPr>
+      </w:pPr>
+      <w:proofErr w:type="spellStart"/>
+      <w:r>
+        <w:rPr>
+          <w:b/>
+          <w:bCs/>
+        </w:rPr>
+        <w:t>Backend</w:t>
+      </w:r>
+      <w:proofErr w:type="spellEnd"/>
+      <w:r>
+        <w:rPr>
+          <w:b/>
+          <w:bCs/>
+        </w:rPr>
+        <w:t xml:space="preserve"> </w:t>
+      </w:r>
+      <w:proofErr w:type="spellStart"/>
+      <w:r>
+        <w:rPr>
+          <w:b/>
+          <w:bCs/>
+        </w:rPr>
+        <w:t>graph_dict</w:t>
+      </w:r>
+      <w:proofErr w:type="spellEnd"/>
+      <w:r>
+        <w:rPr>
+          <w:b/>
+          <w:bCs/>
+        </w:rPr>
+        <w:t xml:space="preserve"> (observación como </w:t>
+      </w:r>
+      <w:proofErr w:type="spellStart"/>
+      <w:r>
+        <w:rPr>
+          <w:b/>
+          <w:bCs/>
+        </w:rPr>
+        <w:t>Dict</w:t>
+      </w:r>
+      <w:proofErr w:type="spellEnd"/>
+      <w:r>
+        <w:rPr>
+          <w:b/>
+          <w:bCs/>
+        </w:rPr>
+        <w:t xml:space="preserve"> de grafo </w:t>
+      </w:r>
+      <w:proofErr w:type="spellStart"/>
+      <w:r>
+        <w:rPr>
+          <w:b/>
+          <w:bCs/>
+        </w:rPr>
+        <w:t>padded</w:t>
+      </w:r>
+      <w:proofErr w:type="spellEnd"/>
+      <w:r>
+        <w:rPr>
+          <w:b/>
+          <w:bCs/>
+        </w:rPr>
+        <w:t>)</w:t>
+      </w:r>
+      <w:r>
+        <w:t xml:space="preserve"> </w:t>
+      </w:r>
+    </w:p>
+    <w:p>
+      <w:pPr>
+        <w:numPr>
+          <w:ilvl w:val="1"/>
+          <w:numId w:val="125"/>
+        </w:numPr>
+      </w:pPr>
+      <w:r>
+        <w:t xml:space="preserve">El </w:t>
+      </w:r>
+      <w:proofErr w:type="spellStart"/>
+      <w:r>
+        <w:t>env</w:t>
+      </w:r>
+      <w:proofErr w:type="spellEnd"/>
+      <w:r>
+        <w:t xml:space="preserve"> puede devolver un </w:t>
+      </w:r>
+      <w:proofErr w:type="spellStart"/>
+      <w:r>
+        <w:t>dict</w:t>
+      </w:r>
+      <w:proofErr w:type="spellEnd"/>
+      <w:r>
+        <w:t xml:space="preserve"> con: </w:t>
+      </w:r>
+      <w:proofErr w:type="spellStart"/>
+      <w:r>
+        <w:t>node_features</w:t>
+      </w:r>
+      <w:proofErr w:type="spellEnd"/>
+      <w:r>
+        <w:t xml:space="preserve">, </w:t>
+      </w:r>
+      <w:proofErr w:type="spellStart"/>
+      <w:r>
+        <w:t>edge_index</w:t>
+      </w:r>
+      <w:proofErr w:type="spellEnd"/>
+      <w:r>
+        <w:t xml:space="preserve">, </w:t>
+      </w:r>
+      <w:proofErr w:type="spellStart"/>
+      <w:r>
+        <w:t>edge_attr</w:t>
+      </w:r>
+      <w:proofErr w:type="spellEnd"/>
+      <w:r>
+        <w:t xml:space="preserve">, </w:t>
+      </w:r>
+      <w:proofErr w:type="spellStart"/>
+      <w:r>
+        <w:t>action_mask</w:t>
+      </w:r>
+      <w:proofErr w:type="spellEnd"/>
+      <w:r>
+        <w:t xml:space="preserve"> + contadores (</w:t>
+      </w:r>
+      <w:proofErr w:type="spellStart"/>
+      <w:r>
+        <w:t>n_nodes</w:t>
+      </w:r>
+      <w:proofErr w:type="spellEnd"/>
+      <w:r>
+        <w:t xml:space="preserve">, </w:t>
+      </w:r>
+      <w:proofErr w:type="spellStart"/>
+      <w:r>
+        <w:t>n_edges</w:t>
+      </w:r>
+      <w:proofErr w:type="spellEnd"/>
+      <w:r>
+        <w:t xml:space="preserve">, </w:t>
+      </w:r>
+      <w:proofErr w:type="spellStart"/>
+      <w:r>
+        <w:t>n_tasks</w:t>
+      </w:r>
+      <w:proofErr w:type="spellEnd"/>
+      <w:r>
+        <w:t xml:space="preserve">). </w:t>
+      </w:r>
+    </w:p>
+    <w:p>
+      <w:pPr>
+        <w:numPr>
+          <w:ilvl w:val="1"/>
+          <w:numId w:val="125"/>
+        </w:numPr>
+      </w:pPr>
+      <w:r>
+        <w:t xml:space="preserve">Esto permite que el </w:t>
+      </w:r>
+      <w:proofErr w:type="spellStart"/>
+      <w:r>
+        <w:t>policy</w:t>
+      </w:r>
+      <w:proofErr w:type="spellEnd"/>
+      <w:r>
+        <w:t xml:space="preserve"> “vea” el grafo como estructura, con </w:t>
+      </w:r>
+      <w:proofErr w:type="spellStart"/>
+      <w:r>
+        <w:t>shapes</w:t>
+      </w:r>
+      <w:proofErr w:type="spellEnd"/>
+      <w:r>
+        <w:t xml:space="preserve"> fijas (</w:t>
+      </w:r>
+      <w:proofErr w:type="spellStart"/>
+      <w:r>
+        <w:t>padding</w:t>
+      </w:r>
+      <w:proofErr w:type="spellEnd"/>
+      <w:r>
+        <w:t xml:space="preserve">). </w:t>
+      </w:r>
+    </w:p>
+    <w:p>
+      <w:pPr>
+        <w:numPr>
+          <w:ilvl w:val="0"/>
+          <w:numId w:val="125"/>
+        </w:numPr>
+      </w:pPr>
+      <w:proofErr w:type="spellStart"/>
+      <w:r>
+        <w:rPr>
+          <w:b/>
+          <w:bCs/>
+        </w:rPr>
+        <w:t>GnnFeatureExtractor</w:t>
+      </w:r>
+      <w:proofErr w:type="spellEnd"/>
+      <w:r>
+        <w:rPr>
+          <w:b/>
+          <w:bCs/>
+        </w:rPr>
+        <w:t xml:space="preserve"> </w:t>
+      </w:r>
+      <w:proofErr w:type="spellStart"/>
+      <w:r>
+        <w:rPr>
+          <w:b/>
+          <w:bCs/>
+        </w:rPr>
+        <w:t>entrenable</w:t>
+      </w:r>
+      <w:proofErr w:type="spellEnd"/>
+      <w:r>
+        <w:rPr>
+          <w:b/>
+          <w:bCs/>
+        </w:rPr>
+        <w:t xml:space="preserve"> (GNN + </w:t>
+      </w:r>
+      <w:proofErr w:type="spellStart"/>
+      <w:r>
+        <w:rPr>
+          <w:b/>
+          <w:bCs/>
+        </w:rPr>
+        <w:t>pooling</w:t>
+      </w:r>
+      <w:proofErr w:type="spellEnd"/>
+      <w:r>
+        <w:rPr>
+          <w:b/>
+          <w:bCs/>
+        </w:rPr>
+        <w:t xml:space="preserve"> dentro de SB3)</w:t>
+      </w:r>
+      <w:r>
+        <w:t xml:space="preserve"> </w:t>
+      </w:r>
+    </w:p>
+    <w:p>
+      <w:pPr>
+        <w:numPr>
+          <w:ilvl w:val="1"/>
+          <w:numId w:val="125"/>
+        </w:numPr>
+      </w:pPr>
+      <w:r>
+        <w:t xml:space="preserve">SB3 usa </w:t>
+      </w:r>
+      <w:proofErr w:type="spellStart"/>
+      <w:r>
+        <w:t>MultiInputPolicy</w:t>
+      </w:r>
+      <w:proofErr w:type="spellEnd"/>
+      <w:r>
+        <w:t xml:space="preserve">. </w:t>
+      </w:r>
+    </w:p>
+    <w:p>
+      <w:pPr>
+        <w:numPr>
+          <w:ilvl w:val="1"/>
+          <w:numId w:val="125"/>
+        </w:numPr>
+      </w:pPr>
+      <w:r>
+        <w:t xml:space="preserve">El extractor corre la </w:t>
+      </w:r>
+      <w:r>
+        <w:rPr>
+          <w:b/>
+          <w:bCs/>
+        </w:rPr>
+        <w:t>GNN</w:t>
+      </w:r>
+      <w:r>
+        <w:t xml:space="preserve"> y hace </w:t>
+      </w:r>
+      <w:proofErr w:type="spellStart"/>
+      <w:r>
+        <w:rPr>
+          <w:b/>
+          <w:bCs/>
+        </w:rPr>
+        <w:t>pooling</w:t>
+      </w:r>
+      <w:proofErr w:type="spellEnd"/>
+      <w:r>
+        <w:t xml:space="preserve"> para producir un embedding fijo z. </w:t>
+      </w:r>
+    </w:p>
+    <w:p>
+      <w:pPr>
+        <w:numPr>
+          <w:ilvl w:val="1"/>
+          <w:numId w:val="125"/>
+        </w:numPr>
+      </w:pPr>
+      <w:r>
+        <w:t xml:space="preserve">Como esto está dentro del forward del </w:t>
+      </w:r>
+      <w:proofErr w:type="spellStart"/>
+      <w:r>
+        <w:t>policy</w:t>
+      </w:r>
+      <w:proofErr w:type="spellEnd"/>
+      <w:r>
+        <w:t xml:space="preserve">, </w:t>
+      </w:r>
+      <w:r>
+        <w:rPr>
+          <w:b/>
+          <w:bCs/>
+        </w:rPr>
+        <w:t xml:space="preserve">PPO entrena </w:t>
+      </w:r>
+      <w:proofErr w:type="spellStart"/>
+      <w:r>
+        <w:rPr>
+          <w:b/>
+          <w:bCs/>
+        </w:rPr>
+        <w:t>end-to-end</w:t>
+      </w:r>
+      <w:proofErr w:type="spellEnd"/>
+      <w:r>
+        <w:t xml:space="preserve">: GNN + </w:t>
+      </w:r>
+      <w:proofErr w:type="spellStart"/>
+      <w:r>
+        <w:t>heads</w:t>
+      </w:r>
+      <w:proofErr w:type="spellEnd"/>
+      <w:r>
+        <w:t xml:space="preserve">. </w:t>
+      </w:r>
+    </w:p>
+    <w:p>
+      <w:pPr>
+        <w:numPr>
+          <w:ilvl w:val="0"/>
+          <w:numId w:val="125"/>
+        </w:numPr>
+      </w:pPr>
+      <w:proofErr w:type="spellStart"/>
+      <w:r>
+        <w:rPr>
+          <w:b/>
+          <w:bCs/>
+        </w:rPr>
+        <w:t>Masking</w:t>
+      </w:r>
+      <w:proofErr w:type="spellEnd"/>
+      <w:r>
+        <w:rPr>
+          <w:b/>
+          <w:bCs/>
+        </w:rPr>
+        <w:t xml:space="preserve"> real con </w:t>
+      </w:r>
+      <w:proofErr w:type="spellStart"/>
+      <w:r>
+        <w:rPr>
+          <w:b/>
+          <w:bCs/>
+        </w:rPr>
+        <w:t>MaskablePPO</w:t>
+      </w:r>
+      <w:proofErr w:type="spellEnd"/>
+      <w:r>
+        <w:rPr>
+          <w:b/>
+          <w:bCs/>
+        </w:rPr>
+        <w:t xml:space="preserve"> + </w:t>
+      </w:r>
+      <w:proofErr w:type="spellStart"/>
+      <w:r>
+        <w:rPr>
+          <w:b/>
+          <w:bCs/>
+        </w:rPr>
+        <w:t>ActionMasker</w:t>
+      </w:r>
+      <w:proofErr w:type="spellEnd"/>
+      <w:r>
+        <w:t xml:space="preserve"> </w:t>
+      </w:r>
+    </w:p>
+    <w:p>
+      <w:pPr>
+        <w:numPr>
+          <w:ilvl w:val="1"/>
+          <w:numId w:val="125"/>
+        </w:numPr>
+      </w:pPr>
+      <w:r>
+        <w:t xml:space="preserve">En cada paso, el algoritmo consulta </w:t>
+      </w:r>
+      <w:proofErr w:type="spellStart"/>
+      <w:proofErr w:type="gramStart"/>
+      <w:r>
+        <w:t>env.action</w:t>
+      </w:r>
+      <w:proofErr w:type="gramEnd"/>
+      <w:r>
+        <w:t>_</w:t>
+      </w:r>
+      <w:proofErr w:type="gramStart"/>
+      <w:r>
+        <w:t>masks</w:t>
+      </w:r>
+      <w:proofErr w:type="spellEnd"/>
+      <w:r>
+        <w:t>(</w:t>
+      </w:r>
+      <w:proofErr w:type="gramEnd"/>
+      <w:r>
+        <w:t xml:space="preserve">). </w:t>
+      </w:r>
+    </w:p>
+    <w:p>
+      <w:pPr>
+        <w:numPr>
+          <w:ilvl w:val="1"/>
+          <w:numId w:val="125"/>
+        </w:numPr>
+      </w:pPr>
+      <w:r>
+        <w:t xml:space="preserve">Aplica la máscara a los </w:t>
+      </w:r>
+      <w:proofErr w:type="spellStart"/>
+      <w:r>
+        <w:t>logits</w:t>
+      </w:r>
+      <w:proofErr w:type="spellEnd"/>
+      <w:r>
+        <w:t xml:space="preserve"> (inválidos → </w:t>
+      </w:r>
+      <w:proofErr w:type="spellStart"/>
+      <w:r>
+        <w:t>prob</w:t>
+      </w:r>
+      <w:proofErr w:type="spellEnd"/>
+      <w:r>
+        <w:t xml:space="preserve"> 0) </w:t>
+      </w:r>
+      <w:r>
+        <w:rPr>
+          <w:b/>
+          <w:bCs/>
+        </w:rPr>
+        <w:t>antes</w:t>
+      </w:r>
+      <w:r>
+        <w:t xml:space="preserve"> de </w:t>
+      </w:r>
+      <w:proofErr w:type="spellStart"/>
+      <w:r>
+        <w:t>samplear</w:t>
+      </w:r>
+      <w:proofErr w:type="spellEnd"/>
+      <w:r>
+        <w:t xml:space="preserve">. </w:t>
+      </w:r>
+    </w:p>
+    <w:p>
+      <w:pPr>
+        <w:numPr>
+          <w:ilvl w:val="1"/>
+          <w:numId w:val="125"/>
+        </w:numPr>
+      </w:pPr>
+      <w:r>
+        <w:t xml:space="preserve">Resultado: </w:t>
+      </w:r>
+      <w:r>
+        <w:rPr>
+          <w:b/>
+          <w:bCs/>
+        </w:rPr>
+        <w:t>no explora acciones inválidas</w:t>
+      </w:r>
+      <w:r>
+        <w:t xml:space="preserve">. </w:t>
+      </w:r>
+    </w:p>
+    <w:p>
+      <w:r>
+        <w:rPr>
+          <w:b/>
+          <w:bCs/>
+        </w:rPr>
+        <w:t>Aporte</w:t>
+      </w:r>
+      <w:r>
+        <w:t xml:space="preserve">: más expresividad (grafo real), </w:t>
+      </w:r>
+      <w:proofErr w:type="spellStart"/>
+      <w:r>
+        <w:t>embeddings</w:t>
+      </w:r>
+      <w:proofErr w:type="spellEnd"/>
+      <w:r>
+        <w:t xml:space="preserve"> aprendidos (no solo manual), y aprendizaje más eficiente/estable (</w:t>
+      </w:r>
+      <w:proofErr w:type="spellStart"/>
+      <w:r>
+        <w:t>masking</w:t>
+      </w:r>
+      <w:proofErr w:type="spellEnd"/>
+      <w:r>
+        <w:t>).</w:t>
+      </w:r>
+    </w:p>
+    <w:p>
+      <w:r>
+        <w:pict w14:anchorId="32B7ABF0">
+          <v:rect id="_x0000_i1076" style="width:0;height:1.5pt" o:hralign="center" o:hrstd="t" o:hr="t" fillcolor="#a0a0a0" stroked="f"/>
+        </w:pict>
+      </w:r>
+    </w:p>
+    <w:p>
+      <w:pPr>
+        <w:rPr>
+          <w:b/>
+          <w:bCs/>
+        </w:rPr>
+      </w:pPr>
+      <w:r>
+        <w:rPr>
+          <w:b/>
+          <w:bCs/>
+        </w:rPr>
+        <w:t>Qué nos aporta esta evolución (en una frase)</w:t>
+      </w:r>
+    </w:p>
+    <w:p>
+      <w:r>
+        <w:t xml:space="preserve">Pasamos de “PPO sobre vector con </w:t>
+      </w:r>
+      <w:proofErr w:type="spellStart"/>
+      <w:r>
+        <w:t>features</w:t>
+      </w:r>
+      <w:proofErr w:type="spellEnd"/>
+      <w:r>
+        <w:t xml:space="preserve"> diseñadas” a “PPO que puede </w:t>
+      </w:r>
+      <w:r>
+        <w:rPr>
+          <w:b/>
+          <w:bCs/>
+        </w:rPr>
+        <w:t>aprender representaciones del grafo</w:t>
+      </w:r>
+      <w:r>
+        <w:t xml:space="preserve"> y </w:t>
+      </w:r>
+      <w:r>
+        <w:rPr>
+          <w:b/>
+          <w:bCs/>
+        </w:rPr>
+        <w:t>decidir solo entre acciones válidas</w:t>
+      </w:r>
+      <w:r>
+        <w:t>”, manteniendo SB3 sin reescritura.</w:t>
+      </w:r>
+    </w:p>
+    <w:p>
+      <w:r>
+        <w:pict w14:anchorId="4B4BE40A">
+          <v:rect id="_x0000_i1077" style="width:0;height:1.5pt" o:hralign="center" o:hrstd="t" o:hr="t" fillcolor="#a0a0a0" stroked="f"/>
+        </w:pict>
+      </w:r>
+    </w:p>
+    <w:p>
+      <w:pPr>
+        <w:rPr>
+          <w:b/>
+          <w:bCs/>
+        </w:rPr>
+      </w:pPr>
+      <w:r>
+        <w:rPr>
+          <w:b/>
+          <w:bCs/>
+        </w:rPr>
+        <w:t>Flujo principal: entrada → salida</w:t>
+      </w:r>
+    </w:p>
+    <w:p>
+      <w:pPr>
+        <w:rPr>
+          <w:b/>
+          <w:bCs/>
+        </w:rPr>
+      </w:pPr>
+      <w:r>
+        <w:rPr>
+          <w:b/>
+          <w:bCs/>
+        </w:rPr>
+        <w:t>Entrada (lo que recibe el sistema en cada decisión)</w:t>
+      </w:r>
+    </w:p>
+    <w:p>
+      <w:pPr>
+        <w:numPr>
+          <w:ilvl w:val="0"/>
+          <w:numId w:val="126"/>
+        </w:numPr>
+      </w:pPr>
+      <w:r>
+        <w:rPr>
+          <w:b/>
+          <w:bCs/>
+        </w:rPr>
+        <w:t xml:space="preserve">Estado del </w:t>
+      </w:r>
+      <w:proofErr w:type="spellStart"/>
+      <w:r>
+        <w:rPr>
+          <w:b/>
+          <w:bCs/>
+        </w:rPr>
+        <w:t>warehouse</w:t>
+      </w:r>
+      <w:proofErr w:type="spellEnd"/>
+      <w:r>
+        <w:t xml:space="preserve">: robots (posición/ocupación), tareas (cola), restricciones. </w:t>
+      </w:r>
+    </w:p>
+    <w:p>
+      <w:pPr>
+        <w:numPr>
+          <w:ilvl w:val="0"/>
+          <w:numId w:val="126"/>
+        </w:numPr>
+      </w:pPr>
+      <w:r>
+        <w:t xml:space="preserve">Representación interna según modo: </w:t>
+      </w:r>
+    </w:p>
+    <w:p>
+      <w:pPr>
+        <w:numPr>
+          <w:ilvl w:val="1"/>
+          <w:numId w:val="126"/>
+        </w:numPr>
+      </w:pPr>
+      <w:proofErr w:type="spellStart"/>
+      <w:r>
+        <w:t>assignment</w:t>
+      </w:r>
+      <w:proofErr w:type="spellEnd"/>
+      <w:r>
+        <w:t xml:space="preserve">/graph: vector fijo </w:t>
+      </w:r>
+    </w:p>
+    <w:p>
+      <w:pPr>
+        <w:numPr>
+          <w:ilvl w:val="1"/>
+          <w:numId w:val="126"/>
+        </w:numPr>
+        <w:rPr>
+          <w:lang w:val="en-US"/>
+        </w:rPr>
+      </w:pPr>
+      <w:r>
+        <w:rPr>
+          <w:lang w:val="en-US"/>
+        </w:rPr>
+        <w:t xml:space="preserve">graph_dict: grafo padded + action_mask </w:t>
+      </w:r>
+    </w:p>
+    <w:p>
+      <w:pPr>
+        <w:rPr>
+          <w:b/>
+          <w:bCs/>
+        </w:rPr>
+      </w:pPr>
+      <w:r>
+        <w:rPr>
+          <w:b/>
+          <w:bCs/>
+        </w:rPr>
+        <w:lastRenderedPageBreak/>
+        <w:t>Proceso (qué ocurre en el medio)</w:t>
+      </w:r>
+    </w:p>
+    <w:p>
+      <w:pPr>
+        <w:numPr>
+          <w:ilvl w:val="0"/>
+          <w:numId w:val="127"/>
+        </w:numPr>
+      </w:pPr>
+      <w:r>
+        <w:rPr>
+          <w:b/>
+          <w:bCs/>
+        </w:rPr>
+        <w:t>Policy (PPO)</w:t>
+      </w:r>
+      <w:r>
+        <w:t xml:space="preserve"> produce una acción: </w:t>
+      </w:r>
+    </w:p>
+    <w:p>
+      <w:pPr>
+        <w:numPr>
+          <w:ilvl w:val="1"/>
+          <w:numId w:val="127"/>
+        </w:numPr>
+        <w:rPr>
+          <w:lang w:val="en-US"/>
+        </w:rPr>
+      </w:pPr>
+      <w:r>
+        <w:rPr>
+          <w:lang w:val="en-US"/>
+        </w:rPr>
+        <w:t xml:space="preserve">con graph_dict: obs_dict → GNNFeatureExtractor → z → actor logits </w:t>
+      </w:r>
+    </w:p>
+    <w:p>
+      <w:pPr>
+        <w:numPr>
+          <w:ilvl w:val="0"/>
+          <w:numId w:val="127"/>
+        </w:numPr>
+      </w:pPr>
+      <w:proofErr w:type="spellStart"/>
+      <w:r>
+        <w:rPr>
+          <w:b/>
+          <w:bCs/>
+        </w:rPr>
+        <w:t>Masking</w:t>
+      </w:r>
+      <w:proofErr w:type="spellEnd"/>
+      <w:r>
+        <w:rPr>
+          <w:b/>
+          <w:bCs/>
+        </w:rPr>
+        <w:t xml:space="preserve"> real</w:t>
+      </w:r>
+      <w:r>
+        <w:t xml:space="preserve"> (si </w:t>
+      </w:r>
+      <w:proofErr w:type="spellStart"/>
+      <w:r>
+        <w:t>MaskablePPO</w:t>
+      </w:r>
+      <w:proofErr w:type="spellEnd"/>
+      <w:r>
+        <w:t xml:space="preserve">): </w:t>
+      </w:r>
+    </w:p>
+    <w:p>
+      <w:pPr>
+        <w:numPr>
+          <w:ilvl w:val="1"/>
+          <w:numId w:val="127"/>
+        </w:numPr>
+      </w:pPr>
+      <w:r>
+        <w:t xml:space="preserve">elimina acciones inválidas del muestreo </w:t>
+      </w:r>
+    </w:p>
+    <w:p>
+      <w:pPr>
+        <w:numPr>
+          <w:ilvl w:val="0"/>
+          <w:numId w:val="127"/>
+        </w:numPr>
+      </w:pPr>
+      <w:r>
+        <w:rPr>
+          <w:b/>
+          <w:bCs/>
+        </w:rPr>
+        <w:t>Acción RL</w:t>
+      </w:r>
+      <w:r>
+        <w:t xml:space="preserve"> = asignaciones por AGV (slots) </w:t>
+      </w:r>
+    </w:p>
+    <w:p>
+      <w:pPr>
+        <w:numPr>
+          <w:ilvl w:val="0"/>
+          <w:numId w:val="127"/>
+        </w:numPr>
+      </w:pPr>
+      <w:proofErr w:type="spellStart"/>
+      <w:r>
+        <w:rPr>
+          <w:b/>
+          <w:bCs/>
+        </w:rPr>
+        <w:t>Controller</w:t>
+      </w:r>
+      <w:proofErr w:type="spellEnd"/>
+      <w:r>
+        <w:t xml:space="preserve"> ejecuta la </w:t>
+      </w:r>
+      <w:proofErr w:type="spellStart"/>
+      <w:r>
+        <w:t>macro-misión</w:t>
+      </w:r>
+      <w:proofErr w:type="spellEnd"/>
+      <w:r>
+        <w:t xml:space="preserve"> y traduce a acciones del simulador </w:t>
+      </w:r>
+    </w:p>
+    <w:p>
+      <w:pPr>
+        <w:rPr>
+          <w:b/>
+          <w:bCs/>
+        </w:rPr>
+      </w:pPr>
+      <w:r>
+        <w:rPr>
+          <w:b/>
+          <w:bCs/>
+        </w:rPr>
+        <w:t>Salida (lo que entrega el sistema)</w:t>
+      </w:r>
+    </w:p>
+    <w:p>
+      <w:pPr>
+        <w:numPr>
+          <w:ilvl w:val="0"/>
+          <w:numId w:val="128"/>
+        </w:numPr>
+      </w:pPr>
+      <w:r>
+        <w:rPr>
+          <w:b/>
+          <w:bCs/>
+        </w:rPr>
+        <w:t>Acción de alto nivel</w:t>
+      </w:r>
+      <w:r>
+        <w:t xml:space="preserve">: asignación </w:t>
+      </w:r>
+      <w:proofErr w:type="spellStart"/>
+      <w:r>
+        <w:t>robot→tarea</w:t>
+      </w:r>
+      <w:proofErr w:type="spellEnd"/>
+      <w:r>
+        <w:t xml:space="preserve"> (slots) </w:t>
+      </w:r>
+    </w:p>
+    <w:p>
+      <w:pPr>
+        <w:numPr>
+          <w:ilvl w:val="0"/>
+          <w:numId w:val="128"/>
+        </w:numPr>
+      </w:pPr>
+      <w:r>
+        <w:rPr>
+          <w:b/>
+          <w:bCs/>
+        </w:rPr>
+        <w:t>Efecto en el mundo</w:t>
+      </w:r>
+      <w:r>
+        <w:t xml:space="preserve">: movimientos/acciones ejecutadas por el simulador </w:t>
+      </w:r>
+      <w:proofErr w:type="spellStart"/>
+      <w:r>
+        <w:t>via</w:t>
+      </w:r>
+      <w:proofErr w:type="spellEnd"/>
+      <w:r>
+        <w:t xml:space="preserve"> </w:t>
+      </w:r>
+      <w:proofErr w:type="spellStart"/>
+      <w:r>
+        <w:t>controller</w:t>
+      </w:r>
+      <w:proofErr w:type="spellEnd"/>
+      <w:r>
+        <w:t xml:space="preserve"> </w:t>
+      </w:r>
+    </w:p>
+    <w:p>
+      <w:pPr>
+        <w:numPr>
+          <w:ilvl w:val="0"/>
+          <w:numId w:val="128"/>
+        </w:numPr>
+      </w:pPr>
+      <w:proofErr w:type="spellStart"/>
+      <w:r>
+        <w:rPr>
+          <w:b/>
+          <w:bCs/>
+        </w:rPr>
+        <w:t>Feedback</w:t>
+      </w:r>
+      <w:proofErr w:type="spellEnd"/>
+      <w:r>
+        <w:t xml:space="preserve">: </w:t>
+      </w:r>
+      <w:proofErr w:type="spellStart"/>
+      <w:r>
+        <w:t>reward</w:t>
+      </w:r>
+      <w:proofErr w:type="spellEnd"/>
+      <w:r>
+        <w:t xml:space="preserve"> + métricas (entregas, etc.) </w:t>
+      </w:r>
+    </w:p>
+    <w:p>
+      <w:r>
+        <w:pict w14:anchorId="397822E8">
+          <v:rect id="_x0000_i1078" style="width:0;height:1.5pt" o:hralign="center" o:hrstd="t" o:hr="t" fillcolor="#a0a0a0" stroked="f"/>
+        </w:pict>
+      </w:r>
+    </w:p>
+    <w:p>
+      <w:pPr>
+        <w:rPr>
+          <w:b/>
+          <w:bCs/>
+        </w:rPr>
+      </w:pPr>
+      <w:r>
+        <w:rPr>
+          <w:b/>
+          <w:bCs/>
+        </w:rPr>
+        <w:t>En qué nivel de objetivos están</w:t>
+      </w:r>
+    </w:p>
+    <w:p>
+      <w:pPr>
+        <w:numPr>
+          <w:ilvl w:val="0"/>
+          <w:numId w:val="129"/>
+        </w:numPr>
+      </w:pPr>
+      <w:r>
+        <w:rPr>
+          <w:rFonts w:ascii="Segoe UI Emoji" w:hAnsi="Segoe UI Emoji" w:cs="Segoe UI Emoji"/>
+        </w:rPr>
+        <w:t>✅</w:t>
+      </w:r>
+      <w:r>
+        <w:t xml:space="preserve"> </w:t>
+      </w:r>
+      <w:r>
+        <w:rPr>
+          <w:b/>
+          <w:bCs/>
+        </w:rPr>
+        <w:t>Process optimization (MRTA)</w:t>
+      </w:r>
+      <w:r>
+        <w:t xml:space="preserve">: sí, totalmente. </w:t>
+      </w:r>
+    </w:p>
+    <w:p>
+      <w:pPr>
+        <w:numPr>
+          <w:ilvl w:val="0"/>
+          <w:numId w:val="129"/>
+        </w:numPr>
+      </w:pPr>
+      <w:r>
+        <w:rPr>
+          <w:rFonts w:ascii="Segoe UI Emoji" w:hAnsi="Segoe UI Emoji" w:cs="Segoe UI Emoji"/>
+        </w:rPr>
+        <w:t>✅</w:t>
+      </w:r>
+      <w:r>
+        <w:t xml:space="preserve"> </w:t>
+      </w:r>
+      <w:r>
+        <w:rPr>
+          <w:b/>
+          <w:bCs/>
+        </w:rPr>
+        <w:t>Explotar grafos sin romper SB3</w:t>
+      </w:r>
+      <w:r>
+        <w:t>: sí (</w:t>
+      </w:r>
+      <w:proofErr w:type="spellStart"/>
+      <w:r>
+        <w:t>graph_dict</w:t>
+      </w:r>
+      <w:proofErr w:type="spellEnd"/>
+      <w:r>
+        <w:t xml:space="preserve"> + extractor </w:t>
+      </w:r>
+      <w:proofErr w:type="spellStart"/>
+      <w:r>
+        <w:t>entrenable</w:t>
+      </w:r>
+      <w:proofErr w:type="spellEnd"/>
+      <w:r>
+        <w:t xml:space="preserve">). </w:t>
+      </w:r>
+    </w:p>
+    <w:p>
+      <w:pPr>
+        <w:numPr>
+          <w:ilvl w:val="0"/>
+          <w:numId w:val="129"/>
+        </w:numPr>
+      </w:pPr>
+      <w:r>
+        <w:rPr>
+          <w:rFonts w:ascii="Segoe UI Emoji" w:hAnsi="Segoe UI Emoji" w:cs="Segoe UI Emoji"/>
+        </w:rPr>
+        <w:t>✅</w:t>
+      </w:r>
+      <w:r>
+        <w:t xml:space="preserve"> </w:t>
+      </w:r>
+      <w:r>
+        <w:rPr>
+          <w:b/>
+          <w:bCs/>
+        </w:rPr>
+        <w:t>Acciones válidas siempre</w:t>
+      </w:r>
+      <w:r>
+        <w:t>: sí (</w:t>
+      </w:r>
+      <w:proofErr w:type="spellStart"/>
+      <w:r>
+        <w:t>MaskablePPO</w:t>
+      </w:r>
+      <w:proofErr w:type="spellEnd"/>
+      <w:r>
+        <w:t xml:space="preserve">). </w:t>
+      </w:r>
+    </w:p>
+    <w:p>
+      <w:pPr>
+        <w:numPr>
+          <w:ilvl w:val="0"/>
+          <w:numId w:val="129"/>
+        </w:numPr>
+      </w:pPr>
+      <w:r>
+        <w:rPr>
+          <w:rFonts w:ascii="Segoe UI Emoji" w:hAnsi="Segoe UI Emoji" w:cs="Segoe UI Emoji"/>
+        </w:rPr>
+        <w:t>◻️</w:t>
+      </w:r>
+      <w:r>
+        <w:t xml:space="preserve"> </w:t>
+      </w:r>
+      <w:r>
+        <w:rPr>
+          <w:b/>
+          <w:bCs/>
+        </w:rPr>
+        <w:t>Paper-</w:t>
+      </w:r>
+      <w:proofErr w:type="spellStart"/>
+      <w:r>
+        <w:rPr>
+          <w:b/>
+          <w:bCs/>
+        </w:rPr>
+        <w:t>like</w:t>
+      </w:r>
+      <w:proofErr w:type="spellEnd"/>
+      <w:r>
+        <w:rPr>
+          <w:b/>
+          <w:bCs/>
+        </w:rPr>
+        <w:t xml:space="preserve"> </w:t>
+      </w:r>
+      <w:proofErr w:type="spellStart"/>
+      <w:r>
+        <w:rPr>
+          <w:b/>
+          <w:bCs/>
+        </w:rPr>
+        <w:t>decoder</w:t>
+      </w:r>
+      <w:proofErr w:type="spellEnd"/>
+      <w:r>
+        <w:rPr>
+          <w:b/>
+          <w:bCs/>
+        </w:rPr>
+        <w:t xml:space="preserve"> (</w:t>
+      </w:r>
+      <w:proofErr w:type="spellStart"/>
+      <w:r>
+        <w:rPr>
+          <w:b/>
+          <w:bCs/>
+        </w:rPr>
+        <w:t>logits</w:t>
+      </w:r>
+      <w:proofErr w:type="spellEnd"/>
+      <w:r>
+        <w:rPr>
+          <w:b/>
+          <w:bCs/>
+        </w:rPr>
+        <w:t xml:space="preserve"> </w:t>
+      </w:r>
+      <w:proofErr w:type="spellStart"/>
+      <w:r>
+        <w:rPr>
+          <w:b/>
+          <w:bCs/>
+        </w:rPr>
+        <w:t>AGV×Task</w:t>
+      </w:r>
+      <w:proofErr w:type="spellEnd"/>
+      <w:r>
+        <w:rPr>
+          <w:b/>
+          <w:bCs/>
+        </w:rPr>
+        <w:t>/</w:t>
+      </w:r>
+      <w:proofErr w:type="spellStart"/>
+      <w:r>
+        <w:rPr>
+          <w:b/>
+          <w:bCs/>
+        </w:rPr>
+        <w:t>cross-attention</w:t>
+      </w:r>
+      <w:proofErr w:type="spellEnd"/>
+      <w:r>
+        <w:rPr>
+          <w:b/>
+          <w:bCs/>
+        </w:rPr>
+        <w:t>)</w:t>
+      </w:r>
+      <w:r>
+        <w:t xml:space="preserve">: todavía no; hoy el actor decide sobre un embedding </w:t>
+      </w:r>
+      <w:proofErr w:type="spellStart"/>
+      <w:r>
+        <w:t>pooled</w:t>
+      </w:r>
+      <w:proofErr w:type="spellEnd"/>
+      <w:r>
+        <w:t xml:space="preserve"> (paso incremental correcto).</w:t>
       </w:r>
     </w:p>
     <w:p/>
@@ -12901,6 +14320,155 @@
     </w:lvl>
   </w:abstractNum>
   <w:abstractNum w:abstractNumId="2" w15:restartNumberingAfterBreak="0">
+    <w:nsid w:val="04236EB2"/>
+    <w:multiLevelType w:val="multilevel"/>
+    <w:tmpl w:val="ED8A690C"/>
+    <w:lvl w:ilvl="0">
+      <w:start w:val="1"/>
+      <w:numFmt w:val="bullet"/>
+      <w:lvlText w:val=""/>
+      <w:lvlJc w:val="left"/>
+      <w:pPr>
+        <w:tabs>
+          <w:tab w:val="num" w:pos="720"/>
+        </w:tabs>
+        <w:ind w:left="720" w:hanging="360"/>
+      </w:pPr>
+      <w:rPr>
+        <w:rFonts w:ascii="Symbol" w:hAnsi="Symbol" w:hint="default"/>
+        <w:sz w:val="20"/>
+      </w:rPr>
+    </w:lvl>
+    <w:lvl w:ilvl="1">
+      <w:start w:val="1"/>
+      <w:numFmt w:val="bullet"/>
+      <w:lvlText w:val="o"/>
+      <w:lvlJc w:val="left"/>
+      <w:pPr>
+        <w:tabs>
+          <w:tab w:val="num" w:pos="1440"/>
+        </w:tabs>
+        <w:ind w:left="1440" w:hanging="360"/>
+      </w:pPr>
+      <w:rPr>
+        <w:rFonts w:ascii="Courier New" w:hAnsi="Courier New" w:hint="default"/>
+        <w:sz w:val="20"/>
+      </w:rPr>
+    </w:lvl>
+    <w:lvl w:ilvl="2" w:tentative="1">
+      <w:start w:val="1"/>
+      <w:numFmt w:val="bullet"/>
+      <w:lvlText w:val=""/>
+      <w:lvlJc w:val="left"/>
+      <w:pPr>
+        <w:tabs>
+          <w:tab w:val="num" w:pos="2160"/>
+        </w:tabs>
+        <w:ind w:left="2160" w:hanging="360"/>
+      </w:pPr>
+      <w:rPr>
+        <w:rFonts w:ascii="Wingdings" w:hAnsi="Wingdings" w:hint="default"/>
+        <w:sz w:val="20"/>
+      </w:rPr>
+    </w:lvl>
+    <w:lvl w:ilvl="3" w:tentative="1">
+      <w:start w:val="1"/>
+      <w:numFmt w:val="bullet"/>
+      <w:lvlText w:val=""/>
+      <w:lvlJc w:val="left"/>
+      <w:pPr>
+        <w:tabs>
+          <w:tab w:val="num" w:pos="2880"/>
+        </w:tabs>
+        <w:ind w:left="2880" w:hanging="360"/>
+      </w:pPr>
+      <w:rPr>
+        <w:rFonts w:ascii="Wingdings" w:hAnsi="Wingdings" w:hint="default"/>
+        <w:sz w:val="20"/>
+      </w:rPr>
+    </w:lvl>
+    <w:lvl w:ilvl="4" w:tentative="1">
+      <w:start w:val="1"/>
+      <w:numFmt w:val="bullet"/>
+      <w:lvlText w:val=""/>
+      <w:lvlJc w:val="left"/>
+      <w:pPr>
+        <w:tabs>
+          <w:tab w:val="num" w:pos="3600"/>
+        </w:tabs>
+        <w:ind w:left="3600" w:hanging="360"/>
+      </w:pPr>
+      <w:rPr>
+        <w:rFonts w:ascii="Wingdings" w:hAnsi="Wingdings" w:hint="default"/>
+        <w:sz w:val="20"/>
+      </w:rPr>
+    </w:lvl>
+    <w:lvl w:ilvl="5" w:tentative="1">
+      <w:start w:val="1"/>
+      <w:numFmt w:val="bullet"/>
+      <w:lvlText w:val=""/>
+      <w:lvlJc w:val="left"/>
+      <w:pPr>
+        <w:tabs>
+          <w:tab w:val="num" w:pos="4320"/>
+        </w:tabs>
+        <w:ind w:left="4320" w:hanging="360"/>
+      </w:pPr>
+      <w:rPr>
+        <w:rFonts w:ascii="Wingdings" w:hAnsi="Wingdings" w:hint="default"/>
+        <w:sz w:val="20"/>
+      </w:rPr>
+    </w:lvl>
+    <w:lvl w:ilvl="6" w:tentative="1">
+      <w:start w:val="1"/>
+      <w:numFmt w:val="bullet"/>
+      <w:lvlText w:val=""/>
+      <w:lvlJc w:val="left"/>
+      <w:pPr>
+        <w:tabs>
+          <w:tab w:val="num" w:pos="5040"/>
+        </w:tabs>
+        <w:ind w:left="5040" w:hanging="360"/>
+      </w:pPr>
+      <w:rPr>
+        <w:rFonts w:ascii="Wingdings" w:hAnsi="Wingdings" w:hint="default"/>
+        <w:sz w:val="20"/>
+      </w:rPr>
+    </w:lvl>
+    <w:lvl w:ilvl="7" w:tentative="1">
+      <w:start w:val="1"/>
+      <w:numFmt w:val="bullet"/>
+      <w:lvlText w:val=""/>
+      <w:lvlJc w:val="left"/>
+      <w:pPr>
+        <w:tabs>
+          <w:tab w:val="num" w:pos="5760"/>
+        </w:tabs>
+        <w:ind w:left="5760" w:hanging="360"/>
+      </w:pPr>
+      <w:rPr>
+        <w:rFonts w:ascii="Wingdings" w:hAnsi="Wingdings" w:hint="default"/>
+        <w:sz w:val="20"/>
+      </w:rPr>
+    </w:lvl>
+    <w:lvl w:ilvl="8" w:tentative="1">
+      <w:start w:val="1"/>
+      <w:numFmt w:val="bullet"/>
+      <w:lvlText w:val=""/>
+      <w:lvlJc w:val="left"/>
+      <w:pPr>
+        <w:tabs>
+          <w:tab w:val="num" w:pos="6480"/>
+        </w:tabs>
+        <w:ind w:left="6480" w:hanging="360"/>
+      </w:pPr>
+      <w:rPr>
+        <w:rFonts w:ascii="Wingdings" w:hAnsi="Wingdings" w:hint="default"/>
+        <w:sz w:val="20"/>
+      </w:rPr>
+    </w:lvl>
+  </w:abstractNum>
+  <w:abstractNum w:abstractNumId="3" w15:restartNumberingAfterBreak="0">
     <w:nsid w:val="06742D68"/>
     <w:multiLevelType w:val="multilevel"/>
     <w:tmpl w:val="6D00F2AE"/>
@@ -13049,7 +14617,7 @@
       </w:rPr>
     </w:lvl>
   </w:abstractNum>
-  <w:abstractNum w:abstractNumId="3" w15:restartNumberingAfterBreak="0">
+  <w:abstractNum w:abstractNumId="4" w15:restartNumberingAfterBreak="0">
     <w:nsid w:val="08666D85"/>
     <w:multiLevelType w:val="multilevel"/>
     <w:tmpl w:val="CBA28216"/>
@@ -13198,7 +14766,7 @@
       </w:rPr>
     </w:lvl>
   </w:abstractNum>
-  <w:abstractNum w:abstractNumId="4" w15:restartNumberingAfterBreak="0">
+  <w:abstractNum w:abstractNumId="5" w15:restartNumberingAfterBreak="0">
     <w:nsid w:val="09496297"/>
     <w:multiLevelType w:val="multilevel"/>
     <w:tmpl w:val="20582A82"/>
@@ -13315,7 +14883,7 @@
       </w:pPr>
     </w:lvl>
   </w:abstractNum>
-  <w:abstractNum w:abstractNumId="5" w15:restartNumberingAfterBreak="0">
+  <w:abstractNum w:abstractNumId="6" w15:restartNumberingAfterBreak="0">
     <w:nsid w:val="09A40559"/>
     <w:multiLevelType w:val="multilevel"/>
     <w:tmpl w:val="962CA0F8"/>
@@ -13464,7 +15032,7 @@
       </w:rPr>
     </w:lvl>
   </w:abstractNum>
-  <w:abstractNum w:abstractNumId="6" w15:restartNumberingAfterBreak="0">
+  <w:abstractNum w:abstractNumId="7" w15:restartNumberingAfterBreak="0">
     <w:nsid w:val="09CD2B2A"/>
     <w:multiLevelType w:val="multilevel"/>
     <w:tmpl w:val="315E55F8"/>
@@ -13577,7 +15145,7 @@
       </w:pPr>
     </w:lvl>
   </w:abstractNum>
-  <w:abstractNum w:abstractNumId="7" w15:restartNumberingAfterBreak="0">
+  <w:abstractNum w:abstractNumId="8" w15:restartNumberingAfterBreak="0">
     <w:nsid w:val="0AA34A95"/>
     <w:multiLevelType w:val="multilevel"/>
     <w:tmpl w:val="0A66469A"/>
@@ -13726,7 +15294,7 @@
       </w:rPr>
     </w:lvl>
   </w:abstractNum>
-  <w:abstractNum w:abstractNumId="8" w15:restartNumberingAfterBreak="0">
+  <w:abstractNum w:abstractNumId="9" w15:restartNumberingAfterBreak="0">
     <w:nsid w:val="0B352659"/>
     <w:multiLevelType w:val="multilevel"/>
     <w:tmpl w:val="CE784B26"/>
@@ -13875,7 +15443,7 @@
       </w:rPr>
     </w:lvl>
   </w:abstractNum>
-  <w:abstractNum w:abstractNumId="9" w15:restartNumberingAfterBreak="0">
+  <w:abstractNum w:abstractNumId="10" w15:restartNumberingAfterBreak="0">
     <w:nsid w:val="0C124161"/>
     <w:multiLevelType w:val="multilevel"/>
     <w:tmpl w:val="ADAE5888"/>
@@ -13988,7 +15556,7 @@
       </w:pPr>
     </w:lvl>
   </w:abstractNum>
-  <w:abstractNum w:abstractNumId="10" w15:restartNumberingAfterBreak="0">
+  <w:abstractNum w:abstractNumId="11" w15:restartNumberingAfterBreak="0">
     <w:nsid w:val="0CCA4251"/>
     <w:multiLevelType w:val="multilevel"/>
     <w:tmpl w:val="A23A19D0"/>
@@ -14137,7 +15705,7 @@
       </w:rPr>
     </w:lvl>
   </w:abstractNum>
-  <w:abstractNum w:abstractNumId="11" w15:restartNumberingAfterBreak="0">
+  <w:abstractNum w:abstractNumId="12" w15:restartNumberingAfterBreak="0">
     <w:nsid w:val="0CF4213A"/>
     <w:multiLevelType w:val="multilevel"/>
     <w:tmpl w:val="CA94439C"/>
@@ -14250,7 +15818,7 @@
       </w:pPr>
     </w:lvl>
   </w:abstractNum>
-  <w:abstractNum w:abstractNumId="12" w15:restartNumberingAfterBreak="0">
+  <w:abstractNum w:abstractNumId="13" w15:restartNumberingAfterBreak="0">
     <w:nsid w:val="0D6A5668"/>
     <w:multiLevelType w:val="multilevel"/>
     <w:tmpl w:val="118EF9C0"/>
@@ -14363,7 +15931,7 @@
       </w:pPr>
     </w:lvl>
   </w:abstractNum>
-  <w:abstractNum w:abstractNumId="13" w15:restartNumberingAfterBreak="0">
+  <w:abstractNum w:abstractNumId="14" w15:restartNumberingAfterBreak="0">
     <w:nsid w:val="0DBA591A"/>
     <w:multiLevelType w:val="multilevel"/>
     <w:tmpl w:val="062C19C0"/>
@@ -14476,7 +16044,7 @@
       </w:pPr>
     </w:lvl>
   </w:abstractNum>
-  <w:abstractNum w:abstractNumId="14" w15:restartNumberingAfterBreak="0">
+  <w:abstractNum w:abstractNumId="15" w15:restartNumberingAfterBreak="0">
     <w:nsid w:val="0E1C6F35"/>
     <w:multiLevelType w:val="multilevel"/>
     <w:tmpl w:val="441076D0"/>
@@ -14625,7 +16193,7 @@
       </w:rPr>
     </w:lvl>
   </w:abstractNum>
-  <w:abstractNum w:abstractNumId="15" w15:restartNumberingAfterBreak="0">
+  <w:abstractNum w:abstractNumId="16" w15:restartNumberingAfterBreak="0">
     <w:nsid w:val="0F8E7710"/>
     <w:multiLevelType w:val="multilevel"/>
     <w:tmpl w:val="DD36F5AE"/>
@@ -14774,7 +16342,7 @@
       </w:rPr>
     </w:lvl>
   </w:abstractNum>
-  <w:abstractNum w:abstractNumId="16" w15:restartNumberingAfterBreak="0">
+  <w:abstractNum w:abstractNumId="17" w15:restartNumberingAfterBreak="0">
     <w:nsid w:val="102D4364"/>
     <w:multiLevelType w:val="multilevel"/>
     <w:tmpl w:val="27CE5EC2"/>
@@ -14887,7 +16455,7 @@
       </w:pPr>
     </w:lvl>
   </w:abstractNum>
-  <w:abstractNum w:abstractNumId="17" w15:restartNumberingAfterBreak="0">
+  <w:abstractNum w:abstractNumId="18" w15:restartNumberingAfterBreak="0">
     <w:nsid w:val="10EB2AD6"/>
     <w:multiLevelType w:val="multilevel"/>
     <w:tmpl w:val="34364E1E"/>
@@ -15036,7 +16604,7 @@
       </w:rPr>
     </w:lvl>
   </w:abstractNum>
-  <w:abstractNum w:abstractNumId="18" w15:restartNumberingAfterBreak="0">
+  <w:abstractNum w:abstractNumId="19" w15:restartNumberingAfterBreak="0">
     <w:nsid w:val="112A394A"/>
     <w:multiLevelType w:val="multilevel"/>
     <w:tmpl w:val="26A01C0C"/>
@@ -15149,7 +16717,7 @@
       </w:pPr>
     </w:lvl>
   </w:abstractNum>
-  <w:abstractNum w:abstractNumId="19" w15:restartNumberingAfterBreak="0">
+  <w:abstractNum w:abstractNumId="20" w15:restartNumberingAfterBreak="0">
     <w:nsid w:val="130B38A8"/>
     <w:multiLevelType w:val="multilevel"/>
     <w:tmpl w:val="9DB6D7C8"/>
@@ -15298,7 +16866,7 @@
       </w:rPr>
     </w:lvl>
   </w:abstractNum>
-  <w:abstractNum w:abstractNumId="20" w15:restartNumberingAfterBreak="0">
+  <w:abstractNum w:abstractNumId="21" w15:restartNumberingAfterBreak="0">
     <w:nsid w:val="133C15B0"/>
     <w:multiLevelType w:val="multilevel"/>
     <w:tmpl w:val="642A3B50"/>
@@ -15447,7 +17015,7 @@
       </w:rPr>
     </w:lvl>
   </w:abstractNum>
-  <w:abstractNum w:abstractNumId="21" w15:restartNumberingAfterBreak="0">
+  <w:abstractNum w:abstractNumId="22" w15:restartNumberingAfterBreak="0">
     <w:nsid w:val="1366708B"/>
     <w:multiLevelType w:val="multilevel"/>
     <w:tmpl w:val="C6F8B712"/>
@@ -15564,7 +17132,7 @@
       </w:pPr>
     </w:lvl>
   </w:abstractNum>
-  <w:abstractNum w:abstractNumId="22" w15:restartNumberingAfterBreak="0">
+  <w:abstractNum w:abstractNumId="23" w15:restartNumberingAfterBreak="0">
     <w:nsid w:val="13F564B8"/>
     <w:multiLevelType w:val="multilevel"/>
     <w:tmpl w:val="4C34F7C0"/>
@@ -15713,7 +17281,7 @@
       </w:rPr>
     </w:lvl>
   </w:abstractNum>
-  <w:abstractNum w:abstractNumId="23" w15:restartNumberingAfterBreak="0">
+  <w:abstractNum w:abstractNumId="24" w15:restartNumberingAfterBreak="0">
     <w:nsid w:val="1650227E"/>
     <w:multiLevelType w:val="multilevel"/>
     <w:tmpl w:val="D102F716"/>
@@ -15826,7 +17394,7 @@
       </w:pPr>
     </w:lvl>
   </w:abstractNum>
-  <w:abstractNum w:abstractNumId="24" w15:restartNumberingAfterBreak="0">
+  <w:abstractNum w:abstractNumId="25" w15:restartNumberingAfterBreak="0">
     <w:nsid w:val="167F3139"/>
     <w:multiLevelType w:val="multilevel"/>
     <w:tmpl w:val="3C1C6A48"/>
@@ -15975,7 +17543,7 @@
       </w:rPr>
     </w:lvl>
   </w:abstractNum>
-  <w:abstractNum w:abstractNumId="25" w15:restartNumberingAfterBreak="0">
+  <w:abstractNum w:abstractNumId="26" w15:restartNumberingAfterBreak="0">
     <w:nsid w:val="16C948C7"/>
     <w:multiLevelType w:val="multilevel"/>
     <w:tmpl w:val="91C235CE"/>
@@ -16124,7 +17692,7 @@
       </w:rPr>
     </w:lvl>
   </w:abstractNum>
-  <w:abstractNum w:abstractNumId="26" w15:restartNumberingAfterBreak="0">
+  <w:abstractNum w:abstractNumId="27" w15:restartNumberingAfterBreak="0">
     <w:nsid w:val="17792EE2"/>
     <w:multiLevelType w:val="multilevel"/>
     <w:tmpl w:val="C0F2BD98"/>
@@ -16237,7 +17805,7 @@
       </w:pPr>
     </w:lvl>
   </w:abstractNum>
-  <w:abstractNum w:abstractNumId="27" w15:restartNumberingAfterBreak="0">
+  <w:abstractNum w:abstractNumId="28" w15:restartNumberingAfterBreak="0">
     <w:nsid w:val="17A14387"/>
     <w:multiLevelType w:val="multilevel"/>
     <w:tmpl w:val="CC9CF5F4"/>
@@ -16386,7 +17954,7 @@
       </w:rPr>
     </w:lvl>
   </w:abstractNum>
-  <w:abstractNum w:abstractNumId="28" w15:restartNumberingAfterBreak="0">
+  <w:abstractNum w:abstractNumId="29" w15:restartNumberingAfterBreak="0">
     <w:nsid w:val="192847B4"/>
     <w:multiLevelType w:val="multilevel"/>
     <w:tmpl w:val="27AEAE30"/>
@@ -16535,7 +18103,7 @@
       </w:rPr>
     </w:lvl>
   </w:abstractNum>
-  <w:abstractNum w:abstractNumId="29" w15:restartNumberingAfterBreak="0">
+  <w:abstractNum w:abstractNumId="30" w15:restartNumberingAfterBreak="0">
     <w:nsid w:val="1B037388"/>
     <w:multiLevelType w:val="multilevel"/>
     <w:tmpl w:val="16EA72A0"/>
@@ -16684,7 +18252,7 @@
       </w:rPr>
     </w:lvl>
   </w:abstractNum>
-  <w:abstractNum w:abstractNumId="30" w15:restartNumberingAfterBreak="0">
+  <w:abstractNum w:abstractNumId="31" w15:restartNumberingAfterBreak="0">
     <w:nsid w:val="1B1A68FB"/>
     <w:multiLevelType w:val="multilevel"/>
     <w:tmpl w:val="78F242AA"/>
@@ -16833,7 +18401,7 @@
       </w:rPr>
     </w:lvl>
   </w:abstractNum>
-  <w:abstractNum w:abstractNumId="31" w15:restartNumberingAfterBreak="0">
+  <w:abstractNum w:abstractNumId="32" w15:restartNumberingAfterBreak="0">
     <w:nsid w:val="1C662AD8"/>
     <w:multiLevelType w:val="multilevel"/>
     <w:tmpl w:val="9FC01F70"/>
@@ -16982,7 +18550,7 @@
       </w:rPr>
     </w:lvl>
   </w:abstractNum>
-  <w:abstractNum w:abstractNumId="32" w15:restartNumberingAfterBreak="0">
+  <w:abstractNum w:abstractNumId="33" w15:restartNumberingAfterBreak="0">
     <w:nsid w:val="1E7760DE"/>
     <w:multiLevelType w:val="multilevel"/>
     <w:tmpl w:val="DEAAD43C"/>
@@ -17131,7 +18699,7 @@
       </w:rPr>
     </w:lvl>
   </w:abstractNum>
-  <w:abstractNum w:abstractNumId="33" w15:restartNumberingAfterBreak="0">
+  <w:abstractNum w:abstractNumId="34" w15:restartNumberingAfterBreak="0">
     <w:nsid w:val="207E4314"/>
     <w:multiLevelType w:val="multilevel"/>
     <w:tmpl w:val="3C7CF0DA"/>
@@ -17244,7 +18812,7 @@
       </w:pPr>
     </w:lvl>
   </w:abstractNum>
-  <w:abstractNum w:abstractNumId="34" w15:restartNumberingAfterBreak="0">
+  <w:abstractNum w:abstractNumId="35" w15:restartNumberingAfterBreak="0">
     <w:nsid w:val="20907BED"/>
     <w:multiLevelType w:val="multilevel"/>
     <w:tmpl w:val="0E762C12"/>
@@ -17393,7 +18961,7 @@
       </w:rPr>
     </w:lvl>
   </w:abstractNum>
-  <w:abstractNum w:abstractNumId="35" w15:restartNumberingAfterBreak="0">
+  <w:abstractNum w:abstractNumId="36" w15:restartNumberingAfterBreak="0">
     <w:nsid w:val="20C72D45"/>
     <w:multiLevelType w:val="multilevel"/>
     <w:tmpl w:val="B3F081C2"/>
@@ -17506,7 +19074,7 @@
       </w:pPr>
     </w:lvl>
   </w:abstractNum>
-  <w:abstractNum w:abstractNumId="36" w15:restartNumberingAfterBreak="0">
+  <w:abstractNum w:abstractNumId="37" w15:restartNumberingAfterBreak="0">
     <w:nsid w:val="20FC13D7"/>
     <w:multiLevelType w:val="multilevel"/>
     <w:tmpl w:val="BAB89E5E"/>
@@ -17619,7 +19187,7 @@
       </w:pPr>
     </w:lvl>
   </w:abstractNum>
-  <w:abstractNum w:abstractNumId="37" w15:restartNumberingAfterBreak="0">
+  <w:abstractNum w:abstractNumId="38" w15:restartNumberingAfterBreak="0">
     <w:nsid w:val="21D0514F"/>
     <w:multiLevelType w:val="multilevel"/>
     <w:tmpl w:val="02863C0E"/>
@@ -17768,7 +19336,7 @@
       </w:rPr>
     </w:lvl>
   </w:abstractNum>
-  <w:abstractNum w:abstractNumId="38" w15:restartNumberingAfterBreak="0">
+  <w:abstractNum w:abstractNumId="39" w15:restartNumberingAfterBreak="0">
     <w:nsid w:val="234C60EF"/>
     <w:multiLevelType w:val="multilevel"/>
     <w:tmpl w:val="04302622"/>
@@ -17917,7 +19485,7 @@
       </w:rPr>
     </w:lvl>
   </w:abstractNum>
-  <w:abstractNum w:abstractNumId="39" w15:restartNumberingAfterBreak="0">
+  <w:abstractNum w:abstractNumId="40" w15:restartNumberingAfterBreak="0">
     <w:nsid w:val="2489466F"/>
     <w:multiLevelType w:val="multilevel"/>
     <w:tmpl w:val="AA7CE75A"/>
@@ -18030,7 +19598,7 @@
       </w:pPr>
     </w:lvl>
   </w:abstractNum>
-  <w:abstractNum w:abstractNumId="40" w15:restartNumberingAfterBreak="0">
+  <w:abstractNum w:abstractNumId="41" w15:restartNumberingAfterBreak="0">
     <w:nsid w:val="264F5469"/>
     <w:multiLevelType w:val="multilevel"/>
     <w:tmpl w:val="0178BF62"/>
@@ -18143,7 +19711,7 @@
       </w:pPr>
     </w:lvl>
   </w:abstractNum>
-  <w:abstractNum w:abstractNumId="41" w15:restartNumberingAfterBreak="0">
+  <w:abstractNum w:abstractNumId="42" w15:restartNumberingAfterBreak="0">
     <w:nsid w:val="2762060A"/>
     <w:multiLevelType w:val="multilevel"/>
     <w:tmpl w:val="A296EE54"/>
@@ -18256,7 +19824,7 @@
       </w:pPr>
     </w:lvl>
   </w:abstractNum>
-  <w:abstractNum w:abstractNumId="42" w15:restartNumberingAfterBreak="0">
+  <w:abstractNum w:abstractNumId="43" w15:restartNumberingAfterBreak="0">
     <w:nsid w:val="2858624B"/>
     <w:multiLevelType w:val="multilevel"/>
     <w:tmpl w:val="29A06542"/>
@@ -18405,7 +19973,7 @@
       </w:rPr>
     </w:lvl>
   </w:abstractNum>
-  <w:abstractNum w:abstractNumId="43" w15:restartNumberingAfterBreak="0">
+  <w:abstractNum w:abstractNumId="44" w15:restartNumberingAfterBreak="0">
     <w:nsid w:val="291F3F10"/>
     <w:multiLevelType w:val="multilevel"/>
     <w:tmpl w:val="2C16ABAA"/>
@@ -18522,7 +20090,7 @@
       </w:pPr>
     </w:lvl>
   </w:abstractNum>
-  <w:abstractNum w:abstractNumId="44" w15:restartNumberingAfterBreak="0">
+  <w:abstractNum w:abstractNumId="45" w15:restartNumberingAfterBreak="0">
     <w:nsid w:val="29586240"/>
     <w:multiLevelType w:val="multilevel"/>
     <w:tmpl w:val="0674E836"/>
@@ -18671,7 +20239,7 @@
       </w:rPr>
     </w:lvl>
   </w:abstractNum>
-  <w:abstractNum w:abstractNumId="45" w15:restartNumberingAfterBreak="0">
+  <w:abstractNum w:abstractNumId="46" w15:restartNumberingAfterBreak="0">
     <w:nsid w:val="2BB443F2"/>
     <w:multiLevelType w:val="multilevel"/>
     <w:tmpl w:val="B2C60402"/>
@@ -18784,7 +20352,7 @@
       </w:pPr>
     </w:lvl>
   </w:abstractNum>
-  <w:abstractNum w:abstractNumId="46" w15:restartNumberingAfterBreak="0">
+  <w:abstractNum w:abstractNumId="47" w15:restartNumberingAfterBreak="0">
     <w:nsid w:val="2C060E1A"/>
     <w:multiLevelType w:val="multilevel"/>
     <w:tmpl w:val="71F8A5C2"/>
@@ -18933,7 +20501,7 @@
       </w:rPr>
     </w:lvl>
   </w:abstractNum>
-  <w:abstractNum w:abstractNumId="47" w15:restartNumberingAfterBreak="0">
+  <w:abstractNum w:abstractNumId="48" w15:restartNumberingAfterBreak="0">
     <w:nsid w:val="2C435294"/>
     <w:multiLevelType w:val="multilevel"/>
     <w:tmpl w:val="5942A630"/>
@@ -19046,7 +20614,7 @@
       </w:pPr>
     </w:lvl>
   </w:abstractNum>
-  <w:abstractNum w:abstractNumId="48" w15:restartNumberingAfterBreak="0">
+  <w:abstractNum w:abstractNumId="49" w15:restartNumberingAfterBreak="0">
     <w:nsid w:val="2C463A73"/>
     <w:multiLevelType w:val="multilevel"/>
     <w:tmpl w:val="0BC62E34"/>
@@ -19195,7 +20763,7 @@
       </w:rPr>
     </w:lvl>
   </w:abstractNum>
-  <w:abstractNum w:abstractNumId="49" w15:restartNumberingAfterBreak="0">
+  <w:abstractNum w:abstractNumId="50" w15:restartNumberingAfterBreak="0">
     <w:nsid w:val="2CDC1E5D"/>
     <w:multiLevelType w:val="multilevel"/>
     <w:tmpl w:val="FC642ED4"/>
@@ -19308,7 +20876,7 @@
       </w:pPr>
     </w:lvl>
   </w:abstractNum>
-  <w:abstractNum w:abstractNumId="50" w15:restartNumberingAfterBreak="0">
+  <w:abstractNum w:abstractNumId="51" w15:restartNumberingAfterBreak="0">
     <w:nsid w:val="2E897250"/>
     <w:multiLevelType w:val="multilevel"/>
     <w:tmpl w:val="8F787BC4"/>
@@ -19457,7 +21025,124 @@
       </w:rPr>
     </w:lvl>
   </w:abstractNum>
-  <w:abstractNum w:abstractNumId="51" w15:restartNumberingAfterBreak="0">
+  <w:abstractNum w:abstractNumId="52" w15:restartNumberingAfterBreak="0">
+    <w:nsid w:val="2ED43E58"/>
+    <w:multiLevelType w:val="multilevel"/>
+    <w:tmpl w:val="042ED530"/>
+    <w:lvl w:ilvl="0">
+      <w:start w:val="1"/>
+      <w:numFmt w:val="decimal"/>
+      <w:lvlText w:val="%1."/>
+      <w:lvlJc w:val="left"/>
+      <w:pPr>
+        <w:tabs>
+          <w:tab w:val="num" w:pos="720"/>
+        </w:tabs>
+        <w:ind w:left="720" w:hanging="360"/>
+      </w:pPr>
+    </w:lvl>
+    <w:lvl w:ilvl="1">
+      <w:start w:val="1"/>
+      <w:numFmt w:val="bullet"/>
+      <w:lvlText w:val="o"/>
+      <w:lvlJc w:val="left"/>
+      <w:pPr>
+        <w:tabs>
+          <w:tab w:val="num" w:pos="1440"/>
+        </w:tabs>
+        <w:ind w:left="1440" w:hanging="360"/>
+      </w:pPr>
+      <w:rPr>
+        <w:rFonts w:ascii="Courier New" w:hAnsi="Courier New" w:hint="default"/>
+        <w:sz w:val="20"/>
+      </w:rPr>
+    </w:lvl>
+    <w:lvl w:ilvl="2" w:tentative="1">
+      <w:start w:val="1"/>
+      <w:numFmt w:val="decimal"/>
+      <w:lvlText w:val="%3."/>
+      <w:lvlJc w:val="left"/>
+      <w:pPr>
+        <w:tabs>
+          <w:tab w:val="num" w:pos="2160"/>
+        </w:tabs>
+        <w:ind w:left="2160" w:hanging="360"/>
+      </w:pPr>
+    </w:lvl>
+    <w:lvl w:ilvl="3" w:tentative="1">
+      <w:start w:val="1"/>
+      <w:numFmt w:val="decimal"/>
+      <w:lvlText w:val="%4."/>
+      <w:lvlJc w:val="left"/>
+      <w:pPr>
+        <w:tabs>
+          <w:tab w:val="num" w:pos="2880"/>
+        </w:tabs>
+        <w:ind w:left="2880" w:hanging="360"/>
+      </w:pPr>
+    </w:lvl>
+    <w:lvl w:ilvl="4" w:tentative="1">
+      <w:start w:val="1"/>
+      <w:numFmt w:val="decimal"/>
+      <w:lvlText w:val="%5."/>
+      <w:lvlJc w:val="left"/>
+      <w:pPr>
+        <w:tabs>
+          <w:tab w:val="num" w:pos="3600"/>
+        </w:tabs>
+        <w:ind w:left="3600" w:hanging="360"/>
+      </w:pPr>
+    </w:lvl>
+    <w:lvl w:ilvl="5" w:tentative="1">
+      <w:start w:val="1"/>
+      <w:numFmt w:val="decimal"/>
+      <w:lvlText w:val="%6."/>
+      <w:lvlJc w:val="left"/>
+      <w:pPr>
+        <w:tabs>
+          <w:tab w:val="num" w:pos="4320"/>
+        </w:tabs>
+        <w:ind w:left="4320" w:hanging="360"/>
+      </w:pPr>
+    </w:lvl>
+    <w:lvl w:ilvl="6" w:tentative="1">
+      <w:start w:val="1"/>
+      <w:numFmt w:val="decimal"/>
+      <w:lvlText w:val="%7."/>
+      <w:lvlJc w:val="left"/>
+      <w:pPr>
+        <w:tabs>
+          <w:tab w:val="num" w:pos="5040"/>
+        </w:tabs>
+        <w:ind w:left="5040" w:hanging="360"/>
+      </w:pPr>
+    </w:lvl>
+    <w:lvl w:ilvl="7" w:tentative="1">
+      <w:start w:val="1"/>
+      <w:numFmt w:val="decimal"/>
+      <w:lvlText w:val="%8."/>
+      <w:lvlJc w:val="left"/>
+      <w:pPr>
+        <w:tabs>
+          <w:tab w:val="num" w:pos="5760"/>
+        </w:tabs>
+        <w:ind w:left="5760" w:hanging="360"/>
+      </w:pPr>
+    </w:lvl>
+    <w:lvl w:ilvl="8" w:tentative="1">
+      <w:start w:val="1"/>
+      <w:numFmt w:val="decimal"/>
+      <w:lvlText w:val="%9."/>
+      <w:lvlJc w:val="left"/>
+      <w:pPr>
+        <w:tabs>
+          <w:tab w:val="num" w:pos="6480"/>
+        </w:tabs>
+        <w:ind w:left="6480" w:hanging="360"/>
+      </w:pPr>
+    </w:lvl>
+  </w:abstractNum>
+  <w:abstractNum w:abstractNumId="53" w15:restartNumberingAfterBreak="0">
     <w:nsid w:val="33592661"/>
     <w:multiLevelType w:val="multilevel"/>
     <w:tmpl w:val="292014D4"/>
@@ -19606,7 +21291,7 @@
       </w:rPr>
     </w:lvl>
   </w:abstractNum>
-  <w:abstractNum w:abstractNumId="52" w15:restartNumberingAfterBreak="0">
+  <w:abstractNum w:abstractNumId="54" w15:restartNumberingAfterBreak="0">
     <w:nsid w:val="336F57BA"/>
     <w:multiLevelType w:val="multilevel"/>
     <w:tmpl w:val="6BCA9A28"/>
@@ -19723,7 +21408,7 @@
       </w:pPr>
     </w:lvl>
   </w:abstractNum>
-  <w:abstractNum w:abstractNumId="53" w15:restartNumberingAfterBreak="0">
+  <w:abstractNum w:abstractNumId="55" w15:restartNumberingAfterBreak="0">
     <w:nsid w:val="33CD7FBF"/>
     <w:multiLevelType w:val="multilevel"/>
     <w:tmpl w:val="4B382E52"/>
@@ -19836,7 +21521,7 @@
       </w:pPr>
     </w:lvl>
   </w:abstractNum>
-  <w:abstractNum w:abstractNumId="54" w15:restartNumberingAfterBreak="0">
+  <w:abstractNum w:abstractNumId="56" w15:restartNumberingAfterBreak="0">
     <w:nsid w:val="350B263D"/>
     <w:multiLevelType w:val="multilevel"/>
     <w:tmpl w:val="3D705616"/>
@@ -19949,7 +21634,7 @@
       </w:pPr>
     </w:lvl>
   </w:abstractNum>
-  <w:abstractNum w:abstractNumId="55" w15:restartNumberingAfterBreak="0">
+  <w:abstractNum w:abstractNumId="57" w15:restartNumberingAfterBreak="0">
     <w:nsid w:val="3529263E"/>
     <w:multiLevelType w:val="multilevel"/>
     <w:tmpl w:val="833AB22C"/>
@@ -20098,7 +21783,7 @@
       </w:rPr>
     </w:lvl>
   </w:abstractNum>
-  <w:abstractNum w:abstractNumId="56" w15:restartNumberingAfterBreak="0">
+  <w:abstractNum w:abstractNumId="58" w15:restartNumberingAfterBreak="0">
     <w:nsid w:val="39F35E50"/>
     <w:multiLevelType w:val="multilevel"/>
     <w:tmpl w:val="C1B4BA46"/>
@@ -20211,7 +21896,7 @@
       </w:pPr>
     </w:lvl>
   </w:abstractNum>
-  <w:abstractNum w:abstractNumId="57" w15:restartNumberingAfterBreak="0">
+  <w:abstractNum w:abstractNumId="59" w15:restartNumberingAfterBreak="0">
     <w:nsid w:val="3B1545C2"/>
     <w:multiLevelType w:val="multilevel"/>
     <w:tmpl w:val="E480C09A"/>
@@ -20360,7 +22045,7 @@
       </w:rPr>
     </w:lvl>
   </w:abstractNum>
-  <w:abstractNum w:abstractNumId="58" w15:restartNumberingAfterBreak="0">
+  <w:abstractNum w:abstractNumId="60" w15:restartNumberingAfterBreak="0">
     <w:nsid w:val="3C3F6A6A"/>
     <w:multiLevelType w:val="multilevel"/>
     <w:tmpl w:val="8B163B1E"/>
@@ -20509,7 +22194,156 @@
       </w:rPr>
     </w:lvl>
   </w:abstractNum>
-  <w:abstractNum w:abstractNumId="59" w15:restartNumberingAfterBreak="0">
+  <w:abstractNum w:abstractNumId="61" w15:restartNumberingAfterBreak="0">
+    <w:nsid w:val="3DE07498"/>
+    <w:multiLevelType w:val="multilevel"/>
+    <w:tmpl w:val="804ED322"/>
+    <w:lvl w:ilvl="0">
+      <w:start w:val="1"/>
+      <w:numFmt w:val="bullet"/>
+      <w:lvlText w:val=""/>
+      <w:lvlJc w:val="left"/>
+      <w:pPr>
+        <w:tabs>
+          <w:tab w:val="num" w:pos="720"/>
+        </w:tabs>
+        <w:ind w:left="720" w:hanging="360"/>
+      </w:pPr>
+      <w:rPr>
+        <w:rFonts w:ascii="Symbol" w:hAnsi="Symbol" w:hint="default"/>
+        <w:sz w:val="20"/>
+      </w:rPr>
+    </w:lvl>
+    <w:lvl w:ilvl="1" w:tentative="1">
+      <w:start w:val="1"/>
+      <w:numFmt w:val="bullet"/>
+      <w:lvlText w:val="o"/>
+      <w:lvlJc w:val="left"/>
+      <w:pPr>
+        <w:tabs>
+          <w:tab w:val="num" w:pos="1440"/>
+        </w:tabs>
+        <w:ind w:left="1440" w:hanging="360"/>
+      </w:pPr>
+      <w:rPr>
+        <w:rFonts w:ascii="Courier New" w:hAnsi="Courier New" w:hint="default"/>
+        <w:sz w:val="20"/>
+      </w:rPr>
+    </w:lvl>
+    <w:lvl w:ilvl="2" w:tentative="1">
+      <w:start w:val="1"/>
+      <w:numFmt w:val="bullet"/>
+      <w:lvlText w:val=""/>
+      <w:lvlJc w:val="left"/>
+      <w:pPr>
+        <w:tabs>
+          <w:tab w:val="num" w:pos="2160"/>
+        </w:tabs>
+        <w:ind w:left="2160" w:hanging="360"/>
+      </w:pPr>
+      <w:rPr>
+        <w:rFonts w:ascii="Wingdings" w:hAnsi="Wingdings" w:hint="default"/>
+        <w:sz w:val="20"/>
+      </w:rPr>
+    </w:lvl>
+    <w:lvl w:ilvl="3" w:tentative="1">
+      <w:start w:val="1"/>
+      <w:numFmt w:val="bullet"/>
+      <w:lvlText w:val=""/>
+      <w:lvlJc w:val="left"/>
+      <w:pPr>
+        <w:tabs>
+          <w:tab w:val="num" w:pos="2880"/>
+        </w:tabs>
+        <w:ind w:left="2880" w:hanging="360"/>
+      </w:pPr>
+      <w:rPr>
+        <w:rFonts w:ascii="Wingdings" w:hAnsi="Wingdings" w:hint="default"/>
+        <w:sz w:val="20"/>
+      </w:rPr>
+    </w:lvl>
+    <w:lvl w:ilvl="4" w:tentative="1">
+      <w:start w:val="1"/>
+      <w:numFmt w:val="bullet"/>
+      <w:lvlText w:val=""/>
+      <w:lvlJc w:val="left"/>
+      <w:pPr>
+        <w:tabs>
+          <w:tab w:val="num" w:pos="3600"/>
+        </w:tabs>
+        <w:ind w:left="3600" w:hanging="360"/>
+      </w:pPr>
+      <w:rPr>
+        <w:rFonts w:ascii="Wingdings" w:hAnsi="Wingdings" w:hint="default"/>
+        <w:sz w:val="20"/>
+      </w:rPr>
+    </w:lvl>
+    <w:lvl w:ilvl="5" w:tentative="1">
+      <w:start w:val="1"/>
+      <w:numFmt w:val="bullet"/>
+      <w:lvlText w:val=""/>
+      <w:lvlJc w:val="left"/>
+      <w:pPr>
+        <w:tabs>
+          <w:tab w:val="num" w:pos="4320"/>
+        </w:tabs>
+        <w:ind w:left="4320" w:hanging="360"/>
+      </w:pPr>
+      <w:rPr>
+        <w:rFonts w:ascii="Wingdings" w:hAnsi="Wingdings" w:hint="default"/>
+        <w:sz w:val="20"/>
+      </w:rPr>
+    </w:lvl>
+    <w:lvl w:ilvl="6" w:tentative="1">
+      <w:start w:val="1"/>
+      <w:numFmt w:val="bullet"/>
+      <w:lvlText w:val=""/>
+      <w:lvlJc w:val="left"/>
+      <w:pPr>
+        <w:tabs>
+          <w:tab w:val="num" w:pos="5040"/>
+        </w:tabs>
+        <w:ind w:left="5040" w:hanging="360"/>
+      </w:pPr>
+      <w:rPr>
+        <w:rFonts w:ascii="Wingdings" w:hAnsi="Wingdings" w:hint="default"/>
+        <w:sz w:val="20"/>
+      </w:rPr>
+    </w:lvl>
+    <w:lvl w:ilvl="7" w:tentative="1">
+      <w:start w:val="1"/>
+      <w:numFmt w:val="bullet"/>
+      <w:lvlText w:val=""/>
+      <w:lvlJc w:val="left"/>
+      <w:pPr>
+        <w:tabs>
+          <w:tab w:val="num" w:pos="5760"/>
+        </w:tabs>
+        <w:ind w:left="5760" w:hanging="360"/>
+      </w:pPr>
+      <w:rPr>
+        <w:rFonts w:ascii="Wingdings" w:hAnsi="Wingdings" w:hint="default"/>
+        <w:sz w:val="20"/>
+      </w:rPr>
+    </w:lvl>
+    <w:lvl w:ilvl="8" w:tentative="1">
+      <w:start w:val="1"/>
+      <w:numFmt w:val="bullet"/>
+      <w:lvlText w:val=""/>
+      <w:lvlJc w:val="left"/>
+      <w:pPr>
+        <w:tabs>
+          <w:tab w:val="num" w:pos="6480"/>
+        </w:tabs>
+        <w:ind w:left="6480" w:hanging="360"/>
+      </w:pPr>
+      <w:rPr>
+        <w:rFonts w:ascii="Wingdings" w:hAnsi="Wingdings" w:hint="default"/>
+        <w:sz w:val="20"/>
+      </w:rPr>
+    </w:lvl>
+  </w:abstractNum>
+  <w:abstractNum w:abstractNumId="62" w15:restartNumberingAfterBreak="0">
     <w:nsid w:val="3E8E0236"/>
     <w:multiLevelType w:val="multilevel"/>
     <w:tmpl w:val="FC3408AA"/>
@@ -20658,7 +22492,7 @@
       </w:rPr>
     </w:lvl>
   </w:abstractNum>
-  <w:abstractNum w:abstractNumId="60" w15:restartNumberingAfterBreak="0">
+  <w:abstractNum w:abstractNumId="63" w15:restartNumberingAfterBreak="0">
     <w:nsid w:val="3F723ED6"/>
     <w:multiLevelType w:val="multilevel"/>
     <w:tmpl w:val="8C120962"/>
@@ -20771,7 +22605,7 @@
       </w:pPr>
     </w:lvl>
   </w:abstractNum>
-  <w:abstractNum w:abstractNumId="61" w15:restartNumberingAfterBreak="0">
+  <w:abstractNum w:abstractNumId="64" w15:restartNumberingAfterBreak="0">
     <w:nsid w:val="3F9029EC"/>
     <w:multiLevelType w:val="multilevel"/>
     <w:tmpl w:val="1548C6FE"/>
@@ -20920,7 +22754,7 @@
       </w:rPr>
     </w:lvl>
   </w:abstractNum>
-  <w:abstractNum w:abstractNumId="62" w15:restartNumberingAfterBreak="0">
+  <w:abstractNum w:abstractNumId="65" w15:restartNumberingAfterBreak="0">
     <w:nsid w:val="40A6600C"/>
     <w:multiLevelType w:val="multilevel"/>
     <w:tmpl w:val="FAAAD178"/>
@@ -21069,7 +22903,7 @@
       </w:rPr>
     </w:lvl>
   </w:abstractNum>
-  <w:abstractNum w:abstractNumId="63" w15:restartNumberingAfterBreak="0">
+  <w:abstractNum w:abstractNumId="66" w15:restartNumberingAfterBreak="0">
     <w:nsid w:val="416618EC"/>
     <w:multiLevelType w:val="multilevel"/>
     <w:tmpl w:val="89A293E4"/>
@@ -21186,7 +23020,7 @@
       </w:pPr>
     </w:lvl>
   </w:abstractNum>
-  <w:abstractNum w:abstractNumId="64" w15:restartNumberingAfterBreak="0">
+  <w:abstractNum w:abstractNumId="67" w15:restartNumberingAfterBreak="0">
     <w:nsid w:val="41CB39DB"/>
     <w:multiLevelType w:val="multilevel"/>
     <w:tmpl w:val="7B18D6D4"/>
@@ -21335,7 +23169,7 @@
       </w:rPr>
     </w:lvl>
   </w:abstractNum>
-  <w:abstractNum w:abstractNumId="65" w15:restartNumberingAfterBreak="0">
+  <w:abstractNum w:abstractNumId="68" w15:restartNumberingAfterBreak="0">
     <w:nsid w:val="42BA1CB7"/>
     <w:multiLevelType w:val="multilevel"/>
     <w:tmpl w:val="7C2E7534"/>
@@ -21484,7 +23318,7 @@
       </w:rPr>
     </w:lvl>
   </w:abstractNum>
-  <w:abstractNum w:abstractNumId="66" w15:restartNumberingAfterBreak="0">
+  <w:abstractNum w:abstractNumId="69" w15:restartNumberingAfterBreak="0">
     <w:nsid w:val="42ED313F"/>
     <w:multiLevelType w:val="multilevel"/>
     <w:tmpl w:val="CF6CF12A"/>
@@ -21597,7 +23431,7 @@
       </w:pPr>
     </w:lvl>
   </w:abstractNum>
-  <w:abstractNum w:abstractNumId="67" w15:restartNumberingAfterBreak="0">
+  <w:abstractNum w:abstractNumId="70" w15:restartNumberingAfterBreak="0">
     <w:nsid w:val="43DE5A63"/>
     <w:multiLevelType w:val="multilevel"/>
     <w:tmpl w:val="9F9A5C0A"/>
@@ -21710,7 +23544,7 @@
       </w:pPr>
     </w:lvl>
   </w:abstractNum>
-  <w:abstractNum w:abstractNumId="68" w15:restartNumberingAfterBreak="0">
+  <w:abstractNum w:abstractNumId="71" w15:restartNumberingAfterBreak="0">
     <w:nsid w:val="45093081"/>
     <w:multiLevelType w:val="multilevel"/>
     <w:tmpl w:val="038C91B2"/>
@@ -21859,7 +23693,7 @@
       </w:rPr>
     </w:lvl>
   </w:abstractNum>
-  <w:abstractNum w:abstractNumId="69" w15:restartNumberingAfterBreak="0">
+  <w:abstractNum w:abstractNumId="72" w15:restartNumberingAfterBreak="0">
     <w:nsid w:val="452F6922"/>
     <w:multiLevelType w:val="multilevel"/>
     <w:tmpl w:val="2F1461B2"/>
@@ -21972,7 +23806,7 @@
       </w:pPr>
     </w:lvl>
   </w:abstractNum>
-  <w:abstractNum w:abstractNumId="70" w15:restartNumberingAfterBreak="0">
+  <w:abstractNum w:abstractNumId="73" w15:restartNumberingAfterBreak="0">
     <w:nsid w:val="4617148D"/>
     <w:multiLevelType w:val="multilevel"/>
     <w:tmpl w:val="16204E04"/>
@@ -22121,7 +23955,7 @@
       </w:rPr>
     </w:lvl>
   </w:abstractNum>
-  <w:abstractNum w:abstractNumId="71" w15:restartNumberingAfterBreak="0">
+  <w:abstractNum w:abstractNumId="74" w15:restartNumberingAfterBreak="0">
     <w:nsid w:val="475E211B"/>
     <w:multiLevelType w:val="multilevel"/>
     <w:tmpl w:val="8C9A5E64"/>
@@ -22270,7 +24104,7 @@
       </w:rPr>
     </w:lvl>
   </w:abstractNum>
-  <w:abstractNum w:abstractNumId="72" w15:restartNumberingAfterBreak="0">
+  <w:abstractNum w:abstractNumId="75" w15:restartNumberingAfterBreak="0">
     <w:nsid w:val="48261D51"/>
     <w:multiLevelType w:val="multilevel"/>
     <w:tmpl w:val="CDCEFE46"/>
@@ -22419,7 +24253,7 @@
       </w:rPr>
     </w:lvl>
   </w:abstractNum>
-  <w:abstractNum w:abstractNumId="73" w15:restartNumberingAfterBreak="0">
+  <w:abstractNum w:abstractNumId="76" w15:restartNumberingAfterBreak="0">
     <w:nsid w:val="49B32D2C"/>
     <w:multiLevelType w:val="multilevel"/>
     <w:tmpl w:val="33D4BA94"/>
@@ -22568,7 +24402,7 @@
       </w:rPr>
     </w:lvl>
   </w:abstractNum>
-  <w:abstractNum w:abstractNumId="74" w15:restartNumberingAfterBreak="0">
+  <w:abstractNum w:abstractNumId="77" w15:restartNumberingAfterBreak="0">
     <w:nsid w:val="4A43386C"/>
     <w:multiLevelType w:val="multilevel"/>
     <w:tmpl w:val="829E491E"/>
@@ -22681,7 +24515,7 @@
       </w:pPr>
     </w:lvl>
   </w:abstractNum>
-  <w:abstractNum w:abstractNumId="75" w15:restartNumberingAfterBreak="0">
+  <w:abstractNum w:abstractNumId="78" w15:restartNumberingAfterBreak="0">
     <w:nsid w:val="4A863762"/>
     <w:multiLevelType w:val="multilevel"/>
     <w:tmpl w:val="CE04E828"/>
@@ -22830,7 +24664,7 @@
       </w:rPr>
     </w:lvl>
   </w:abstractNum>
-  <w:abstractNum w:abstractNumId="76" w15:restartNumberingAfterBreak="0">
+  <w:abstractNum w:abstractNumId="79" w15:restartNumberingAfterBreak="0">
     <w:nsid w:val="4B4E36B9"/>
     <w:multiLevelType w:val="multilevel"/>
     <w:tmpl w:val="104C8CB2"/>
@@ -22979,7 +24813,7 @@
       </w:rPr>
     </w:lvl>
   </w:abstractNum>
-  <w:abstractNum w:abstractNumId="77" w15:restartNumberingAfterBreak="0">
+  <w:abstractNum w:abstractNumId="80" w15:restartNumberingAfterBreak="0">
     <w:nsid w:val="4BE84BC9"/>
     <w:multiLevelType w:val="multilevel"/>
     <w:tmpl w:val="5E601504"/>
@@ -23128,7 +24962,7 @@
       </w:rPr>
     </w:lvl>
   </w:abstractNum>
-  <w:abstractNum w:abstractNumId="78" w15:restartNumberingAfterBreak="0">
+  <w:abstractNum w:abstractNumId="81" w15:restartNumberingAfterBreak="0">
     <w:nsid w:val="4D160DC0"/>
     <w:multiLevelType w:val="multilevel"/>
     <w:tmpl w:val="5B08A664"/>
@@ -23241,7 +25075,7 @@
       </w:pPr>
     </w:lvl>
   </w:abstractNum>
-  <w:abstractNum w:abstractNumId="79" w15:restartNumberingAfterBreak="0">
+  <w:abstractNum w:abstractNumId="82" w15:restartNumberingAfterBreak="0">
     <w:nsid w:val="4F344A32"/>
     <w:multiLevelType w:val="multilevel"/>
     <w:tmpl w:val="68865D4A"/>
@@ -23390,7 +25224,7 @@
       </w:rPr>
     </w:lvl>
   </w:abstractNum>
-  <w:abstractNum w:abstractNumId="80" w15:restartNumberingAfterBreak="0">
+  <w:abstractNum w:abstractNumId="83" w15:restartNumberingAfterBreak="0">
     <w:nsid w:val="4F8A3124"/>
     <w:multiLevelType w:val="multilevel"/>
     <w:tmpl w:val="BB3C6A0C"/>
@@ -23539,7 +25373,7 @@
       </w:rPr>
     </w:lvl>
   </w:abstractNum>
-  <w:abstractNum w:abstractNumId="81" w15:restartNumberingAfterBreak="0">
+  <w:abstractNum w:abstractNumId="84" w15:restartNumberingAfterBreak="0">
     <w:nsid w:val="4FE70E0F"/>
     <w:multiLevelType w:val="multilevel"/>
     <w:tmpl w:val="F60A90A8"/>
@@ -23652,7 +25486,7 @@
       </w:pPr>
     </w:lvl>
   </w:abstractNum>
-  <w:abstractNum w:abstractNumId="82" w15:restartNumberingAfterBreak="0">
+  <w:abstractNum w:abstractNumId="85" w15:restartNumberingAfterBreak="0">
     <w:nsid w:val="50B735DB"/>
     <w:multiLevelType w:val="multilevel"/>
     <w:tmpl w:val="AD22A39C"/>
@@ -23765,7 +25599,7 @@
       </w:pPr>
     </w:lvl>
   </w:abstractNum>
-  <w:abstractNum w:abstractNumId="83" w15:restartNumberingAfterBreak="0">
+  <w:abstractNum w:abstractNumId="86" w15:restartNumberingAfterBreak="0">
     <w:nsid w:val="51597B5D"/>
     <w:multiLevelType w:val="multilevel"/>
     <w:tmpl w:val="CCE62F06"/>
@@ -23914,7 +25748,7 @@
       </w:rPr>
     </w:lvl>
   </w:abstractNum>
-  <w:abstractNum w:abstractNumId="84" w15:restartNumberingAfterBreak="0">
+  <w:abstractNum w:abstractNumId="87" w15:restartNumberingAfterBreak="0">
     <w:nsid w:val="553D468D"/>
     <w:multiLevelType w:val="multilevel"/>
     <w:tmpl w:val="B50AE3E8"/>
@@ -24027,7 +25861,156 @@
       </w:pPr>
     </w:lvl>
   </w:abstractNum>
-  <w:abstractNum w:abstractNumId="85" w15:restartNumberingAfterBreak="0">
+  <w:abstractNum w:abstractNumId="88" w15:restartNumberingAfterBreak="0">
+    <w:nsid w:val="55C9506C"/>
+    <w:multiLevelType w:val="multilevel"/>
+    <w:tmpl w:val="2062C292"/>
+    <w:lvl w:ilvl="0">
+      <w:start w:val="1"/>
+      <w:numFmt w:val="bullet"/>
+      <w:lvlText w:val=""/>
+      <w:lvlJc w:val="left"/>
+      <w:pPr>
+        <w:tabs>
+          <w:tab w:val="num" w:pos="720"/>
+        </w:tabs>
+        <w:ind w:left="720" w:hanging="360"/>
+      </w:pPr>
+      <w:rPr>
+        <w:rFonts w:ascii="Symbol" w:hAnsi="Symbol" w:hint="default"/>
+        <w:sz w:val="20"/>
+      </w:rPr>
+    </w:lvl>
+    <w:lvl w:ilvl="1" w:tentative="1">
+      <w:start w:val="1"/>
+      <w:numFmt w:val="bullet"/>
+      <w:lvlText w:val="o"/>
+      <w:lvlJc w:val="left"/>
+      <w:pPr>
+        <w:tabs>
+          <w:tab w:val="num" w:pos="1440"/>
+        </w:tabs>
+        <w:ind w:left="1440" w:hanging="360"/>
+      </w:pPr>
+      <w:rPr>
+        <w:rFonts w:ascii="Courier New" w:hAnsi="Courier New" w:hint="default"/>
+        <w:sz w:val="20"/>
+      </w:rPr>
+    </w:lvl>
+    <w:lvl w:ilvl="2" w:tentative="1">
+      <w:start w:val="1"/>
+      <w:numFmt w:val="bullet"/>
+      <w:lvlText w:val=""/>
+      <w:lvlJc w:val="left"/>
+      <w:pPr>
+        <w:tabs>
+          <w:tab w:val="num" w:pos="2160"/>
+        </w:tabs>
+        <w:ind w:left="2160" w:hanging="360"/>
+      </w:pPr>
+      <w:rPr>
+        <w:rFonts w:ascii="Wingdings" w:hAnsi="Wingdings" w:hint="default"/>
+        <w:sz w:val="20"/>
+      </w:rPr>
+    </w:lvl>
+    <w:lvl w:ilvl="3" w:tentative="1">
+      <w:start w:val="1"/>
+      <w:numFmt w:val="bullet"/>
+      <w:lvlText w:val=""/>
+      <w:lvlJc w:val="left"/>
+      <w:pPr>
+        <w:tabs>
+          <w:tab w:val="num" w:pos="2880"/>
+        </w:tabs>
+        <w:ind w:left="2880" w:hanging="360"/>
+      </w:pPr>
+      <w:rPr>
+        <w:rFonts w:ascii="Wingdings" w:hAnsi="Wingdings" w:hint="default"/>
+        <w:sz w:val="20"/>
+      </w:rPr>
+    </w:lvl>
+    <w:lvl w:ilvl="4" w:tentative="1">
+      <w:start w:val="1"/>
+      <w:numFmt w:val="bullet"/>
+      <w:lvlText w:val=""/>
+      <w:lvlJc w:val="left"/>
+      <w:pPr>
+        <w:tabs>
+          <w:tab w:val="num" w:pos="3600"/>
+        </w:tabs>
+        <w:ind w:left="3600" w:hanging="360"/>
+      </w:pPr>
+      <w:rPr>
+        <w:rFonts w:ascii="Wingdings" w:hAnsi="Wingdings" w:hint="default"/>
+        <w:sz w:val="20"/>
+      </w:rPr>
+    </w:lvl>
+    <w:lvl w:ilvl="5" w:tentative="1">
+      <w:start w:val="1"/>
+      <w:numFmt w:val="bullet"/>
+      <w:lvlText w:val=""/>
+      <w:lvlJc w:val="left"/>
+      <w:pPr>
+        <w:tabs>
+          <w:tab w:val="num" w:pos="4320"/>
+        </w:tabs>
+        <w:ind w:left="4320" w:hanging="360"/>
+      </w:pPr>
+      <w:rPr>
+        <w:rFonts w:ascii="Wingdings" w:hAnsi="Wingdings" w:hint="default"/>
+        <w:sz w:val="20"/>
+      </w:rPr>
+    </w:lvl>
+    <w:lvl w:ilvl="6" w:tentative="1">
+      <w:start w:val="1"/>
+      <w:numFmt w:val="bullet"/>
+      <w:lvlText w:val=""/>
+      <w:lvlJc w:val="left"/>
+      <w:pPr>
+        <w:tabs>
+          <w:tab w:val="num" w:pos="5040"/>
+        </w:tabs>
+        <w:ind w:left="5040" w:hanging="360"/>
+      </w:pPr>
+      <w:rPr>
+        <w:rFonts w:ascii="Wingdings" w:hAnsi="Wingdings" w:hint="default"/>
+        <w:sz w:val="20"/>
+      </w:rPr>
+    </w:lvl>
+    <w:lvl w:ilvl="7" w:tentative="1">
+      <w:start w:val="1"/>
+      <w:numFmt w:val="bullet"/>
+      <w:lvlText w:val=""/>
+      <w:lvlJc w:val="left"/>
+      <w:pPr>
+        <w:tabs>
+          <w:tab w:val="num" w:pos="5760"/>
+        </w:tabs>
+        <w:ind w:left="5760" w:hanging="360"/>
+      </w:pPr>
+      <w:rPr>
+        <w:rFonts w:ascii="Wingdings" w:hAnsi="Wingdings" w:hint="default"/>
+        <w:sz w:val="20"/>
+      </w:rPr>
+    </w:lvl>
+    <w:lvl w:ilvl="8" w:tentative="1">
+      <w:start w:val="1"/>
+      <w:numFmt w:val="bullet"/>
+      <w:lvlText w:val=""/>
+      <w:lvlJc w:val="left"/>
+      <w:pPr>
+        <w:tabs>
+          <w:tab w:val="num" w:pos="6480"/>
+        </w:tabs>
+        <w:ind w:left="6480" w:hanging="360"/>
+      </w:pPr>
+      <w:rPr>
+        <w:rFonts w:ascii="Wingdings" w:hAnsi="Wingdings" w:hint="default"/>
+        <w:sz w:val="20"/>
+      </w:rPr>
+    </w:lvl>
+  </w:abstractNum>
+  <w:abstractNum w:abstractNumId="89" w15:restartNumberingAfterBreak="0">
     <w:nsid w:val="56652951"/>
     <w:multiLevelType w:val="multilevel"/>
     <w:tmpl w:val="7A163F82"/>
@@ -24144,7 +26127,7 @@
       </w:pPr>
     </w:lvl>
   </w:abstractNum>
-  <w:abstractNum w:abstractNumId="86" w15:restartNumberingAfterBreak="0">
+  <w:abstractNum w:abstractNumId="90" w15:restartNumberingAfterBreak="0">
     <w:nsid w:val="58993294"/>
     <w:multiLevelType w:val="multilevel"/>
     <w:tmpl w:val="4B2C2A0C"/>
@@ -24293,7 +26276,7 @@
       </w:rPr>
     </w:lvl>
   </w:abstractNum>
-  <w:abstractNum w:abstractNumId="87" w15:restartNumberingAfterBreak="0">
+  <w:abstractNum w:abstractNumId="91" w15:restartNumberingAfterBreak="0">
     <w:nsid w:val="59030172"/>
     <w:multiLevelType w:val="multilevel"/>
     <w:tmpl w:val="421ED242"/>
@@ -24442,7 +26425,7 @@
       </w:rPr>
     </w:lvl>
   </w:abstractNum>
-  <w:abstractNum w:abstractNumId="88" w15:restartNumberingAfterBreak="0">
+  <w:abstractNum w:abstractNumId="92" w15:restartNumberingAfterBreak="0">
     <w:nsid w:val="59567965"/>
     <w:multiLevelType w:val="multilevel"/>
     <w:tmpl w:val="C6EA86A2"/>
@@ -24591,7 +26574,7 @@
       </w:rPr>
     </w:lvl>
   </w:abstractNum>
-  <w:abstractNum w:abstractNumId="89" w15:restartNumberingAfterBreak="0">
+  <w:abstractNum w:abstractNumId="93" w15:restartNumberingAfterBreak="0">
     <w:nsid w:val="5A232D91"/>
     <w:multiLevelType w:val="multilevel"/>
     <w:tmpl w:val="8E329EF2"/>
@@ -24704,7 +26687,7 @@
       </w:pPr>
     </w:lvl>
   </w:abstractNum>
-  <w:abstractNum w:abstractNumId="90" w15:restartNumberingAfterBreak="0">
+  <w:abstractNum w:abstractNumId="94" w15:restartNumberingAfterBreak="0">
     <w:nsid w:val="5A6C3525"/>
     <w:multiLevelType w:val="multilevel"/>
     <w:tmpl w:val="0E32021E"/>
@@ -24853,7 +26836,7 @@
       </w:rPr>
     </w:lvl>
   </w:abstractNum>
-  <w:abstractNum w:abstractNumId="91" w15:restartNumberingAfterBreak="0">
+  <w:abstractNum w:abstractNumId="95" w15:restartNumberingAfterBreak="0">
     <w:nsid w:val="5A831618"/>
     <w:multiLevelType w:val="multilevel"/>
     <w:tmpl w:val="A4B42106"/>
@@ -25002,7 +26985,7 @@
       </w:rPr>
     </w:lvl>
   </w:abstractNum>
-  <w:abstractNum w:abstractNumId="92" w15:restartNumberingAfterBreak="0">
+  <w:abstractNum w:abstractNumId="96" w15:restartNumberingAfterBreak="0">
     <w:nsid w:val="5B0931A5"/>
     <w:multiLevelType w:val="multilevel"/>
     <w:tmpl w:val="7D8A85FA"/>
@@ -25151,7 +27134,7 @@
       </w:rPr>
     </w:lvl>
   </w:abstractNum>
-  <w:abstractNum w:abstractNumId="93" w15:restartNumberingAfterBreak="0">
+  <w:abstractNum w:abstractNumId="97" w15:restartNumberingAfterBreak="0">
     <w:nsid w:val="5B5E601B"/>
     <w:multiLevelType w:val="multilevel"/>
     <w:tmpl w:val="7F8C96E4"/>
@@ -25300,7 +27283,7 @@
       </w:rPr>
     </w:lvl>
   </w:abstractNum>
-  <w:abstractNum w:abstractNumId="94" w15:restartNumberingAfterBreak="0">
+  <w:abstractNum w:abstractNumId="98" w15:restartNumberingAfterBreak="0">
     <w:nsid w:val="5DC7613E"/>
     <w:multiLevelType w:val="multilevel"/>
     <w:tmpl w:val="C94ABC34"/>
@@ -25449,7 +27432,7 @@
       </w:rPr>
     </w:lvl>
   </w:abstractNum>
-  <w:abstractNum w:abstractNumId="95" w15:restartNumberingAfterBreak="0">
+  <w:abstractNum w:abstractNumId="99" w15:restartNumberingAfterBreak="0">
     <w:nsid w:val="5E953779"/>
     <w:multiLevelType w:val="multilevel"/>
     <w:tmpl w:val="B60EC55C"/>
@@ -25598,7 +27581,7 @@
       </w:rPr>
     </w:lvl>
   </w:abstractNum>
-  <w:abstractNum w:abstractNumId="96" w15:restartNumberingAfterBreak="0">
+  <w:abstractNum w:abstractNumId="100" w15:restartNumberingAfterBreak="0">
     <w:nsid w:val="60725084"/>
     <w:multiLevelType w:val="multilevel"/>
     <w:tmpl w:val="2612CBDA"/>
@@ -25747,7 +27730,7 @@
       </w:rPr>
     </w:lvl>
   </w:abstractNum>
-  <w:abstractNum w:abstractNumId="97" w15:restartNumberingAfterBreak="0">
+  <w:abstractNum w:abstractNumId="101" w15:restartNumberingAfterBreak="0">
     <w:nsid w:val="613A26EE"/>
     <w:multiLevelType w:val="multilevel"/>
     <w:tmpl w:val="7408CB28"/>
@@ -25896,7 +27879,7 @@
       </w:rPr>
     </w:lvl>
   </w:abstractNum>
-  <w:abstractNum w:abstractNumId="98" w15:restartNumberingAfterBreak="0">
+  <w:abstractNum w:abstractNumId="102" w15:restartNumberingAfterBreak="0">
     <w:nsid w:val="628426B2"/>
     <w:multiLevelType w:val="multilevel"/>
     <w:tmpl w:val="478636FC"/>
@@ -26009,7 +27992,7 @@
       </w:pPr>
     </w:lvl>
   </w:abstractNum>
-  <w:abstractNum w:abstractNumId="99" w15:restartNumberingAfterBreak="0">
+  <w:abstractNum w:abstractNumId="103" w15:restartNumberingAfterBreak="0">
     <w:nsid w:val="63EE64E9"/>
     <w:multiLevelType w:val="multilevel"/>
     <w:tmpl w:val="17B2898C"/>
@@ -26158,7 +28141,7 @@
       </w:rPr>
     </w:lvl>
   </w:abstractNum>
-  <w:abstractNum w:abstractNumId="100" w15:restartNumberingAfterBreak="0">
+  <w:abstractNum w:abstractNumId="104" w15:restartNumberingAfterBreak="0">
     <w:nsid w:val="646F34E7"/>
     <w:multiLevelType w:val="multilevel"/>
     <w:tmpl w:val="8F52D3E8"/>
@@ -26307,7 +28290,7 @@
       </w:rPr>
     </w:lvl>
   </w:abstractNum>
-  <w:abstractNum w:abstractNumId="101" w15:restartNumberingAfterBreak="0">
+  <w:abstractNum w:abstractNumId="105" w15:restartNumberingAfterBreak="0">
     <w:nsid w:val="677E0B26"/>
     <w:multiLevelType w:val="multilevel"/>
     <w:tmpl w:val="B448D494"/>
@@ -26456,7 +28439,7 @@
       </w:rPr>
     </w:lvl>
   </w:abstractNum>
-  <w:abstractNum w:abstractNumId="102" w15:restartNumberingAfterBreak="0">
+  <w:abstractNum w:abstractNumId="106" w15:restartNumberingAfterBreak="0">
     <w:nsid w:val="6849090A"/>
     <w:multiLevelType w:val="multilevel"/>
     <w:tmpl w:val="C994C5A0"/>
@@ -26605,7 +28588,156 @@
       </w:rPr>
     </w:lvl>
   </w:abstractNum>
-  <w:abstractNum w:abstractNumId="103" w15:restartNumberingAfterBreak="0">
+  <w:abstractNum w:abstractNumId="107" w15:restartNumberingAfterBreak="0">
+    <w:nsid w:val="68F84793"/>
+    <w:multiLevelType w:val="multilevel"/>
+    <w:tmpl w:val="3AA0909A"/>
+    <w:lvl w:ilvl="0">
+      <w:start w:val="1"/>
+      <w:numFmt w:val="bullet"/>
+      <w:lvlText w:val=""/>
+      <w:lvlJc w:val="left"/>
+      <w:pPr>
+        <w:tabs>
+          <w:tab w:val="num" w:pos="720"/>
+        </w:tabs>
+        <w:ind w:left="720" w:hanging="360"/>
+      </w:pPr>
+      <w:rPr>
+        <w:rFonts w:ascii="Symbol" w:hAnsi="Symbol" w:hint="default"/>
+        <w:sz w:val="20"/>
+      </w:rPr>
+    </w:lvl>
+    <w:lvl w:ilvl="1">
+      <w:start w:val="1"/>
+      <w:numFmt w:val="bullet"/>
+      <w:lvlText w:val="o"/>
+      <w:lvlJc w:val="left"/>
+      <w:pPr>
+        <w:tabs>
+          <w:tab w:val="num" w:pos="1440"/>
+        </w:tabs>
+        <w:ind w:left="1440" w:hanging="360"/>
+      </w:pPr>
+      <w:rPr>
+        <w:rFonts w:ascii="Courier New" w:hAnsi="Courier New" w:hint="default"/>
+        <w:sz w:val="20"/>
+      </w:rPr>
+    </w:lvl>
+    <w:lvl w:ilvl="2" w:tentative="1">
+      <w:start w:val="1"/>
+      <w:numFmt w:val="bullet"/>
+      <w:lvlText w:val=""/>
+      <w:lvlJc w:val="left"/>
+      <w:pPr>
+        <w:tabs>
+          <w:tab w:val="num" w:pos="2160"/>
+        </w:tabs>
+        <w:ind w:left="2160" w:hanging="360"/>
+      </w:pPr>
+      <w:rPr>
+        <w:rFonts w:ascii="Wingdings" w:hAnsi="Wingdings" w:hint="default"/>
+        <w:sz w:val="20"/>
+      </w:rPr>
+    </w:lvl>
+    <w:lvl w:ilvl="3" w:tentative="1">
+      <w:start w:val="1"/>
+      <w:numFmt w:val="bullet"/>
+      <w:lvlText w:val=""/>
+      <w:lvlJc w:val="left"/>
+      <w:pPr>
+        <w:tabs>
+          <w:tab w:val="num" w:pos="2880"/>
+        </w:tabs>
+        <w:ind w:left="2880" w:hanging="360"/>
+      </w:pPr>
+      <w:rPr>
+        <w:rFonts w:ascii="Wingdings" w:hAnsi="Wingdings" w:hint="default"/>
+        <w:sz w:val="20"/>
+      </w:rPr>
+    </w:lvl>
+    <w:lvl w:ilvl="4" w:tentative="1">
+      <w:start w:val="1"/>
+      <w:numFmt w:val="bullet"/>
+      <w:lvlText w:val=""/>
+      <w:lvlJc w:val="left"/>
+      <w:pPr>
+        <w:tabs>
+          <w:tab w:val="num" w:pos="3600"/>
+        </w:tabs>
+        <w:ind w:left="3600" w:hanging="360"/>
+      </w:pPr>
+      <w:rPr>
+        <w:rFonts w:ascii="Wingdings" w:hAnsi="Wingdings" w:hint="default"/>
+        <w:sz w:val="20"/>
+      </w:rPr>
+    </w:lvl>
+    <w:lvl w:ilvl="5" w:tentative="1">
+      <w:start w:val="1"/>
+      <w:numFmt w:val="bullet"/>
+      <w:lvlText w:val=""/>
+      <w:lvlJc w:val="left"/>
+      <w:pPr>
+        <w:tabs>
+          <w:tab w:val="num" w:pos="4320"/>
+        </w:tabs>
+        <w:ind w:left="4320" w:hanging="360"/>
+      </w:pPr>
+      <w:rPr>
+        <w:rFonts w:ascii="Wingdings" w:hAnsi="Wingdings" w:hint="default"/>
+        <w:sz w:val="20"/>
+      </w:rPr>
+    </w:lvl>
+    <w:lvl w:ilvl="6" w:tentative="1">
+      <w:start w:val="1"/>
+      <w:numFmt w:val="bullet"/>
+      <w:lvlText w:val=""/>
+      <w:lvlJc w:val="left"/>
+      <w:pPr>
+        <w:tabs>
+          <w:tab w:val="num" w:pos="5040"/>
+        </w:tabs>
+        <w:ind w:left="5040" w:hanging="360"/>
+      </w:pPr>
+      <w:rPr>
+        <w:rFonts w:ascii="Wingdings" w:hAnsi="Wingdings" w:hint="default"/>
+        <w:sz w:val="20"/>
+      </w:rPr>
+    </w:lvl>
+    <w:lvl w:ilvl="7" w:tentative="1">
+      <w:start w:val="1"/>
+      <w:numFmt w:val="bullet"/>
+      <w:lvlText w:val=""/>
+      <w:lvlJc w:val="left"/>
+      <w:pPr>
+        <w:tabs>
+          <w:tab w:val="num" w:pos="5760"/>
+        </w:tabs>
+        <w:ind w:left="5760" w:hanging="360"/>
+      </w:pPr>
+      <w:rPr>
+        <w:rFonts w:ascii="Wingdings" w:hAnsi="Wingdings" w:hint="default"/>
+        <w:sz w:val="20"/>
+      </w:rPr>
+    </w:lvl>
+    <w:lvl w:ilvl="8" w:tentative="1">
+      <w:start w:val="1"/>
+      <w:numFmt w:val="bullet"/>
+      <w:lvlText w:val=""/>
+      <w:lvlJc w:val="left"/>
+      <w:pPr>
+        <w:tabs>
+          <w:tab w:val="num" w:pos="6480"/>
+        </w:tabs>
+        <w:ind w:left="6480" w:hanging="360"/>
+      </w:pPr>
+      <w:rPr>
+        <w:rFonts w:ascii="Wingdings" w:hAnsi="Wingdings" w:hint="default"/>
+        <w:sz w:val="20"/>
+      </w:rPr>
+    </w:lvl>
+  </w:abstractNum>
+  <w:abstractNum w:abstractNumId="108" w15:restartNumberingAfterBreak="0">
     <w:nsid w:val="69E65F2D"/>
     <w:multiLevelType w:val="multilevel"/>
     <w:tmpl w:val="1F72C5D6"/>
@@ -26754,7 +28886,7 @@
       </w:rPr>
     </w:lvl>
   </w:abstractNum>
-  <w:abstractNum w:abstractNumId="104" w15:restartNumberingAfterBreak="0">
+  <w:abstractNum w:abstractNumId="109" w15:restartNumberingAfterBreak="0">
     <w:nsid w:val="6E6A2CA5"/>
     <w:multiLevelType w:val="multilevel"/>
     <w:tmpl w:val="CBE81AC8"/>
@@ -26903,7 +29035,7 @@
       </w:rPr>
     </w:lvl>
   </w:abstractNum>
-  <w:abstractNum w:abstractNumId="105" w15:restartNumberingAfterBreak="0">
+  <w:abstractNum w:abstractNumId="110" w15:restartNumberingAfterBreak="0">
     <w:nsid w:val="6FD921FB"/>
     <w:multiLevelType w:val="multilevel"/>
     <w:tmpl w:val="A3709FB6"/>
@@ -27016,7 +29148,7 @@
       </w:pPr>
     </w:lvl>
   </w:abstractNum>
-  <w:abstractNum w:abstractNumId="106" w15:restartNumberingAfterBreak="0">
+  <w:abstractNum w:abstractNumId="111" w15:restartNumberingAfterBreak="0">
     <w:nsid w:val="715D4259"/>
     <w:multiLevelType w:val="multilevel"/>
     <w:tmpl w:val="16ECC4AE"/>
@@ -27129,7 +29261,7 @@
       </w:pPr>
     </w:lvl>
   </w:abstractNum>
-  <w:abstractNum w:abstractNumId="107" w15:restartNumberingAfterBreak="0">
+  <w:abstractNum w:abstractNumId="112" w15:restartNumberingAfterBreak="0">
     <w:nsid w:val="72CA0AB5"/>
     <w:multiLevelType w:val="multilevel"/>
     <w:tmpl w:val="F48AE8EE"/>
@@ -27242,7 +29374,7 @@
       </w:pPr>
     </w:lvl>
   </w:abstractNum>
-  <w:abstractNum w:abstractNumId="108" w15:restartNumberingAfterBreak="0">
+  <w:abstractNum w:abstractNumId="113" w15:restartNumberingAfterBreak="0">
     <w:nsid w:val="72EF171C"/>
     <w:multiLevelType w:val="multilevel"/>
     <w:tmpl w:val="87BA506C"/>
@@ -27355,7 +29487,7 @@
       </w:pPr>
     </w:lvl>
   </w:abstractNum>
-  <w:abstractNum w:abstractNumId="109" w15:restartNumberingAfterBreak="0">
+  <w:abstractNum w:abstractNumId="114" w15:restartNumberingAfterBreak="0">
     <w:nsid w:val="73A42E84"/>
     <w:multiLevelType w:val="multilevel"/>
     <w:tmpl w:val="51CC6D12"/>
@@ -27504,7 +29636,7 @@
       </w:rPr>
     </w:lvl>
   </w:abstractNum>
-  <w:abstractNum w:abstractNumId="110" w15:restartNumberingAfterBreak="0">
+  <w:abstractNum w:abstractNumId="115" w15:restartNumberingAfterBreak="0">
     <w:nsid w:val="757B45E3"/>
     <w:multiLevelType w:val="multilevel"/>
     <w:tmpl w:val="A77CC540"/>
@@ -27653,7 +29785,7 @@
       </w:rPr>
     </w:lvl>
   </w:abstractNum>
-  <w:abstractNum w:abstractNumId="111" w15:restartNumberingAfterBreak="0">
+  <w:abstractNum w:abstractNumId="116" w15:restartNumberingAfterBreak="0">
     <w:nsid w:val="75A80763"/>
     <w:multiLevelType w:val="multilevel"/>
     <w:tmpl w:val="46F6DE76"/>
@@ -27802,7 +29934,7 @@
       </w:rPr>
     </w:lvl>
   </w:abstractNum>
-  <w:abstractNum w:abstractNumId="112" w15:restartNumberingAfterBreak="0">
+  <w:abstractNum w:abstractNumId="117" w15:restartNumberingAfterBreak="0">
     <w:nsid w:val="77C22387"/>
     <w:multiLevelType w:val="multilevel"/>
     <w:tmpl w:val="3C4C855C"/>
@@ -27951,7 +30083,7 @@
       </w:rPr>
     </w:lvl>
   </w:abstractNum>
-  <w:abstractNum w:abstractNumId="113" w15:restartNumberingAfterBreak="0">
+  <w:abstractNum w:abstractNumId="118" w15:restartNumberingAfterBreak="0">
     <w:nsid w:val="78D43A11"/>
     <w:multiLevelType w:val="multilevel"/>
     <w:tmpl w:val="E12E5AA4"/>
@@ -28100,7 +30232,7 @@
       </w:rPr>
     </w:lvl>
   </w:abstractNum>
-  <w:abstractNum w:abstractNumId="114" w15:restartNumberingAfterBreak="0">
+  <w:abstractNum w:abstractNumId="119" w15:restartNumberingAfterBreak="0">
     <w:nsid w:val="78E83281"/>
     <w:multiLevelType w:val="multilevel"/>
     <w:tmpl w:val="91B432BE"/>
@@ -28249,7 +30381,7 @@
       </w:rPr>
     </w:lvl>
   </w:abstractNum>
-  <w:abstractNum w:abstractNumId="115" w15:restartNumberingAfterBreak="0">
+  <w:abstractNum w:abstractNumId="120" w15:restartNumberingAfterBreak="0">
     <w:nsid w:val="79156B9B"/>
     <w:multiLevelType w:val="multilevel"/>
     <w:tmpl w:val="C0A62E34"/>
@@ -28398,7 +30530,7 @@
       </w:rPr>
     </w:lvl>
   </w:abstractNum>
-  <w:abstractNum w:abstractNumId="116" w15:restartNumberingAfterBreak="0">
+  <w:abstractNum w:abstractNumId="121" w15:restartNumberingAfterBreak="0">
     <w:nsid w:val="79C13014"/>
     <w:multiLevelType w:val="multilevel"/>
     <w:tmpl w:val="671272CC"/>
@@ -28547,7 +30679,7 @@
       </w:rPr>
     </w:lvl>
   </w:abstractNum>
-  <w:abstractNum w:abstractNumId="117" w15:restartNumberingAfterBreak="0">
+  <w:abstractNum w:abstractNumId="122" w15:restartNumberingAfterBreak="0">
     <w:nsid w:val="7ADB6ADE"/>
     <w:multiLevelType w:val="multilevel"/>
     <w:tmpl w:val="0FD0DDA6"/>
@@ -28696,7 +30828,7 @@
       </w:rPr>
     </w:lvl>
   </w:abstractNum>
-  <w:abstractNum w:abstractNumId="118" w15:restartNumberingAfterBreak="0">
+  <w:abstractNum w:abstractNumId="123" w15:restartNumberingAfterBreak="0">
     <w:nsid w:val="7C3E2197"/>
     <w:multiLevelType w:val="multilevel"/>
     <w:tmpl w:val="88105E4C"/>
@@ -28845,7 +30977,7 @@
       </w:rPr>
     </w:lvl>
   </w:abstractNum>
-  <w:abstractNum w:abstractNumId="119" w15:restartNumberingAfterBreak="0">
+  <w:abstractNum w:abstractNumId="124" w15:restartNumberingAfterBreak="0">
     <w:nsid w:val="7D532593"/>
     <w:multiLevelType w:val="multilevel"/>
     <w:tmpl w:val="5D0ACE8E"/>
@@ -28962,7 +31094,7 @@
       </w:pPr>
     </w:lvl>
   </w:abstractNum>
-  <w:abstractNum w:abstractNumId="120" w15:restartNumberingAfterBreak="0">
+  <w:abstractNum w:abstractNumId="125" w15:restartNumberingAfterBreak="0">
     <w:nsid w:val="7E2F1EE5"/>
     <w:multiLevelType w:val="multilevel"/>
     <w:tmpl w:val="E1B6B3F4"/>
@@ -29111,7 +31243,124 @@
       </w:rPr>
     </w:lvl>
   </w:abstractNum>
-  <w:abstractNum w:abstractNumId="121" w15:restartNumberingAfterBreak="0">
+  <w:abstractNum w:abstractNumId="126" w15:restartNumberingAfterBreak="0">
+    <w:nsid w:val="7E9D2798"/>
+    <w:multiLevelType w:val="multilevel"/>
+    <w:tmpl w:val="63E81FD6"/>
+    <w:lvl w:ilvl="0">
+      <w:start w:val="1"/>
+      <w:numFmt w:val="decimal"/>
+      <w:lvlText w:val="%1."/>
+      <w:lvlJc w:val="left"/>
+      <w:pPr>
+        <w:tabs>
+          <w:tab w:val="num" w:pos="720"/>
+        </w:tabs>
+        <w:ind w:left="720" w:hanging="360"/>
+      </w:pPr>
+    </w:lvl>
+    <w:lvl w:ilvl="1">
+      <w:start w:val="1"/>
+      <w:numFmt w:val="bullet"/>
+      <w:lvlText w:val="o"/>
+      <w:lvlJc w:val="left"/>
+      <w:pPr>
+        <w:tabs>
+          <w:tab w:val="num" w:pos="1440"/>
+        </w:tabs>
+        <w:ind w:left="1440" w:hanging="360"/>
+      </w:pPr>
+      <w:rPr>
+        <w:rFonts w:ascii="Courier New" w:hAnsi="Courier New" w:hint="default"/>
+        <w:sz w:val="20"/>
+      </w:rPr>
+    </w:lvl>
+    <w:lvl w:ilvl="2" w:tentative="1">
+      <w:start w:val="1"/>
+      <w:numFmt w:val="decimal"/>
+      <w:lvlText w:val="%3."/>
+      <w:lvlJc w:val="left"/>
+      <w:pPr>
+        <w:tabs>
+          <w:tab w:val="num" w:pos="2160"/>
+        </w:tabs>
+        <w:ind w:left="2160" w:hanging="360"/>
+      </w:pPr>
+    </w:lvl>
+    <w:lvl w:ilvl="3" w:tentative="1">
+      <w:start w:val="1"/>
+      <w:numFmt w:val="decimal"/>
+      <w:lvlText w:val="%4."/>
+      <w:lvlJc w:val="left"/>
+      <w:pPr>
+        <w:tabs>
+          <w:tab w:val="num" w:pos="2880"/>
+        </w:tabs>
+        <w:ind w:left="2880" w:hanging="360"/>
+      </w:pPr>
+    </w:lvl>
+    <w:lvl w:ilvl="4" w:tentative="1">
+      <w:start w:val="1"/>
+      <w:numFmt w:val="decimal"/>
+      <w:lvlText w:val="%5."/>
+      <w:lvlJc w:val="left"/>
+      <w:pPr>
+        <w:tabs>
+          <w:tab w:val="num" w:pos="3600"/>
+        </w:tabs>
+        <w:ind w:left="3600" w:hanging="360"/>
+      </w:pPr>
+    </w:lvl>
+    <w:lvl w:ilvl="5" w:tentative="1">
+      <w:start w:val="1"/>
+      <w:numFmt w:val="decimal"/>
+      <w:lvlText w:val="%6."/>
+      <w:lvlJc w:val="left"/>
+      <w:pPr>
+        <w:tabs>
+          <w:tab w:val="num" w:pos="4320"/>
+        </w:tabs>
+        <w:ind w:left="4320" w:hanging="360"/>
+      </w:pPr>
+    </w:lvl>
+    <w:lvl w:ilvl="6" w:tentative="1">
+      <w:start w:val="1"/>
+      <w:numFmt w:val="decimal"/>
+      <w:lvlText w:val="%7."/>
+      <w:lvlJc w:val="left"/>
+      <w:pPr>
+        <w:tabs>
+          <w:tab w:val="num" w:pos="5040"/>
+        </w:tabs>
+        <w:ind w:left="5040" w:hanging="360"/>
+      </w:pPr>
+    </w:lvl>
+    <w:lvl w:ilvl="7" w:tentative="1">
+      <w:start w:val="1"/>
+      <w:numFmt w:val="decimal"/>
+      <w:lvlText w:val="%8."/>
+      <w:lvlJc w:val="left"/>
+      <w:pPr>
+        <w:tabs>
+          <w:tab w:val="num" w:pos="5760"/>
+        </w:tabs>
+        <w:ind w:left="5760" w:hanging="360"/>
+      </w:pPr>
+    </w:lvl>
+    <w:lvl w:ilvl="8" w:tentative="1">
+      <w:start w:val="1"/>
+      <w:numFmt w:val="decimal"/>
+      <w:lvlText w:val="%9."/>
+      <w:lvlJc w:val="left"/>
+      <w:pPr>
+        <w:tabs>
+          <w:tab w:val="num" w:pos="6480"/>
+        </w:tabs>
+        <w:ind w:left="6480" w:hanging="360"/>
+      </w:pPr>
+    </w:lvl>
+  </w:abstractNum>
+  <w:abstractNum w:abstractNumId="127" w15:restartNumberingAfterBreak="0">
     <w:nsid w:val="7F3601B4"/>
     <w:multiLevelType w:val="multilevel"/>
     <w:tmpl w:val="07DE102E"/>
@@ -29224,7 +31473,7 @@
       </w:pPr>
     </w:lvl>
   </w:abstractNum>
-  <w:abstractNum w:abstractNumId="122" w15:restartNumberingAfterBreak="0">
+  <w:abstractNum w:abstractNumId="128" w15:restartNumberingAfterBreak="0">
     <w:nsid w:val="7F8A13D0"/>
     <w:multiLevelType w:val="multilevel"/>
     <w:tmpl w:val="AB5EDB70"/>
@@ -29374,373 +31623,391 @@
     </w:lvl>
   </w:abstractNum>
   <w:num w:numId="1" w16cid:durableId="192690355">
-    <w:abstractNumId w:val="93"/>
+    <w:abstractNumId w:val="97"/>
   </w:num>
   <w:num w:numId="2" w16cid:durableId="1794444519">
-    <w:abstractNumId w:val="98"/>
+    <w:abstractNumId w:val="102"/>
   </w:num>
   <w:num w:numId="3" w16cid:durableId="1584144904">
-    <w:abstractNumId w:val="32"/>
+    <w:abstractNumId w:val="33"/>
   </w:num>
   <w:num w:numId="4" w16cid:durableId="881747293">
-    <w:abstractNumId w:val="60"/>
+    <w:abstractNumId w:val="63"/>
   </w:num>
   <w:num w:numId="5" w16cid:durableId="367726496">
-    <w:abstractNumId w:val="120"/>
+    <w:abstractNumId w:val="125"/>
   </w:num>
   <w:num w:numId="6" w16cid:durableId="97913231">
-    <w:abstractNumId w:val="49"/>
+    <w:abstractNumId w:val="50"/>
   </w:num>
   <w:num w:numId="7" w16cid:durableId="465510605">
-    <w:abstractNumId w:val="99"/>
+    <w:abstractNumId w:val="103"/>
   </w:num>
   <w:num w:numId="8" w16cid:durableId="414673054">
-    <w:abstractNumId w:val="11"/>
+    <w:abstractNumId w:val="12"/>
   </w:num>
   <w:num w:numId="9" w16cid:durableId="1810050426">
-    <w:abstractNumId w:val="80"/>
+    <w:abstractNumId w:val="83"/>
   </w:num>
   <w:num w:numId="10" w16cid:durableId="1185750901">
-    <w:abstractNumId w:val="86"/>
+    <w:abstractNumId w:val="90"/>
   </w:num>
   <w:num w:numId="11" w16cid:durableId="1070277437">
     <w:abstractNumId w:val="1"/>
   </w:num>
   <w:num w:numId="12" w16cid:durableId="557979443">
-    <w:abstractNumId w:val="22"/>
+    <w:abstractNumId w:val="23"/>
   </w:num>
   <w:num w:numId="13" w16cid:durableId="317340650">
-    <w:abstractNumId w:val="64"/>
+    <w:abstractNumId w:val="67"/>
   </w:num>
   <w:num w:numId="14" w16cid:durableId="328023907">
-    <w:abstractNumId w:val="63"/>
+    <w:abstractNumId w:val="66"/>
   </w:num>
   <w:num w:numId="15" w16cid:durableId="1597129604">
-    <w:abstractNumId w:val="5"/>
+    <w:abstractNumId w:val="6"/>
   </w:num>
   <w:num w:numId="16" w16cid:durableId="1870944984">
+    <w:abstractNumId w:val="84"/>
+  </w:num>
+  <w:num w:numId="17" w16cid:durableId="1683968138">
+    <w:abstractNumId w:val="87"/>
+  </w:num>
+  <w:num w:numId="18" w16cid:durableId="288829627">
+    <w:abstractNumId w:val="14"/>
+  </w:num>
+  <w:num w:numId="19" w16cid:durableId="386340793">
+    <w:abstractNumId w:val="37"/>
+  </w:num>
+  <w:num w:numId="20" w16cid:durableId="723455090">
+    <w:abstractNumId w:val="76"/>
+  </w:num>
+  <w:num w:numId="21" w16cid:durableId="418598004">
+    <w:abstractNumId w:val="48"/>
+  </w:num>
+  <w:num w:numId="22" w16cid:durableId="463164135">
+    <w:abstractNumId w:val="60"/>
+  </w:num>
+  <w:num w:numId="23" w16cid:durableId="1142427482">
+    <w:abstractNumId w:val="41"/>
+  </w:num>
+  <w:num w:numId="24" w16cid:durableId="1275479849">
+    <w:abstractNumId w:val="26"/>
+  </w:num>
+  <w:num w:numId="25" w16cid:durableId="301666280">
+    <w:abstractNumId w:val="46"/>
+  </w:num>
+  <w:num w:numId="26" w16cid:durableId="1891066006">
+    <w:abstractNumId w:val="100"/>
+  </w:num>
+  <w:num w:numId="27" w16cid:durableId="455022706">
+    <w:abstractNumId w:val="106"/>
+  </w:num>
+  <w:num w:numId="28" w16cid:durableId="826939615">
+    <w:abstractNumId w:val="7"/>
+  </w:num>
+  <w:num w:numId="29" w16cid:durableId="244848398">
+    <w:abstractNumId w:val="108"/>
+  </w:num>
+  <w:num w:numId="30" w16cid:durableId="1133256623">
+    <w:abstractNumId w:val="32"/>
+  </w:num>
+  <w:num w:numId="31" w16cid:durableId="1659455694">
+    <w:abstractNumId w:val="21"/>
+  </w:num>
+  <w:num w:numId="32" w16cid:durableId="1336491417">
+    <w:abstractNumId w:val="92"/>
+  </w:num>
+  <w:num w:numId="33" w16cid:durableId="909115797">
+    <w:abstractNumId w:val="82"/>
+  </w:num>
+  <w:num w:numId="34" w16cid:durableId="1497113050">
+    <w:abstractNumId w:val="109"/>
+  </w:num>
+  <w:num w:numId="35" w16cid:durableId="1603797873">
+    <w:abstractNumId w:val="98"/>
+  </w:num>
+  <w:num w:numId="36" w16cid:durableId="1343319196">
+    <w:abstractNumId w:val="69"/>
+  </w:num>
+  <w:num w:numId="37" w16cid:durableId="1996058481">
+    <w:abstractNumId w:val="116"/>
+  </w:num>
+  <w:num w:numId="38" w16cid:durableId="284436130">
+    <w:abstractNumId w:val="27"/>
+  </w:num>
+  <w:num w:numId="39" w16cid:durableId="992759133">
+    <w:abstractNumId w:val="101"/>
+  </w:num>
+  <w:num w:numId="40" w16cid:durableId="1060708748">
+    <w:abstractNumId w:val="58"/>
+  </w:num>
+  <w:num w:numId="41" w16cid:durableId="1482384172">
+    <w:abstractNumId w:val="68"/>
+  </w:num>
+  <w:num w:numId="42" w16cid:durableId="308440354">
+    <w:abstractNumId w:val="85"/>
+  </w:num>
+  <w:num w:numId="43" w16cid:durableId="1247232488">
+    <w:abstractNumId w:val="11"/>
+  </w:num>
+  <w:num w:numId="44" w16cid:durableId="2122214950">
+    <w:abstractNumId w:val="40"/>
+  </w:num>
+  <w:num w:numId="45" w16cid:durableId="1190484142">
+    <w:abstractNumId w:val="3"/>
+  </w:num>
+  <w:num w:numId="46" w16cid:durableId="1621764922">
     <w:abstractNumId w:val="81"/>
   </w:num>
-  <w:num w:numId="17" w16cid:durableId="1683968138">
-    <w:abstractNumId w:val="84"/>
+  <w:num w:numId="47" w16cid:durableId="1894534262">
+    <w:abstractNumId w:val="123"/>
   </w:num>
-  <w:num w:numId="18" w16cid:durableId="288829627">
-    <w:abstractNumId w:val="13"/>
+  <w:num w:numId="48" w16cid:durableId="1804417964">
+    <w:abstractNumId w:val="30"/>
   </w:num>
-  <w:num w:numId="19" w16cid:durableId="386340793">
-    <w:abstractNumId w:val="36"/>
+  <w:num w:numId="49" w16cid:durableId="1199466914">
+    <w:abstractNumId w:val="121"/>
   </w:num>
-  <w:num w:numId="20" w16cid:durableId="723455090">
+  <w:num w:numId="50" w16cid:durableId="895893798">
     <w:abstractNumId w:val="73"/>
   </w:num>
-  <w:num w:numId="21" w16cid:durableId="418598004">
-    <w:abstractNumId w:val="47"/>
-  </w:num>
-  <w:num w:numId="22" w16cid:durableId="463164135">
-    <w:abstractNumId w:val="58"/>
-  </w:num>
-  <w:num w:numId="23" w16cid:durableId="1142427482">
-    <w:abstractNumId w:val="40"/>
-  </w:num>
-  <w:num w:numId="24" w16cid:durableId="1275479849">
-    <w:abstractNumId w:val="25"/>
-  </w:num>
-  <w:num w:numId="25" w16cid:durableId="301666280">
-    <w:abstractNumId w:val="45"/>
-  </w:num>
-  <w:num w:numId="26" w16cid:durableId="1891066006">
-    <w:abstractNumId w:val="96"/>
-  </w:num>
-  <w:num w:numId="27" w16cid:durableId="455022706">
-    <w:abstractNumId w:val="102"/>
-  </w:num>
-  <w:num w:numId="28" w16cid:durableId="826939615">
-    <w:abstractNumId w:val="6"/>
-  </w:num>
-  <w:num w:numId="29" w16cid:durableId="244848398">
-    <w:abstractNumId w:val="103"/>
-  </w:num>
-  <w:num w:numId="30" w16cid:durableId="1133256623">
-    <w:abstractNumId w:val="31"/>
-  </w:num>
-  <w:num w:numId="31" w16cid:durableId="1659455694">
-    <w:abstractNumId w:val="20"/>
-  </w:num>
-  <w:num w:numId="32" w16cid:durableId="1336491417">
-    <w:abstractNumId w:val="88"/>
-  </w:num>
-  <w:num w:numId="33" w16cid:durableId="909115797">
-    <w:abstractNumId w:val="79"/>
-  </w:num>
-  <w:num w:numId="34" w16cid:durableId="1497113050">
-    <w:abstractNumId w:val="104"/>
-  </w:num>
-  <w:num w:numId="35" w16cid:durableId="1603797873">
-    <w:abstractNumId w:val="94"/>
-  </w:num>
-  <w:num w:numId="36" w16cid:durableId="1343319196">
-    <w:abstractNumId w:val="66"/>
-  </w:num>
-  <w:num w:numId="37" w16cid:durableId="1996058481">
-    <w:abstractNumId w:val="111"/>
-  </w:num>
-  <w:num w:numId="38" w16cid:durableId="284436130">
-    <w:abstractNumId w:val="26"/>
-  </w:num>
-  <w:num w:numId="39" w16cid:durableId="992759133">
-    <w:abstractNumId w:val="97"/>
-  </w:num>
-  <w:num w:numId="40" w16cid:durableId="1060708748">
-    <w:abstractNumId w:val="56"/>
-  </w:num>
-  <w:num w:numId="41" w16cid:durableId="1482384172">
-    <w:abstractNumId w:val="65"/>
-  </w:num>
-  <w:num w:numId="42" w16cid:durableId="308440354">
-    <w:abstractNumId w:val="82"/>
-  </w:num>
-  <w:num w:numId="43" w16cid:durableId="1247232488">
-    <w:abstractNumId w:val="10"/>
-  </w:num>
-  <w:num w:numId="44" w16cid:durableId="2122214950">
-    <w:abstractNumId w:val="39"/>
-  </w:num>
-  <w:num w:numId="45" w16cid:durableId="1190484142">
-    <w:abstractNumId w:val="2"/>
-  </w:num>
-  <w:num w:numId="46" w16cid:durableId="1621764922">
-    <w:abstractNumId w:val="78"/>
-  </w:num>
-  <w:num w:numId="47" w16cid:durableId="1894534262">
-    <w:abstractNumId w:val="118"/>
-  </w:num>
-  <w:num w:numId="48" w16cid:durableId="1804417964">
-    <w:abstractNumId w:val="29"/>
-  </w:num>
-  <w:num w:numId="49" w16cid:durableId="1199466914">
-    <w:abstractNumId w:val="116"/>
-  </w:num>
-  <w:num w:numId="50" w16cid:durableId="895893798">
-    <w:abstractNumId w:val="70"/>
-  </w:num>
   <w:num w:numId="51" w16cid:durableId="162748658">
-    <w:abstractNumId w:val="7"/>
+    <w:abstractNumId w:val="8"/>
   </w:num>
   <w:num w:numId="52" w16cid:durableId="1314677041">
     <w:abstractNumId w:val="0"/>
   </w:num>
   <w:num w:numId="53" w16cid:durableId="1763646068">
-    <w:abstractNumId w:val="85"/>
+    <w:abstractNumId w:val="89"/>
   </w:num>
   <w:num w:numId="54" w16cid:durableId="1207134300">
+    <w:abstractNumId w:val="36"/>
+  </w:num>
+  <w:num w:numId="55" w16cid:durableId="873005170">
+    <w:abstractNumId w:val="86"/>
+  </w:num>
+  <w:num w:numId="56" w16cid:durableId="1308169849">
+    <w:abstractNumId w:val="77"/>
+  </w:num>
+  <w:num w:numId="57" w16cid:durableId="357968050">
+    <w:abstractNumId w:val="93"/>
+  </w:num>
+  <w:num w:numId="58" w16cid:durableId="1895892093">
+    <w:abstractNumId w:val="120"/>
+  </w:num>
+  <w:num w:numId="59" w16cid:durableId="1027221841">
+    <w:abstractNumId w:val="110"/>
+  </w:num>
+  <w:num w:numId="60" w16cid:durableId="2069063080">
+    <w:abstractNumId w:val="78"/>
+  </w:num>
+  <w:num w:numId="61" w16cid:durableId="49771116">
+    <w:abstractNumId w:val="56"/>
+  </w:num>
+  <w:num w:numId="62" w16cid:durableId="1448159084">
+    <w:abstractNumId w:val="118"/>
+  </w:num>
+  <w:num w:numId="63" w16cid:durableId="1575122264">
+    <w:abstractNumId w:val="10"/>
+  </w:num>
+  <w:num w:numId="64" w16cid:durableId="904991766">
+    <w:abstractNumId w:val="18"/>
+  </w:num>
+  <w:num w:numId="65" w16cid:durableId="831141903">
+    <w:abstractNumId w:val="55"/>
+  </w:num>
+  <w:num w:numId="66" w16cid:durableId="339043224">
+    <w:abstractNumId w:val="96"/>
+  </w:num>
+  <w:num w:numId="67" w16cid:durableId="1496143401">
+    <w:abstractNumId w:val="17"/>
+  </w:num>
+  <w:num w:numId="68" w16cid:durableId="1870217932">
+    <w:abstractNumId w:val="57"/>
+  </w:num>
+  <w:num w:numId="69" w16cid:durableId="636647002">
+    <w:abstractNumId w:val="70"/>
+  </w:num>
+  <w:num w:numId="70" w16cid:durableId="1385714199">
+    <w:abstractNumId w:val="47"/>
+  </w:num>
+  <w:num w:numId="71" w16cid:durableId="2077898425">
+    <w:abstractNumId w:val="111"/>
+  </w:num>
+  <w:num w:numId="72" w16cid:durableId="444547860">
+    <w:abstractNumId w:val="28"/>
+  </w:num>
+  <w:num w:numId="73" w16cid:durableId="1302029979">
+    <w:abstractNumId w:val="34"/>
+  </w:num>
+  <w:num w:numId="74" w16cid:durableId="1699622012">
+    <w:abstractNumId w:val="16"/>
+  </w:num>
+  <w:num w:numId="75" w16cid:durableId="1010185719">
+    <w:abstractNumId w:val="72"/>
+  </w:num>
+  <w:num w:numId="76" w16cid:durableId="68312096">
+    <w:abstractNumId w:val="119"/>
+  </w:num>
+  <w:num w:numId="77" w16cid:durableId="813985498">
+    <w:abstractNumId w:val="19"/>
+  </w:num>
+  <w:num w:numId="78" w16cid:durableId="1472091110">
+    <w:abstractNumId w:val="115"/>
+  </w:num>
+  <w:num w:numId="79" w16cid:durableId="1560744818">
+    <w:abstractNumId w:val="113"/>
+  </w:num>
+  <w:num w:numId="80" w16cid:durableId="2133285104">
+    <w:abstractNumId w:val="43"/>
+  </w:num>
+  <w:num w:numId="81" w16cid:durableId="1218783631">
+    <w:abstractNumId w:val="42"/>
+  </w:num>
+  <w:num w:numId="82" w16cid:durableId="1894808844">
+    <w:abstractNumId w:val="122"/>
+  </w:num>
+  <w:num w:numId="83" w16cid:durableId="154609397">
+    <w:abstractNumId w:val="127"/>
+  </w:num>
+  <w:num w:numId="84" w16cid:durableId="904415263">
+    <w:abstractNumId w:val="59"/>
+  </w:num>
+  <w:num w:numId="85" w16cid:durableId="1926957044">
+    <w:abstractNumId w:val="13"/>
+  </w:num>
+  <w:num w:numId="86" w16cid:durableId="1041907343">
+    <w:abstractNumId w:val="75"/>
+  </w:num>
+  <w:num w:numId="87" w16cid:durableId="637536826">
+    <w:abstractNumId w:val="39"/>
+  </w:num>
+  <w:num w:numId="88" w16cid:durableId="1955479532">
+    <w:abstractNumId w:val="25"/>
+  </w:num>
+  <w:num w:numId="89" w16cid:durableId="219024226">
+    <w:abstractNumId w:val="128"/>
+  </w:num>
+  <w:num w:numId="90" w16cid:durableId="1387878547">
+    <w:abstractNumId w:val="91"/>
+  </w:num>
+  <w:num w:numId="91" w16cid:durableId="320280345">
+    <w:abstractNumId w:val="79"/>
+  </w:num>
+  <w:num w:numId="92" w16cid:durableId="891773784">
+    <w:abstractNumId w:val="54"/>
+  </w:num>
+  <w:num w:numId="93" w16cid:durableId="1600140324">
+    <w:abstractNumId w:val="124"/>
+  </w:num>
+  <w:num w:numId="94" w16cid:durableId="803352876">
+    <w:abstractNumId w:val="9"/>
+  </w:num>
+  <w:num w:numId="95" w16cid:durableId="1983996636">
+    <w:abstractNumId w:val="49"/>
+  </w:num>
+  <w:num w:numId="96" w16cid:durableId="1258364294">
+    <w:abstractNumId w:val="80"/>
+  </w:num>
+  <w:num w:numId="97" w16cid:durableId="1542744364">
+    <w:abstractNumId w:val="74"/>
+  </w:num>
+  <w:num w:numId="98" w16cid:durableId="1179391935">
+    <w:abstractNumId w:val="65"/>
+  </w:num>
+  <w:num w:numId="99" w16cid:durableId="1507403615">
+    <w:abstractNumId w:val="64"/>
+  </w:num>
+  <w:num w:numId="100" w16cid:durableId="2095470275">
+    <w:abstractNumId w:val="104"/>
+  </w:num>
+  <w:num w:numId="101" w16cid:durableId="1136216192">
+    <w:abstractNumId w:val="53"/>
+  </w:num>
+  <w:num w:numId="102" w16cid:durableId="16928882">
+    <w:abstractNumId w:val="29"/>
+  </w:num>
+  <w:num w:numId="103" w16cid:durableId="1147824221">
+    <w:abstractNumId w:val="112"/>
+  </w:num>
+  <w:num w:numId="104" w16cid:durableId="1785152204">
+    <w:abstractNumId w:val="20"/>
+  </w:num>
+  <w:num w:numId="105" w16cid:durableId="2107965728">
+    <w:abstractNumId w:val="71"/>
+  </w:num>
+  <w:num w:numId="106" w16cid:durableId="1994990968">
+    <w:abstractNumId w:val="105"/>
+  </w:num>
+  <w:num w:numId="107" w16cid:durableId="1303272197">
+    <w:abstractNumId w:val="94"/>
+  </w:num>
+  <w:num w:numId="108" w16cid:durableId="1555314431">
+    <w:abstractNumId w:val="22"/>
+  </w:num>
+  <w:num w:numId="109" w16cid:durableId="759521048">
+    <w:abstractNumId w:val="38"/>
+  </w:num>
+  <w:num w:numId="110" w16cid:durableId="1747335696">
+    <w:abstractNumId w:val="99"/>
+  </w:num>
+  <w:num w:numId="111" w16cid:durableId="1733119241">
+    <w:abstractNumId w:val="62"/>
+  </w:num>
+  <w:num w:numId="112" w16cid:durableId="1455444160">
+    <w:abstractNumId w:val="24"/>
+  </w:num>
+  <w:num w:numId="113" w16cid:durableId="358509399">
     <w:abstractNumId w:val="35"/>
   </w:num>
-  <w:num w:numId="55" w16cid:durableId="873005170">
-    <w:abstractNumId w:val="83"/>
+  <w:num w:numId="114" w16cid:durableId="280769799">
+    <w:abstractNumId w:val="44"/>
   </w:num>
-  <w:num w:numId="56" w16cid:durableId="1308169849">
-    <w:abstractNumId w:val="74"/>
-  </w:num>
-  <w:num w:numId="57" w16cid:durableId="357968050">
-    <w:abstractNumId w:val="89"/>
-  </w:num>
-  <w:num w:numId="58" w16cid:durableId="1895892093">
-    <w:abstractNumId w:val="115"/>
-  </w:num>
-  <w:num w:numId="59" w16cid:durableId="1027221841">
-    <w:abstractNumId w:val="105"/>
-  </w:num>
-  <w:num w:numId="60" w16cid:durableId="2069063080">
-    <w:abstractNumId w:val="75"/>
-  </w:num>
-  <w:num w:numId="61" w16cid:durableId="49771116">
-    <w:abstractNumId w:val="54"/>
-  </w:num>
-  <w:num w:numId="62" w16cid:durableId="1448159084">
-    <w:abstractNumId w:val="113"/>
-  </w:num>
-  <w:num w:numId="63" w16cid:durableId="1575122264">
-    <w:abstractNumId w:val="9"/>
-  </w:num>
-  <w:num w:numId="64" w16cid:durableId="904991766">
-    <w:abstractNumId w:val="17"/>
-  </w:num>
-  <w:num w:numId="65" w16cid:durableId="831141903">
-    <w:abstractNumId w:val="53"/>
-  </w:num>
-  <w:num w:numId="66" w16cid:durableId="339043224">
-    <w:abstractNumId w:val="92"/>
-  </w:num>
-  <w:num w:numId="67" w16cid:durableId="1496143401">
-    <w:abstractNumId w:val="16"/>
-  </w:num>
-  <w:num w:numId="68" w16cid:durableId="1870217932">
-    <w:abstractNumId w:val="55"/>
-  </w:num>
-  <w:num w:numId="69" w16cid:durableId="636647002">
-    <w:abstractNumId w:val="67"/>
-  </w:num>
-  <w:num w:numId="70" w16cid:durableId="1385714199">
-    <w:abstractNumId w:val="46"/>
-  </w:num>
-  <w:num w:numId="71" w16cid:durableId="2077898425">
-    <w:abstractNumId w:val="106"/>
-  </w:num>
-  <w:num w:numId="72" w16cid:durableId="444547860">
-    <w:abstractNumId w:val="27"/>
-  </w:num>
-  <w:num w:numId="73" w16cid:durableId="1302029979">
-    <w:abstractNumId w:val="33"/>
-  </w:num>
-  <w:num w:numId="74" w16cid:durableId="1699622012">
+  <w:num w:numId="115" w16cid:durableId="1281063890">
     <w:abstractNumId w:val="15"/>
   </w:num>
-  <w:num w:numId="75" w16cid:durableId="1010185719">
-    <w:abstractNumId w:val="69"/>
+  <w:num w:numId="116" w16cid:durableId="331033586">
+    <w:abstractNumId w:val="4"/>
   </w:num>
-  <w:num w:numId="76" w16cid:durableId="68312096">
+  <w:num w:numId="117" w16cid:durableId="1451509980">
+    <w:abstractNumId w:val="51"/>
+  </w:num>
+  <w:num w:numId="118" w16cid:durableId="1912035400">
     <w:abstractNumId w:val="114"/>
   </w:num>
-  <w:num w:numId="77" w16cid:durableId="813985498">
-    <w:abstractNumId w:val="18"/>
+  <w:num w:numId="119" w16cid:durableId="46225977">
+    <w:abstractNumId w:val="31"/>
   </w:num>
-  <w:num w:numId="78" w16cid:durableId="1472091110">
-    <w:abstractNumId w:val="110"/>
-  </w:num>
-  <w:num w:numId="79" w16cid:durableId="1560744818">
-    <w:abstractNumId w:val="108"/>
-  </w:num>
-  <w:num w:numId="80" w16cid:durableId="2133285104">
-    <w:abstractNumId w:val="42"/>
-  </w:num>
-  <w:num w:numId="81" w16cid:durableId="1218783631">
-    <w:abstractNumId w:val="41"/>
-  </w:num>
-  <w:num w:numId="82" w16cid:durableId="1894808844">
+  <w:num w:numId="120" w16cid:durableId="1129326893">
     <w:abstractNumId w:val="117"/>
   </w:num>
-  <w:num w:numId="83" w16cid:durableId="154609397">
-    <w:abstractNumId w:val="121"/>
+  <w:num w:numId="121" w16cid:durableId="683021237">
+    <w:abstractNumId w:val="95"/>
   </w:num>
-  <w:num w:numId="84" w16cid:durableId="904415263">
-    <w:abstractNumId w:val="57"/>
+  <w:num w:numId="122" w16cid:durableId="156462817">
+    <w:abstractNumId w:val="45"/>
   </w:num>
-  <w:num w:numId="85" w16cid:durableId="1926957044">
-    <w:abstractNumId w:val="12"/>
+  <w:num w:numId="123" w16cid:durableId="519205073">
+    <w:abstractNumId w:val="5"/>
   </w:num>
-  <w:num w:numId="86" w16cid:durableId="1041907343">
-    <w:abstractNumId w:val="72"/>
+  <w:num w:numId="124" w16cid:durableId="604851618">
+    <w:abstractNumId w:val="2"/>
   </w:num>
-  <w:num w:numId="87" w16cid:durableId="637536826">
-    <w:abstractNumId w:val="38"/>
+  <w:num w:numId="125" w16cid:durableId="1644654324">
+    <w:abstractNumId w:val="126"/>
   </w:num>
-  <w:num w:numId="88" w16cid:durableId="1955479532">
-    <w:abstractNumId w:val="24"/>
+  <w:num w:numId="126" w16cid:durableId="1665547422">
+    <w:abstractNumId w:val="107"/>
   </w:num>
-  <w:num w:numId="89" w16cid:durableId="219024226">
-    <w:abstractNumId w:val="122"/>
-  </w:num>
-  <w:num w:numId="90" w16cid:durableId="1387878547">
-    <w:abstractNumId w:val="87"/>
-  </w:num>
-  <w:num w:numId="91" w16cid:durableId="320280345">
-    <w:abstractNumId w:val="76"/>
-  </w:num>
-  <w:num w:numId="92" w16cid:durableId="891773784">
+  <w:num w:numId="127" w16cid:durableId="147132538">
     <w:abstractNumId w:val="52"/>
   </w:num>
-  <w:num w:numId="93" w16cid:durableId="1600140324">
-    <w:abstractNumId w:val="119"/>
-  </w:num>
-  <w:num w:numId="94" w16cid:durableId="803352876">
-    <w:abstractNumId w:val="8"/>
-  </w:num>
-  <w:num w:numId="95" w16cid:durableId="1983996636">
-    <w:abstractNumId w:val="48"/>
-  </w:num>
-  <w:num w:numId="96" w16cid:durableId="1258364294">
-    <w:abstractNumId w:val="77"/>
-  </w:num>
-  <w:num w:numId="97" w16cid:durableId="1542744364">
-    <w:abstractNumId w:val="71"/>
-  </w:num>
-  <w:num w:numId="98" w16cid:durableId="1179391935">
-    <w:abstractNumId w:val="62"/>
-  </w:num>
-  <w:num w:numId="99" w16cid:durableId="1507403615">
+  <w:num w:numId="128" w16cid:durableId="953633194">
     <w:abstractNumId w:val="61"/>
   </w:num>
-  <w:num w:numId="100" w16cid:durableId="2095470275">
-    <w:abstractNumId w:val="100"/>
-  </w:num>
-  <w:num w:numId="101" w16cid:durableId="1136216192">
-    <w:abstractNumId w:val="51"/>
-  </w:num>
-  <w:num w:numId="102" w16cid:durableId="16928882">
-    <w:abstractNumId w:val="28"/>
-  </w:num>
-  <w:num w:numId="103" w16cid:durableId="1147824221">
-    <w:abstractNumId w:val="107"/>
-  </w:num>
-  <w:num w:numId="104" w16cid:durableId="1785152204">
-    <w:abstractNumId w:val="19"/>
-  </w:num>
-  <w:num w:numId="105" w16cid:durableId="2107965728">
-    <w:abstractNumId w:val="68"/>
-  </w:num>
-  <w:num w:numId="106" w16cid:durableId="1994990968">
-    <w:abstractNumId w:val="101"/>
-  </w:num>
-  <w:num w:numId="107" w16cid:durableId="1303272197">
-    <w:abstractNumId w:val="90"/>
-  </w:num>
-  <w:num w:numId="108" w16cid:durableId="1555314431">
-    <w:abstractNumId w:val="21"/>
-  </w:num>
-  <w:num w:numId="109" w16cid:durableId="759521048">
-    <w:abstractNumId w:val="37"/>
-  </w:num>
-  <w:num w:numId="110" w16cid:durableId="1747335696">
-    <w:abstractNumId w:val="95"/>
-  </w:num>
-  <w:num w:numId="111" w16cid:durableId="1733119241">
-    <w:abstractNumId w:val="59"/>
-  </w:num>
-  <w:num w:numId="112" w16cid:durableId="1455444160">
-    <w:abstractNumId w:val="23"/>
-  </w:num>
-  <w:num w:numId="113" w16cid:durableId="358509399">
-    <w:abstractNumId w:val="34"/>
-  </w:num>
-  <w:num w:numId="114" w16cid:durableId="280769799">
-    <w:abstractNumId w:val="43"/>
-  </w:num>
-  <w:num w:numId="115" w16cid:durableId="1281063890">
-    <w:abstractNumId w:val="14"/>
-  </w:num>
-  <w:num w:numId="116" w16cid:durableId="331033586">
-    <w:abstractNumId w:val="3"/>
-  </w:num>
-  <w:num w:numId="117" w16cid:durableId="1451509980">
-    <w:abstractNumId w:val="50"/>
-  </w:num>
-  <w:num w:numId="118" w16cid:durableId="1912035400">
-    <w:abstractNumId w:val="109"/>
-  </w:num>
-  <w:num w:numId="119" w16cid:durableId="46225977">
-    <w:abstractNumId w:val="30"/>
-  </w:num>
-  <w:num w:numId="120" w16cid:durableId="1129326893">
-    <w:abstractNumId w:val="112"/>
-  </w:num>
-  <w:num w:numId="121" w16cid:durableId="683021237">
-    <w:abstractNumId w:val="91"/>
-  </w:num>
-  <w:num w:numId="122" w16cid:durableId="156462817">
-    <w:abstractNumId w:val="44"/>
-  </w:num>
-  <w:num w:numId="123" w16cid:durableId="519205073">
-    <w:abstractNumId w:val="4"/>
+  <w:num w:numId="129" w16cid:durableId="2107647076">
+    <w:abstractNumId w:val="88"/>
   </w:num>
 </w:numbering>
 </file>

</xml_diff>

<commit_message>
feat: update Project status summary document with latest information
</commit_message>
<xml_diff>
--- a/docs/Project status summary.docx
+++ b/docs/Project status summary.docx
@@ -12652,7 +12652,63 @@
         <w:rPr>
           <w:lang w:val="en-US"/>
         </w:rPr>
-        <w:t xml:space="preserve">: GraphAssignmentEnv expone reset/step, action_space=MultiDiscrete. </w:t>
+        <w:t xml:space="preserve">: </w:t>
+      </w:r>
+      <w:proofErr w:type="spellStart"/>
+      <w:r>
+        <w:rPr>
+          <w:lang w:val="en-US"/>
+        </w:rPr>
+        <w:t>GraphAssignmentEnv</w:t>
+      </w:r>
+      <w:proofErr w:type="spellEnd"/>
+      <w:r>
+        <w:rPr>
+          <w:lang w:val="en-US"/>
+        </w:rPr>
+        <w:t xml:space="preserve"> </w:t>
+      </w:r>
+      <w:proofErr w:type="spellStart"/>
+      <w:r>
+        <w:rPr>
+          <w:lang w:val="en-US"/>
+        </w:rPr>
+        <w:t>expone</w:t>
+      </w:r>
+      <w:proofErr w:type="spellEnd"/>
+      <w:r>
+        <w:rPr>
+          <w:lang w:val="en-US"/>
+        </w:rPr>
+        <w:t xml:space="preserve"> reset/step, </w:t>
+      </w:r>
+      <w:proofErr w:type="spellStart"/>
+      <w:r>
+        <w:rPr>
+          <w:lang w:val="en-US"/>
+        </w:rPr>
+        <w:t>action_space</w:t>
+      </w:r>
+      <w:proofErr w:type="spellEnd"/>
+      <w:r>
+        <w:rPr>
+          <w:lang w:val="en-US"/>
+        </w:rPr>
+        <w:t>=</w:t>
+      </w:r>
+      <w:proofErr w:type="spellStart"/>
+      <w:r>
+        <w:rPr>
+          <w:lang w:val="en-US"/>
+        </w:rPr>
+        <w:t>MultiDiscrete</w:t>
+      </w:r>
+      <w:proofErr w:type="spellEnd"/>
+      <w:r>
+        <w:rPr>
+          <w:lang w:val="en-US"/>
+        </w:rPr>
+        <w:t xml:space="preserve">. </w:t>
       </w:r>
     </w:p>
     <w:p>
@@ -13513,11 +13569,47 @@
           <w:lang w:val="en-US"/>
         </w:rPr>
       </w:pPr>
-      <w:r>
-        <w:rPr>
-          <w:lang w:val="en-US"/>
-        </w:rPr>
-        <w:t xml:space="preserve">graph_dict: grafo padded + action_mask </w:t>
+      <w:proofErr w:type="spellStart"/>
+      <w:r>
+        <w:rPr>
+          <w:lang w:val="en-US"/>
+        </w:rPr>
+        <w:t>graph_dict</w:t>
+      </w:r>
+      <w:proofErr w:type="spellEnd"/>
+      <w:r>
+        <w:rPr>
+          <w:lang w:val="en-US"/>
+        </w:rPr>
+        <w:t xml:space="preserve">: </w:t>
+      </w:r>
+      <w:proofErr w:type="spellStart"/>
+      <w:r>
+        <w:rPr>
+          <w:lang w:val="en-US"/>
+        </w:rPr>
+        <w:t>grafo</w:t>
+      </w:r>
+      <w:proofErr w:type="spellEnd"/>
+      <w:r>
+        <w:rPr>
+          <w:lang w:val="en-US"/>
+        </w:rPr>
+        <w:t xml:space="preserve"> padded + </w:t>
+      </w:r>
+      <w:proofErr w:type="spellStart"/>
+      <w:r>
+        <w:rPr>
+          <w:lang w:val="en-US"/>
+        </w:rPr>
+        <w:t>action_mask</w:t>
+      </w:r>
+      <w:proofErr w:type="spellEnd"/>
+      <w:r>
+        <w:rPr>
+          <w:lang w:val="en-US"/>
+        </w:rPr>
+        <w:t xml:space="preserve"> </w:t>
       </w:r>
     </w:p>
     <w:p>
@@ -13568,7 +13660,49 @@
         <w:rPr>
           <w:lang w:val="en-US"/>
         </w:rPr>
-        <w:t xml:space="preserve">con graph_dict: obs_dict → GNNFeatureExtractor → z → actor logits </w:t>
+        <w:t xml:space="preserve">con </w:t>
+      </w:r>
+      <w:proofErr w:type="spellStart"/>
+      <w:r>
+        <w:rPr>
+          <w:lang w:val="en-US"/>
+        </w:rPr>
+        <w:t>graph_dict</w:t>
+      </w:r>
+      <w:proofErr w:type="spellEnd"/>
+      <w:r>
+        <w:rPr>
+          <w:lang w:val="en-US"/>
+        </w:rPr>
+        <w:t xml:space="preserve">: </w:t>
+      </w:r>
+      <w:proofErr w:type="spellStart"/>
+      <w:r>
+        <w:rPr>
+          <w:lang w:val="en-US"/>
+        </w:rPr>
+        <w:t>obs_dict</w:t>
+      </w:r>
+      <w:proofErr w:type="spellEnd"/>
+      <w:r>
+        <w:rPr>
+          <w:lang w:val="en-US"/>
+        </w:rPr>
+        <w:t xml:space="preserve"> → </w:t>
+      </w:r>
+      <w:proofErr w:type="spellStart"/>
+      <w:r>
+        <w:rPr>
+          <w:lang w:val="en-US"/>
+        </w:rPr>
+        <w:t>GNNFeatureExtractor</w:t>
+      </w:r>
+      <w:proofErr w:type="spellEnd"/>
+      <w:r>
+        <w:rPr>
+          <w:lang w:val="en-US"/>
+        </w:rPr>
+        <w:t xml:space="preserve"> → z → actor logits </w:t>
       </w:r>
     </w:p>
     <w:p>
@@ -14006,6 +14140,413 @@
       <w:proofErr w:type="spellEnd"/>
       <w:r>
         <w:t xml:space="preserve"> (paso incremental correcto).</w:t>
+      </w:r>
+    </w:p>
+    <w:p/>
+    <w:p>
+      <w:pPr>
+        <w:pBdr>
+          <w:bottom w:val="single" w:sz="6" w:space="1" w:color="auto"/>
+        </w:pBdr>
+      </w:pPr>
+    </w:p>
+    <w:p/>
+    <w:p>
+      <w:pPr>
+        <w:rPr>
+          <w:b/>
+          <w:bCs/>
+        </w:rPr>
+      </w:pPr>
+      <w:r>
+        <w:rPr>
+          <w:b/>
+          <w:bCs/>
+        </w:rPr>
+        <w:t>Mapa mental mínimo (5 piezas)</w:t>
+      </w:r>
+    </w:p>
+    <w:p>
+      <w:r>
+        <w:t>Memoriza esta frase:</w:t>
+      </w:r>
+    </w:p>
+    <w:p>
+      <w:r>
+        <w:rPr>
+          <w:b/>
+          <w:bCs/>
+        </w:rPr>
+        <w:t>Train script</w:t>
+      </w:r>
+      <w:r>
+        <w:t xml:space="preserve"> orquesta → </w:t>
+      </w:r>
+      <w:proofErr w:type="spellStart"/>
+      <w:r>
+        <w:rPr>
+          <w:b/>
+          <w:bCs/>
+        </w:rPr>
+        <w:t>Env</w:t>
+      </w:r>
+      <w:proofErr w:type="spellEnd"/>
+      <w:r>
+        <w:t xml:space="preserve"> traduce/ejecuta → </w:t>
+      </w:r>
+      <w:r>
+        <w:rPr>
+          <w:b/>
+          <w:bCs/>
+        </w:rPr>
+        <w:t xml:space="preserve">Mask </w:t>
+      </w:r>
+      <w:proofErr w:type="spellStart"/>
+      <w:r>
+        <w:rPr>
+          <w:b/>
+          <w:bCs/>
+        </w:rPr>
+        <w:t>wrapper</w:t>
+      </w:r>
+      <w:proofErr w:type="spellEnd"/>
+      <w:r>
+        <w:t xml:space="preserve"> restringe acciones → </w:t>
+      </w:r>
+      <w:proofErr w:type="spellStart"/>
+      <w:r>
+        <w:rPr>
+          <w:b/>
+          <w:bCs/>
+        </w:rPr>
+        <w:t>Feature</w:t>
+      </w:r>
+      <w:proofErr w:type="spellEnd"/>
+      <w:r>
+        <w:rPr>
+          <w:b/>
+          <w:bCs/>
+        </w:rPr>
+        <w:t xml:space="preserve"> extractor</w:t>
+      </w:r>
+      <w:r>
+        <w:t xml:space="preserve"> aprende representación → </w:t>
+      </w:r>
+      <w:proofErr w:type="spellStart"/>
+      <w:r>
+        <w:rPr>
+          <w:b/>
+          <w:bCs/>
+        </w:rPr>
+        <w:t>Controller</w:t>
+      </w:r>
+      <w:proofErr w:type="spellEnd"/>
+      <w:r>
+        <w:t xml:space="preserve"> ejecuta en sim.</w:t>
+      </w:r>
+    </w:p>
+    <w:p>
+      <w:pPr>
+        <w:rPr>
+          <w:b/>
+          <w:bCs/>
+          <w:highlight w:val="yellow"/>
+        </w:rPr>
+      </w:pPr>
+      <w:r>
+        <w:rPr>
+          <w:b/>
+          <w:bCs/>
+          <w:highlight w:val="yellow"/>
+        </w:rPr>
+        <w:t>Archivos “top” (los que sí o sí debes dominar)</w:t>
+      </w:r>
+    </w:p>
+    <w:p>
+      <w:pPr>
+        <w:numPr>
+          <w:ilvl w:val="0"/>
+          <w:numId w:val="130"/>
+        </w:numPr>
+        <w:rPr>
+          <w:highlight w:val="yellow"/>
+        </w:rPr>
+      </w:pPr>
+      <w:r>
+        <w:rPr>
+          <w:highlight w:val="yellow"/>
+        </w:rPr>
+        <w:t xml:space="preserve">train_sb3_assignment_ppo.py → </w:t>
+      </w:r>
+      <w:r>
+        <w:rPr>
+          <w:b/>
+          <w:bCs/>
+          <w:highlight w:val="yellow"/>
+        </w:rPr>
+        <w:t>orquestación</w:t>
+      </w:r>
+      <w:r>
+        <w:rPr>
+          <w:highlight w:val="yellow"/>
+        </w:rPr>
+        <w:t xml:space="preserve"> (qué modo corre, qué </w:t>
+      </w:r>
+      <w:proofErr w:type="spellStart"/>
+      <w:r>
+        <w:rPr>
+          <w:highlight w:val="yellow"/>
+        </w:rPr>
+        <w:t>policy</w:t>
+      </w:r>
+      <w:proofErr w:type="spellEnd"/>
+      <w:r>
+        <w:rPr>
+          <w:highlight w:val="yellow"/>
+        </w:rPr>
+        <w:t xml:space="preserve"> usa, </w:t>
+      </w:r>
+      <w:proofErr w:type="spellStart"/>
+      <w:r>
+        <w:rPr>
+          <w:highlight w:val="yellow"/>
+        </w:rPr>
+        <w:t>wrappers</w:t>
+      </w:r>
+      <w:proofErr w:type="spellEnd"/>
+      <w:r>
+        <w:rPr>
+          <w:highlight w:val="yellow"/>
+        </w:rPr>
+        <w:t xml:space="preserve">) </w:t>
+      </w:r>
+    </w:p>
+    <w:p>
+      <w:pPr>
+        <w:numPr>
+          <w:ilvl w:val="0"/>
+          <w:numId w:val="130"/>
+        </w:numPr>
+        <w:rPr>
+          <w:highlight w:val="yellow"/>
+          <w:lang w:val="en-US"/>
+        </w:rPr>
+      </w:pPr>
+      <w:r>
+        <w:rPr>
+          <w:highlight w:val="yellow"/>
+          <w:lang w:val="en-US"/>
+        </w:rPr>
+        <w:t xml:space="preserve">graph_assignment_env.py → </w:t>
+      </w:r>
+      <w:r>
+        <w:rPr>
+          <w:b/>
+          <w:bCs/>
+          <w:highlight w:val="yellow"/>
+          <w:lang w:val="en-US"/>
+        </w:rPr>
+        <w:t>contrato Gym</w:t>
+      </w:r>
+      <w:r>
+        <w:rPr>
+          <w:highlight w:val="yellow"/>
+          <w:lang w:val="en-US"/>
+        </w:rPr>
+        <w:t xml:space="preserve"> + </w:t>
+      </w:r>
+      <w:r>
+        <w:rPr>
+          <w:b/>
+          <w:bCs/>
+          <w:highlight w:val="yellow"/>
+          <w:lang w:val="en-US"/>
+        </w:rPr>
+        <w:t>backend obs</w:t>
+      </w:r>
+      <w:r>
+        <w:rPr>
+          <w:highlight w:val="yellow"/>
+          <w:lang w:val="en-US"/>
+        </w:rPr>
+        <w:t xml:space="preserve"> + </w:t>
+      </w:r>
+      <w:r>
+        <w:rPr>
+          <w:b/>
+          <w:bCs/>
+          <w:highlight w:val="yellow"/>
+          <w:lang w:val="en-US"/>
+        </w:rPr>
+        <w:t>action_masks</w:t>
+      </w:r>
+      <w:r>
+        <w:rPr>
+          <w:highlight w:val="yellow"/>
+          <w:lang w:val="en-US"/>
+        </w:rPr>
+        <w:t xml:space="preserve"> + </w:t>
+      </w:r>
+      <w:r>
+        <w:rPr>
+          <w:b/>
+          <w:bCs/>
+          <w:highlight w:val="yellow"/>
+          <w:lang w:val="en-US"/>
+        </w:rPr>
+        <w:t>step/reset</w:t>
+      </w:r>
+      <w:r>
+        <w:rPr>
+          <w:highlight w:val="yellow"/>
+          <w:lang w:val="en-US"/>
+        </w:rPr>
+        <w:t xml:space="preserve"> </w:t>
+      </w:r>
+    </w:p>
+    <w:p>
+      <w:pPr>
+        <w:numPr>
+          <w:ilvl w:val="0"/>
+          <w:numId w:val="130"/>
+        </w:numPr>
+        <w:rPr>
+          <w:highlight w:val="yellow"/>
+          <w:lang w:val="en-US"/>
+        </w:rPr>
+      </w:pPr>
+      <w:r>
+        <w:rPr>
+          <w:highlight w:val="yellow"/>
+          <w:lang w:val="en-US"/>
+        </w:rPr>
+        <w:t xml:space="preserve">gnn_feature_extractor.py → </w:t>
+      </w:r>
+      <w:r>
+        <w:rPr>
+          <w:b/>
+          <w:bCs/>
+          <w:highlight w:val="yellow"/>
+          <w:lang w:val="en-US"/>
+        </w:rPr>
+        <w:t>dónde vive la GNN end-to-end</w:t>
+      </w:r>
+      <w:r>
+        <w:rPr>
+          <w:highlight w:val="yellow"/>
+          <w:lang w:val="en-US"/>
+        </w:rPr>
+        <w:t xml:space="preserve"> (pooling, shapes, architectures) </w:t>
+      </w:r>
+    </w:p>
+    <w:p>
+      <w:pPr>
+        <w:numPr>
+          <w:ilvl w:val="0"/>
+          <w:numId w:val="130"/>
+        </w:numPr>
+        <w:rPr>
+          <w:highlight w:val="yellow"/>
+        </w:rPr>
+      </w:pPr>
+      <w:r>
+        <w:rPr>
+          <w:highlight w:val="yellow"/>
+        </w:rPr>
+        <w:lastRenderedPageBreak/>
+        <w:t xml:space="preserve">gnn_minimal.py → </w:t>
+      </w:r>
+      <w:r>
+        <w:rPr>
+          <w:b/>
+          <w:bCs/>
+          <w:highlight w:val="yellow"/>
+        </w:rPr>
+        <w:t>qué es SAGE/GCN/GAT</w:t>
+      </w:r>
+      <w:r>
+        <w:rPr>
+          <w:highlight w:val="yellow"/>
+        </w:rPr>
+        <w:t xml:space="preserve"> y qué devuelve la GNN (</w:t>
+      </w:r>
+      <w:proofErr w:type="spellStart"/>
+      <w:r>
+        <w:rPr>
+          <w:highlight w:val="yellow"/>
+        </w:rPr>
+        <w:t>embeddings</w:t>
+      </w:r>
+      <w:proofErr w:type="spellEnd"/>
+      <w:r>
+        <w:rPr>
+          <w:highlight w:val="yellow"/>
+        </w:rPr>
+        <w:t>/</w:t>
+      </w:r>
+      <w:proofErr w:type="spellStart"/>
+      <w:r>
+        <w:rPr>
+          <w:highlight w:val="yellow"/>
+        </w:rPr>
+        <w:t>logits</w:t>
+      </w:r>
+      <w:proofErr w:type="spellEnd"/>
+      <w:r>
+        <w:rPr>
+          <w:highlight w:val="yellow"/>
+        </w:rPr>
+        <w:t>/</w:t>
+      </w:r>
+      <w:proofErr w:type="spellStart"/>
+      <w:r>
+        <w:rPr>
+          <w:highlight w:val="yellow"/>
+        </w:rPr>
+        <w:t>probs</w:t>
+      </w:r>
+      <w:proofErr w:type="spellEnd"/>
+      <w:r>
+        <w:rPr>
+          <w:highlight w:val="yellow"/>
+        </w:rPr>
+        <w:t xml:space="preserve">) </w:t>
+      </w:r>
+    </w:p>
+    <w:p>
+      <w:pPr>
+        <w:numPr>
+          <w:ilvl w:val="0"/>
+          <w:numId w:val="130"/>
+        </w:numPr>
+        <w:rPr>
+          <w:highlight w:val="yellow"/>
+        </w:rPr>
+      </w:pPr>
+      <w:r>
+        <w:rPr>
+          <w:highlight w:val="yellow"/>
+        </w:rPr>
+        <w:t xml:space="preserve">heuristic_controller.py → </w:t>
+      </w:r>
+      <w:r>
+        <w:rPr>
+          <w:b/>
+          <w:bCs/>
+          <w:highlight w:val="yellow"/>
+        </w:rPr>
+        <w:t>por qué RL solo decide asignación y no navegación</w:t>
+      </w:r>
+      <w:r>
+        <w:rPr>
+          <w:highlight w:val="yellow"/>
+        </w:rPr>
+        <w:t xml:space="preserve"> </w:t>
+      </w:r>
+    </w:p>
+    <w:p>
+      <w:r>
+        <w:t>Si entiendes 1–3, ya entiendes el 80% del “por qué funciona sin romper SB3”.</w:t>
       </w:r>
     </w:p>
     <w:p/>
@@ -22046,6 +22587,119 @@
     </w:lvl>
   </w:abstractNum>
   <w:abstractNum w:abstractNumId="60" w15:restartNumberingAfterBreak="0">
+    <w:nsid w:val="3BA72E0A"/>
+    <w:multiLevelType w:val="multilevel"/>
+    <w:tmpl w:val="BF5E2B4E"/>
+    <w:lvl w:ilvl="0">
+      <w:start w:val="1"/>
+      <w:numFmt w:val="decimal"/>
+      <w:lvlText w:val="%1."/>
+      <w:lvlJc w:val="left"/>
+      <w:pPr>
+        <w:tabs>
+          <w:tab w:val="num" w:pos="720"/>
+        </w:tabs>
+        <w:ind w:left="720" w:hanging="360"/>
+      </w:pPr>
+    </w:lvl>
+    <w:lvl w:ilvl="1" w:tentative="1">
+      <w:start w:val="1"/>
+      <w:numFmt w:val="decimal"/>
+      <w:lvlText w:val="%2."/>
+      <w:lvlJc w:val="left"/>
+      <w:pPr>
+        <w:tabs>
+          <w:tab w:val="num" w:pos="1440"/>
+        </w:tabs>
+        <w:ind w:left="1440" w:hanging="360"/>
+      </w:pPr>
+    </w:lvl>
+    <w:lvl w:ilvl="2" w:tentative="1">
+      <w:start w:val="1"/>
+      <w:numFmt w:val="decimal"/>
+      <w:lvlText w:val="%3."/>
+      <w:lvlJc w:val="left"/>
+      <w:pPr>
+        <w:tabs>
+          <w:tab w:val="num" w:pos="2160"/>
+        </w:tabs>
+        <w:ind w:left="2160" w:hanging="360"/>
+      </w:pPr>
+    </w:lvl>
+    <w:lvl w:ilvl="3" w:tentative="1">
+      <w:start w:val="1"/>
+      <w:numFmt w:val="decimal"/>
+      <w:lvlText w:val="%4."/>
+      <w:lvlJc w:val="left"/>
+      <w:pPr>
+        <w:tabs>
+          <w:tab w:val="num" w:pos="2880"/>
+        </w:tabs>
+        <w:ind w:left="2880" w:hanging="360"/>
+      </w:pPr>
+    </w:lvl>
+    <w:lvl w:ilvl="4" w:tentative="1">
+      <w:start w:val="1"/>
+      <w:numFmt w:val="decimal"/>
+      <w:lvlText w:val="%5."/>
+      <w:lvlJc w:val="left"/>
+      <w:pPr>
+        <w:tabs>
+          <w:tab w:val="num" w:pos="3600"/>
+        </w:tabs>
+        <w:ind w:left="3600" w:hanging="360"/>
+      </w:pPr>
+    </w:lvl>
+    <w:lvl w:ilvl="5" w:tentative="1">
+      <w:start w:val="1"/>
+      <w:numFmt w:val="decimal"/>
+      <w:lvlText w:val="%6."/>
+      <w:lvlJc w:val="left"/>
+      <w:pPr>
+        <w:tabs>
+          <w:tab w:val="num" w:pos="4320"/>
+        </w:tabs>
+        <w:ind w:left="4320" w:hanging="360"/>
+      </w:pPr>
+    </w:lvl>
+    <w:lvl w:ilvl="6" w:tentative="1">
+      <w:start w:val="1"/>
+      <w:numFmt w:val="decimal"/>
+      <w:lvlText w:val="%7."/>
+      <w:lvlJc w:val="left"/>
+      <w:pPr>
+        <w:tabs>
+          <w:tab w:val="num" w:pos="5040"/>
+        </w:tabs>
+        <w:ind w:left="5040" w:hanging="360"/>
+      </w:pPr>
+    </w:lvl>
+    <w:lvl w:ilvl="7" w:tentative="1">
+      <w:start w:val="1"/>
+      <w:numFmt w:val="decimal"/>
+      <w:lvlText w:val="%8."/>
+      <w:lvlJc w:val="left"/>
+      <w:pPr>
+        <w:tabs>
+          <w:tab w:val="num" w:pos="5760"/>
+        </w:tabs>
+        <w:ind w:left="5760" w:hanging="360"/>
+      </w:pPr>
+    </w:lvl>
+    <w:lvl w:ilvl="8" w:tentative="1">
+      <w:start w:val="1"/>
+      <w:numFmt w:val="decimal"/>
+      <w:lvlText w:val="%9."/>
+      <w:lvlJc w:val="left"/>
+      <w:pPr>
+        <w:tabs>
+          <w:tab w:val="num" w:pos="6480"/>
+        </w:tabs>
+        <w:ind w:left="6480" w:hanging="360"/>
+      </w:pPr>
+    </w:lvl>
+  </w:abstractNum>
+  <w:abstractNum w:abstractNumId="61" w15:restartNumberingAfterBreak="0">
     <w:nsid w:val="3C3F6A6A"/>
     <w:multiLevelType w:val="multilevel"/>
     <w:tmpl w:val="8B163B1E"/>
@@ -22194,7 +22848,7 @@
       </w:rPr>
     </w:lvl>
   </w:abstractNum>
-  <w:abstractNum w:abstractNumId="61" w15:restartNumberingAfterBreak="0">
+  <w:abstractNum w:abstractNumId="62" w15:restartNumberingAfterBreak="0">
     <w:nsid w:val="3DE07498"/>
     <w:multiLevelType w:val="multilevel"/>
     <w:tmpl w:val="804ED322"/>
@@ -22343,7 +22997,7 @@
       </w:rPr>
     </w:lvl>
   </w:abstractNum>
-  <w:abstractNum w:abstractNumId="62" w15:restartNumberingAfterBreak="0">
+  <w:abstractNum w:abstractNumId="63" w15:restartNumberingAfterBreak="0">
     <w:nsid w:val="3E8E0236"/>
     <w:multiLevelType w:val="multilevel"/>
     <w:tmpl w:val="FC3408AA"/>
@@ -22492,7 +23146,7 @@
       </w:rPr>
     </w:lvl>
   </w:abstractNum>
-  <w:abstractNum w:abstractNumId="63" w15:restartNumberingAfterBreak="0">
+  <w:abstractNum w:abstractNumId="64" w15:restartNumberingAfterBreak="0">
     <w:nsid w:val="3F723ED6"/>
     <w:multiLevelType w:val="multilevel"/>
     <w:tmpl w:val="8C120962"/>
@@ -22605,7 +23259,7 @@
       </w:pPr>
     </w:lvl>
   </w:abstractNum>
-  <w:abstractNum w:abstractNumId="64" w15:restartNumberingAfterBreak="0">
+  <w:abstractNum w:abstractNumId="65" w15:restartNumberingAfterBreak="0">
     <w:nsid w:val="3F9029EC"/>
     <w:multiLevelType w:val="multilevel"/>
     <w:tmpl w:val="1548C6FE"/>
@@ -22754,7 +23408,7 @@
       </w:rPr>
     </w:lvl>
   </w:abstractNum>
-  <w:abstractNum w:abstractNumId="65" w15:restartNumberingAfterBreak="0">
+  <w:abstractNum w:abstractNumId="66" w15:restartNumberingAfterBreak="0">
     <w:nsid w:val="40A6600C"/>
     <w:multiLevelType w:val="multilevel"/>
     <w:tmpl w:val="FAAAD178"/>
@@ -22903,7 +23557,7 @@
       </w:rPr>
     </w:lvl>
   </w:abstractNum>
-  <w:abstractNum w:abstractNumId="66" w15:restartNumberingAfterBreak="0">
+  <w:abstractNum w:abstractNumId="67" w15:restartNumberingAfterBreak="0">
     <w:nsid w:val="416618EC"/>
     <w:multiLevelType w:val="multilevel"/>
     <w:tmpl w:val="89A293E4"/>
@@ -23020,7 +23674,7 @@
       </w:pPr>
     </w:lvl>
   </w:abstractNum>
-  <w:abstractNum w:abstractNumId="67" w15:restartNumberingAfterBreak="0">
+  <w:abstractNum w:abstractNumId="68" w15:restartNumberingAfterBreak="0">
     <w:nsid w:val="41CB39DB"/>
     <w:multiLevelType w:val="multilevel"/>
     <w:tmpl w:val="7B18D6D4"/>
@@ -23169,7 +23823,7 @@
       </w:rPr>
     </w:lvl>
   </w:abstractNum>
-  <w:abstractNum w:abstractNumId="68" w15:restartNumberingAfterBreak="0">
+  <w:abstractNum w:abstractNumId="69" w15:restartNumberingAfterBreak="0">
     <w:nsid w:val="42BA1CB7"/>
     <w:multiLevelType w:val="multilevel"/>
     <w:tmpl w:val="7C2E7534"/>
@@ -23318,7 +23972,7 @@
       </w:rPr>
     </w:lvl>
   </w:abstractNum>
-  <w:abstractNum w:abstractNumId="69" w15:restartNumberingAfterBreak="0">
+  <w:abstractNum w:abstractNumId="70" w15:restartNumberingAfterBreak="0">
     <w:nsid w:val="42ED313F"/>
     <w:multiLevelType w:val="multilevel"/>
     <w:tmpl w:val="CF6CF12A"/>
@@ -23431,7 +24085,7 @@
       </w:pPr>
     </w:lvl>
   </w:abstractNum>
-  <w:abstractNum w:abstractNumId="70" w15:restartNumberingAfterBreak="0">
+  <w:abstractNum w:abstractNumId="71" w15:restartNumberingAfterBreak="0">
     <w:nsid w:val="43DE5A63"/>
     <w:multiLevelType w:val="multilevel"/>
     <w:tmpl w:val="9F9A5C0A"/>
@@ -23544,7 +24198,7 @@
       </w:pPr>
     </w:lvl>
   </w:abstractNum>
-  <w:abstractNum w:abstractNumId="71" w15:restartNumberingAfterBreak="0">
+  <w:abstractNum w:abstractNumId="72" w15:restartNumberingAfterBreak="0">
     <w:nsid w:val="45093081"/>
     <w:multiLevelType w:val="multilevel"/>
     <w:tmpl w:val="038C91B2"/>
@@ -23693,7 +24347,7 @@
       </w:rPr>
     </w:lvl>
   </w:abstractNum>
-  <w:abstractNum w:abstractNumId="72" w15:restartNumberingAfterBreak="0">
+  <w:abstractNum w:abstractNumId="73" w15:restartNumberingAfterBreak="0">
     <w:nsid w:val="452F6922"/>
     <w:multiLevelType w:val="multilevel"/>
     <w:tmpl w:val="2F1461B2"/>
@@ -23806,7 +24460,7 @@
       </w:pPr>
     </w:lvl>
   </w:abstractNum>
-  <w:abstractNum w:abstractNumId="73" w15:restartNumberingAfterBreak="0">
+  <w:abstractNum w:abstractNumId="74" w15:restartNumberingAfterBreak="0">
     <w:nsid w:val="4617148D"/>
     <w:multiLevelType w:val="multilevel"/>
     <w:tmpl w:val="16204E04"/>
@@ -23955,7 +24609,7 @@
       </w:rPr>
     </w:lvl>
   </w:abstractNum>
-  <w:abstractNum w:abstractNumId="74" w15:restartNumberingAfterBreak="0">
+  <w:abstractNum w:abstractNumId="75" w15:restartNumberingAfterBreak="0">
     <w:nsid w:val="475E211B"/>
     <w:multiLevelType w:val="multilevel"/>
     <w:tmpl w:val="8C9A5E64"/>
@@ -24104,7 +24758,7 @@
       </w:rPr>
     </w:lvl>
   </w:abstractNum>
-  <w:abstractNum w:abstractNumId="75" w15:restartNumberingAfterBreak="0">
+  <w:abstractNum w:abstractNumId="76" w15:restartNumberingAfterBreak="0">
     <w:nsid w:val="48261D51"/>
     <w:multiLevelType w:val="multilevel"/>
     <w:tmpl w:val="CDCEFE46"/>
@@ -24253,7 +24907,7 @@
       </w:rPr>
     </w:lvl>
   </w:abstractNum>
-  <w:abstractNum w:abstractNumId="76" w15:restartNumberingAfterBreak="0">
+  <w:abstractNum w:abstractNumId="77" w15:restartNumberingAfterBreak="0">
     <w:nsid w:val="49B32D2C"/>
     <w:multiLevelType w:val="multilevel"/>
     <w:tmpl w:val="33D4BA94"/>
@@ -24402,7 +25056,7 @@
       </w:rPr>
     </w:lvl>
   </w:abstractNum>
-  <w:abstractNum w:abstractNumId="77" w15:restartNumberingAfterBreak="0">
+  <w:abstractNum w:abstractNumId="78" w15:restartNumberingAfterBreak="0">
     <w:nsid w:val="4A43386C"/>
     <w:multiLevelType w:val="multilevel"/>
     <w:tmpl w:val="829E491E"/>
@@ -24515,7 +25169,7 @@
       </w:pPr>
     </w:lvl>
   </w:abstractNum>
-  <w:abstractNum w:abstractNumId="78" w15:restartNumberingAfterBreak="0">
+  <w:abstractNum w:abstractNumId="79" w15:restartNumberingAfterBreak="0">
     <w:nsid w:val="4A863762"/>
     <w:multiLevelType w:val="multilevel"/>
     <w:tmpl w:val="CE04E828"/>
@@ -24664,7 +25318,7 @@
       </w:rPr>
     </w:lvl>
   </w:abstractNum>
-  <w:abstractNum w:abstractNumId="79" w15:restartNumberingAfterBreak="0">
+  <w:abstractNum w:abstractNumId="80" w15:restartNumberingAfterBreak="0">
     <w:nsid w:val="4B4E36B9"/>
     <w:multiLevelType w:val="multilevel"/>
     <w:tmpl w:val="104C8CB2"/>
@@ -24813,7 +25467,7 @@
       </w:rPr>
     </w:lvl>
   </w:abstractNum>
-  <w:abstractNum w:abstractNumId="80" w15:restartNumberingAfterBreak="0">
+  <w:abstractNum w:abstractNumId="81" w15:restartNumberingAfterBreak="0">
     <w:nsid w:val="4BE84BC9"/>
     <w:multiLevelType w:val="multilevel"/>
     <w:tmpl w:val="5E601504"/>
@@ -24962,7 +25616,7 @@
       </w:rPr>
     </w:lvl>
   </w:abstractNum>
-  <w:abstractNum w:abstractNumId="81" w15:restartNumberingAfterBreak="0">
+  <w:abstractNum w:abstractNumId="82" w15:restartNumberingAfterBreak="0">
     <w:nsid w:val="4D160DC0"/>
     <w:multiLevelType w:val="multilevel"/>
     <w:tmpl w:val="5B08A664"/>
@@ -25075,7 +25729,7 @@
       </w:pPr>
     </w:lvl>
   </w:abstractNum>
-  <w:abstractNum w:abstractNumId="82" w15:restartNumberingAfterBreak="0">
+  <w:abstractNum w:abstractNumId="83" w15:restartNumberingAfterBreak="0">
     <w:nsid w:val="4F344A32"/>
     <w:multiLevelType w:val="multilevel"/>
     <w:tmpl w:val="68865D4A"/>
@@ -25224,7 +25878,7 @@
       </w:rPr>
     </w:lvl>
   </w:abstractNum>
-  <w:abstractNum w:abstractNumId="83" w15:restartNumberingAfterBreak="0">
+  <w:abstractNum w:abstractNumId="84" w15:restartNumberingAfterBreak="0">
     <w:nsid w:val="4F8A3124"/>
     <w:multiLevelType w:val="multilevel"/>
     <w:tmpl w:val="BB3C6A0C"/>
@@ -25373,7 +26027,7 @@
       </w:rPr>
     </w:lvl>
   </w:abstractNum>
-  <w:abstractNum w:abstractNumId="84" w15:restartNumberingAfterBreak="0">
+  <w:abstractNum w:abstractNumId="85" w15:restartNumberingAfterBreak="0">
     <w:nsid w:val="4FE70E0F"/>
     <w:multiLevelType w:val="multilevel"/>
     <w:tmpl w:val="F60A90A8"/>
@@ -25486,7 +26140,7 @@
       </w:pPr>
     </w:lvl>
   </w:abstractNum>
-  <w:abstractNum w:abstractNumId="85" w15:restartNumberingAfterBreak="0">
+  <w:abstractNum w:abstractNumId="86" w15:restartNumberingAfterBreak="0">
     <w:nsid w:val="50B735DB"/>
     <w:multiLevelType w:val="multilevel"/>
     <w:tmpl w:val="AD22A39C"/>
@@ -25599,7 +26253,7 @@
       </w:pPr>
     </w:lvl>
   </w:abstractNum>
-  <w:abstractNum w:abstractNumId="86" w15:restartNumberingAfterBreak="0">
+  <w:abstractNum w:abstractNumId="87" w15:restartNumberingAfterBreak="0">
     <w:nsid w:val="51597B5D"/>
     <w:multiLevelType w:val="multilevel"/>
     <w:tmpl w:val="CCE62F06"/>
@@ -25748,7 +26402,7 @@
       </w:rPr>
     </w:lvl>
   </w:abstractNum>
-  <w:abstractNum w:abstractNumId="87" w15:restartNumberingAfterBreak="0">
+  <w:abstractNum w:abstractNumId="88" w15:restartNumberingAfterBreak="0">
     <w:nsid w:val="553D468D"/>
     <w:multiLevelType w:val="multilevel"/>
     <w:tmpl w:val="B50AE3E8"/>
@@ -25861,7 +26515,7 @@
       </w:pPr>
     </w:lvl>
   </w:abstractNum>
-  <w:abstractNum w:abstractNumId="88" w15:restartNumberingAfterBreak="0">
+  <w:abstractNum w:abstractNumId="89" w15:restartNumberingAfterBreak="0">
     <w:nsid w:val="55C9506C"/>
     <w:multiLevelType w:val="multilevel"/>
     <w:tmpl w:val="2062C292"/>
@@ -26010,7 +26664,7 @@
       </w:rPr>
     </w:lvl>
   </w:abstractNum>
-  <w:abstractNum w:abstractNumId="89" w15:restartNumberingAfterBreak="0">
+  <w:abstractNum w:abstractNumId="90" w15:restartNumberingAfterBreak="0">
     <w:nsid w:val="56652951"/>
     <w:multiLevelType w:val="multilevel"/>
     <w:tmpl w:val="7A163F82"/>
@@ -26127,7 +26781,7 @@
       </w:pPr>
     </w:lvl>
   </w:abstractNum>
-  <w:abstractNum w:abstractNumId="90" w15:restartNumberingAfterBreak="0">
+  <w:abstractNum w:abstractNumId="91" w15:restartNumberingAfterBreak="0">
     <w:nsid w:val="58993294"/>
     <w:multiLevelType w:val="multilevel"/>
     <w:tmpl w:val="4B2C2A0C"/>
@@ -26276,7 +26930,7 @@
       </w:rPr>
     </w:lvl>
   </w:abstractNum>
-  <w:abstractNum w:abstractNumId="91" w15:restartNumberingAfterBreak="0">
+  <w:abstractNum w:abstractNumId="92" w15:restartNumberingAfterBreak="0">
     <w:nsid w:val="59030172"/>
     <w:multiLevelType w:val="multilevel"/>
     <w:tmpl w:val="421ED242"/>
@@ -26425,7 +27079,7 @@
       </w:rPr>
     </w:lvl>
   </w:abstractNum>
-  <w:abstractNum w:abstractNumId="92" w15:restartNumberingAfterBreak="0">
+  <w:abstractNum w:abstractNumId="93" w15:restartNumberingAfterBreak="0">
     <w:nsid w:val="59567965"/>
     <w:multiLevelType w:val="multilevel"/>
     <w:tmpl w:val="C6EA86A2"/>
@@ -26574,7 +27228,7 @@
       </w:rPr>
     </w:lvl>
   </w:abstractNum>
-  <w:abstractNum w:abstractNumId="93" w15:restartNumberingAfterBreak="0">
+  <w:abstractNum w:abstractNumId="94" w15:restartNumberingAfterBreak="0">
     <w:nsid w:val="5A232D91"/>
     <w:multiLevelType w:val="multilevel"/>
     <w:tmpl w:val="8E329EF2"/>
@@ -26687,7 +27341,7 @@
       </w:pPr>
     </w:lvl>
   </w:abstractNum>
-  <w:abstractNum w:abstractNumId="94" w15:restartNumberingAfterBreak="0">
+  <w:abstractNum w:abstractNumId="95" w15:restartNumberingAfterBreak="0">
     <w:nsid w:val="5A6C3525"/>
     <w:multiLevelType w:val="multilevel"/>
     <w:tmpl w:val="0E32021E"/>
@@ -26836,7 +27490,7 @@
       </w:rPr>
     </w:lvl>
   </w:abstractNum>
-  <w:abstractNum w:abstractNumId="95" w15:restartNumberingAfterBreak="0">
+  <w:abstractNum w:abstractNumId="96" w15:restartNumberingAfterBreak="0">
     <w:nsid w:val="5A831618"/>
     <w:multiLevelType w:val="multilevel"/>
     <w:tmpl w:val="A4B42106"/>
@@ -26985,7 +27639,7 @@
       </w:rPr>
     </w:lvl>
   </w:abstractNum>
-  <w:abstractNum w:abstractNumId="96" w15:restartNumberingAfterBreak="0">
+  <w:abstractNum w:abstractNumId="97" w15:restartNumberingAfterBreak="0">
     <w:nsid w:val="5B0931A5"/>
     <w:multiLevelType w:val="multilevel"/>
     <w:tmpl w:val="7D8A85FA"/>
@@ -27134,7 +27788,7 @@
       </w:rPr>
     </w:lvl>
   </w:abstractNum>
-  <w:abstractNum w:abstractNumId="97" w15:restartNumberingAfterBreak="0">
+  <w:abstractNum w:abstractNumId="98" w15:restartNumberingAfterBreak="0">
     <w:nsid w:val="5B5E601B"/>
     <w:multiLevelType w:val="multilevel"/>
     <w:tmpl w:val="7F8C96E4"/>
@@ -27283,7 +27937,7 @@
       </w:rPr>
     </w:lvl>
   </w:abstractNum>
-  <w:abstractNum w:abstractNumId="98" w15:restartNumberingAfterBreak="0">
+  <w:abstractNum w:abstractNumId="99" w15:restartNumberingAfterBreak="0">
     <w:nsid w:val="5DC7613E"/>
     <w:multiLevelType w:val="multilevel"/>
     <w:tmpl w:val="C94ABC34"/>
@@ -27432,7 +28086,7 @@
       </w:rPr>
     </w:lvl>
   </w:abstractNum>
-  <w:abstractNum w:abstractNumId="99" w15:restartNumberingAfterBreak="0">
+  <w:abstractNum w:abstractNumId="100" w15:restartNumberingAfterBreak="0">
     <w:nsid w:val="5E953779"/>
     <w:multiLevelType w:val="multilevel"/>
     <w:tmpl w:val="B60EC55C"/>
@@ -27581,7 +28235,7 @@
       </w:rPr>
     </w:lvl>
   </w:abstractNum>
-  <w:abstractNum w:abstractNumId="100" w15:restartNumberingAfterBreak="0">
+  <w:abstractNum w:abstractNumId="101" w15:restartNumberingAfterBreak="0">
     <w:nsid w:val="60725084"/>
     <w:multiLevelType w:val="multilevel"/>
     <w:tmpl w:val="2612CBDA"/>
@@ -27730,7 +28384,7 @@
       </w:rPr>
     </w:lvl>
   </w:abstractNum>
-  <w:abstractNum w:abstractNumId="101" w15:restartNumberingAfterBreak="0">
+  <w:abstractNum w:abstractNumId="102" w15:restartNumberingAfterBreak="0">
     <w:nsid w:val="613A26EE"/>
     <w:multiLevelType w:val="multilevel"/>
     <w:tmpl w:val="7408CB28"/>
@@ -27879,7 +28533,7 @@
       </w:rPr>
     </w:lvl>
   </w:abstractNum>
-  <w:abstractNum w:abstractNumId="102" w15:restartNumberingAfterBreak="0">
+  <w:abstractNum w:abstractNumId="103" w15:restartNumberingAfterBreak="0">
     <w:nsid w:val="628426B2"/>
     <w:multiLevelType w:val="multilevel"/>
     <w:tmpl w:val="478636FC"/>
@@ -27992,7 +28646,7 @@
       </w:pPr>
     </w:lvl>
   </w:abstractNum>
-  <w:abstractNum w:abstractNumId="103" w15:restartNumberingAfterBreak="0">
+  <w:abstractNum w:abstractNumId="104" w15:restartNumberingAfterBreak="0">
     <w:nsid w:val="63EE64E9"/>
     <w:multiLevelType w:val="multilevel"/>
     <w:tmpl w:val="17B2898C"/>
@@ -28141,7 +28795,7 @@
       </w:rPr>
     </w:lvl>
   </w:abstractNum>
-  <w:abstractNum w:abstractNumId="104" w15:restartNumberingAfterBreak="0">
+  <w:abstractNum w:abstractNumId="105" w15:restartNumberingAfterBreak="0">
     <w:nsid w:val="646F34E7"/>
     <w:multiLevelType w:val="multilevel"/>
     <w:tmpl w:val="8F52D3E8"/>
@@ -28290,7 +28944,7 @@
       </w:rPr>
     </w:lvl>
   </w:abstractNum>
-  <w:abstractNum w:abstractNumId="105" w15:restartNumberingAfterBreak="0">
+  <w:abstractNum w:abstractNumId="106" w15:restartNumberingAfterBreak="0">
     <w:nsid w:val="677E0B26"/>
     <w:multiLevelType w:val="multilevel"/>
     <w:tmpl w:val="B448D494"/>
@@ -28439,7 +29093,7 @@
       </w:rPr>
     </w:lvl>
   </w:abstractNum>
-  <w:abstractNum w:abstractNumId="106" w15:restartNumberingAfterBreak="0">
+  <w:abstractNum w:abstractNumId="107" w15:restartNumberingAfterBreak="0">
     <w:nsid w:val="6849090A"/>
     <w:multiLevelType w:val="multilevel"/>
     <w:tmpl w:val="C994C5A0"/>
@@ -28588,7 +29242,7 @@
       </w:rPr>
     </w:lvl>
   </w:abstractNum>
-  <w:abstractNum w:abstractNumId="107" w15:restartNumberingAfterBreak="0">
+  <w:abstractNum w:abstractNumId="108" w15:restartNumberingAfterBreak="0">
     <w:nsid w:val="68F84793"/>
     <w:multiLevelType w:val="multilevel"/>
     <w:tmpl w:val="3AA0909A"/>
@@ -28737,7 +29391,7 @@
       </w:rPr>
     </w:lvl>
   </w:abstractNum>
-  <w:abstractNum w:abstractNumId="108" w15:restartNumberingAfterBreak="0">
+  <w:abstractNum w:abstractNumId="109" w15:restartNumberingAfterBreak="0">
     <w:nsid w:val="69E65F2D"/>
     <w:multiLevelType w:val="multilevel"/>
     <w:tmpl w:val="1F72C5D6"/>
@@ -28886,7 +29540,7 @@
       </w:rPr>
     </w:lvl>
   </w:abstractNum>
-  <w:abstractNum w:abstractNumId="109" w15:restartNumberingAfterBreak="0">
+  <w:abstractNum w:abstractNumId="110" w15:restartNumberingAfterBreak="0">
     <w:nsid w:val="6E6A2CA5"/>
     <w:multiLevelType w:val="multilevel"/>
     <w:tmpl w:val="CBE81AC8"/>
@@ -29035,7 +29689,7 @@
       </w:rPr>
     </w:lvl>
   </w:abstractNum>
-  <w:abstractNum w:abstractNumId="110" w15:restartNumberingAfterBreak="0">
+  <w:abstractNum w:abstractNumId="111" w15:restartNumberingAfterBreak="0">
     <w:nsid w:val="6FD921FB"/>
     <w:multiLevelType w:val="multilevel"/>
     <w:tmpl w:val="A3709FB6"/>
@@ -29148,7 +29802,7 @@
       </w:pPr>
     </w:lvl>
   </w:abstractNum>
-  <w:abstractNum w:abstractNumId="111" w15:restartNumberingAfterBreak="0">
+  <w:abstractNum w:abstractNumId="112" w15:restartNumberingAfterBreak="0">
     <w:nsid w:val="715D4259"/>
     <w:multiLevelType w:val="multilevel"/>
     <w:tmpl w:val="16ECC4AE"/>
@@ -29261,7 +29915,7 @@
       </w:pPr>
     </w:lvl>
   </w:abstractNum>
-  <w:abstractNum w:abstractNumId="112" w15:restartNumberingAfterBreak="0">
+  <w:abstractNum w:abstractNumId="113" w15:restartNumberingAfterBreak="0">
     <w:nsid w:val="72CA0AB5"/>
     <w:multiLevelType w:val="multilevel"/>
     <w:tmpl w:val="F48AE8EE"/>
@@ -29374,7 +30028,7 @@
       </w:pPr>
     </w:lvl>
   </w:abstractNum>
-  <w:abstractNum w:abstractNumId="113" w15:restartNumberingAfterBreak="0">
+  <w:abstractNum w:abstractNumId="114" w15:restartNumberingAfterBreak="0">
     <w:nsid w:val="72EF171C"/>
     <w:multiLevelType w:val="multilevel"/>
     <w:tmpl w:val="87BA506C"/>
@@ -29487,7 +30141,7 @@
       </w:pPr>
     </w:lvl>
   </w:abstractNum>
-  <w:abstractNum w:abstractNumId="114" w15:restartNumberingAfterBreak="0">
+  <w:abstractNum w:abstractNumId="115" w15:restartNumberingAfterBreak="0">
     <w:nsid w:val="73A42E84"/>
     <w:multiLevelType w:val="multilevel"/>
     <w:tmpl w:val="51CC6D12"/>
@@ -29636,7 +30290,7 @@
       </w:rPr>
     </w:lvl>
   </w:abstractNum>
-  <w:abstractNum w:abstractNumId="115" w15:restartNumberingAfterBreak="0">
+  <w:abstractNum w:abstractNumId="116" w15:restartNumberingAfterBreak="0">
     <w:nsid w:val="757B45E3"/>
     <w:multiLevelType w:val="multilevel"/>
     <w:tmpl w:val="A77CC540"/>
@@ -29785,7 +30439,7 @@
       </w:rPr>
     </w:lvl>
   </w:abstractNum>
-  <w:abstractNum w:abstractNumId="116" w15:restartNumberingAfterBreak="0">
+  <w:abstractNum w:abstractNumId="117" w15:restartNumberingAfterBreak="0">
     <w:nsid w:val="75A80763"/>
     <w:multiLevelType w:val="multilevel"/>
     <w:tmpl w:val="46F6DE76"/>
@@ -29934,7 +30588,7 @@
       </w:rPr>
     </w:lvl>
   </w:abstractNum>
-  <w:abstractNum w:abstractNumId="117" w15:restartNumberingAfterBreak="0">
+  <w:abstractNum w:abstractNumId="118" w15:restartNumberingAfterBreak="0">
     <w:nsid w:val="77C22387"/>
     <w:multiLevelType w:val="multilevel"/>
     <w:tmpl w:val="3C4C855C"/>
@@ -30083,7 +30737,7 @@
       </w:rPr>
     </w:lvl>
   </w:abstractNum>
-  <w:abstractNum w:abstractNumId="118" w15:restartNumberingAfterBreak="0">
+  <w:abstractNum w:abstractNumId="119" w15:restartNumberingAfterBreak="0">
     <w:nsid w:val="78D43A11"/>
     <w:multiLevelType w:val="multilevel"/>
     <w:tmpl w:val="E12E5AA4"/>
@@ -30232,7 +30886,7 @@
       </w:rPr>
     </w:lvl>
   </w:abstractNum>
-  <w:abstractNum w:abstractNumId="119" w15:restartNumberingAfterBreak="0">
+  <w:abstractNum w:abstractNumId="120" w15:restartNumberingAfterBreak="0">
     <w:nsid w:val="78E83281"/>
     <w:multiLevelType w:val="multilevel"/>
     <w:tmpl w:val="91B432BE"/>
@@ -30381,7 +31035,7 @@
       </w:rPr>
     </w:lvl>
   </w:abstractNum>
-  <w:abstractNum w:abstractNumId="120" w15:restartNumberingAfterBreak="0">
+  <w:abstractNum w:abstractNumId="121" w15:restartNumberingAfterBreak="0">
     <w:nsid w:val="79156B9B"/>
     <w:multiLevelType w:val="multilevel"/>
     <w:tmpl w:val="C0A62E34"/>
@@ -30530,7 +31184,7 @@
       </w:rPr>
     </w:lvl>
   </w:abstractNum>
-  <w:abstractNum w:abstractNumId="121" w15:restartNumberingAfterBreak="0">
+  <w:abstractNum w:abstractNumId="122" w15:restartNumberingAfterBreak="0">
     <w:nsid w:val="79C13014"/>
     <w:multiLevelType w:val="multilevel"/>
     <w:tmpl w:val="671272CC"/>
@@ -30679,7 +31333,7 @@
       </w:rPr>
     </w:lvl>
   </w:abstractNum>
-  <w:abstractNum w:abstractNumId="122" w15:restartNumberingAfterBreak="0">
+  <w:abstractNum w:abstractNumId="123" w15:restartNumberingAfterBreak="0">
     <w:nsid w:val="7ADB6ADE"/>
     <w:multiLevelType w:val="multilevel"/>
     <w:tmpl w:val="0FD0DDA6"/>
@@ -30828,7 +31482,7 @@
       </w:rPr>
     </w:lvl>
   </w:abstractNum>
-  <w:abstractNum w:abstractNumId="123" w15:restartNumberingAfterBreak="0">
+  <w:abstractNum w:abstractNumId="124" w15:restartNumberingAfterBreak="0">
     <w:nsid w:val="7C3E2197"/>
     <w:multiLevelType w:val="multilevel"/>
     <w:tmpl w:val="88105E4C"/>
@@ -30977,7 +31631,7 @@
       </w:rPr>
     </w:lvl>
   </w:abstractNum>
-  <w:abstractNum w:abstractNumId="124" w15:restartNumberingAfterBreak="0">
+  <w:abstractNum w:abstractNumId="125" w15:restartNumberingAfterBreak="0">
     <w:nsid w:val="7D532593"/>
     <w:multiLevelType w:val="multilevel"/>
     <w:tmpl w:val="5D0ACE8E"/>
@@ -31094,7 +31748,7 @@
       </w:pPr>
     </w:lvl>
   </w:abstractNum>
-  <w:abstractNum w:abstractNumId="125" w15:restartNumberingAfterBreak="0">
+  <w:abstractNum w:abstractNumId="126" w15:restartNumberingAfterBreak="0">
     <w:nsid w:val="7E2F1EE5"/>
     <w:multiLevelType w:val="multilevel"/>
     <w:tmpl w:val="E1B6B3F4"/>
@@ -31243,7 +31897,7 @@
       </w:rPr>
     </w:lvl>
   </w:abstractNum>
-  <w:abstractNum w:abstractNumId="126" w15:restartNumberingAfterBreak="0">
+  <w:abstractNum w:abstractNumId="127" w15:restartNumberingAfterBreak="0">
     <w:nsid w:val="7E9D2798"/>
     <w:multiLevelType w:val="multilevel"/>
     <w:tmpl w:val="63E81FD6"/>
@@ -31360,7 +32014,7 @@
       </w:pPr>
     </w:lvl>
   </w:abstractNum>
-  <w:abstractNum w:abstractNumId="127" w15:restartNumberingAfterBreak="0">
+  <w:abstractNum w:abstractNumId="128" w15:restartNumberingAfterBreak="0">
     <w:nsid w:val="7F3601B4"/>
     <w:multiLevelType w:val="multilevel"/>
     <w:tmpl w:val="07DE102E"/>
@@ -31473,7 +32127,7 @@
       </w:pPr>
     </w:lvl>
   </w:abstractNum>
-  <w:abstractNum w:abstractNumId="128" w15:restartNumberingAfterBreak="0">
+  <w:abstractNum w:abstractNumId="129" w15:restartNumberingAfterBreak="0">
     <w:nsid w:val="7F8A13D0"/>
     <w:multiLevelType w:val="multilevel"/>
     <w:tmpl w:val="AB5EDB70"/>
@@ -31623,34 +32277,34 @@
     </w:lvl>
   </w:abstractNum>
   <w:num w:numId="1" w16cid:durableId="192690355">
-    <w:abstractNumId w:val="97"/>
+    <w:abstractNumId w:val="98"/>
   </w:num>
   <w:num w:numId="2" w16cid:durableId="1794444519">
-    <w:abstractNumId w:val="102"/>
+    <w:abstractNumId w:val="103"/>
   </w:num>
   <w:num w:numId="3" w16cid:durableId="1584144904">
     <w:abstractNumId w:val="33"/>
   </w:num>
   <w:num w:numId="4" w16cid:durableId="881747293">
-    <w:abstractNumId w:val="63"/>
+    <w:abstractNumId w:val="64"/>
   </w:num>
   <w:num w:numId="5" w16cid:durableId="367726496">
-    <w:abstractNumId w:val="125"/>
+    <w:abstractNumId w:val="126"/>
   </w:num>
   <w:num w:numId="6" w16cid:durableId="97913231">
     <w:abstractNumId w:val="50"/>
   </w:num>
   <w:num w:numId="7" w16cid:durableId="465510605">
-    <w:abstractNumId w:val="103"/>
+    <w:abstractNumId w:val="104"/>
   </w:num>
   <w:num w:numId="8" w16cid:durableId="414673054">
     <w:abstractNumId w:val="12"/>
   </w:num>
   <w:num w:numId="9" w16cid:durableId="1810050426">
-    <w:abstractNumId w:val="83"/>
+    <w:abstractNumId w:val="84"/>
   </w:num>
   <w:num w:numId="10" w16cid:durableId="1185750901">
-    <w:abstractNumId w:val="90"/>
+    <w:abstractNumId w:val="91"/>
   </w:num>
   <w:num w:numId="11" w16cid:durableId="1070277437">
     <w:abstractNumId w:val="1"/>
@@ -31659,19 +32313,19 @@
     <w:abstractNumId w:val="23"/>
   </w:num>
   <w:num w:numId="13" w16cid:durableId="317340650">
-    <w:abstractNumId w:val="67"/>
+    <w:abstractNumId w:val="68"/>
   </w:num>
   <w:num w:numId="14" w16cid:durableId="328023907">
-    <w:abstractNumId w:val="66"/>
+    <w:abstractNumId w:val="67"/>
   </w:num>
   <w:num w:numId="15" w16cid:durableId="1597129604">
     <w:abstractNumId w:val="6"/>
   </w:num>
   <w:num w:numId="16" w16cid:durableId="1870944984">
-    <w:abstractNumId w:val="84"/>
+    <w:abstractNumId w:val="85"/>
   </w:num>
   <w:num w:numId="17" w16cid:durableId="1683968138">
-    <w:abstractNumId w:val="87"/>
+    <w:abstractNumId w:val="88"/>
   </w:num>
   <w:num w:numId="18" w16cid:durableId="288829627">
     <w:abstractNumId w:val="14"/>
@@ -31680,13 +32334,13 @@
     <w:abstractNumId w:val="37"/>
   </w:num>
   <w:num w:numId="20" w16cid:durableId="723455090">
-    <w:abstractNumId w:val="76"/>
+    <w:abstractNumId w:val="77"/>
   </w:num>
   <w:num w:numId="21" w16cid:durableId="418598004">
     <w:abstractNumId w:val="48"/>
   </w:num>
   <w:num w:numId="22" w16cid:durableId="463164135">
-    <w:abstractNumId w:val="60"/>
+    <w:abstractNumId w:val="61"/>
   </w:num>
   <w:num w:numId="23" w16cid:durableId="1142427482">
     <w:abstractNumId w:val="41"/>
@@ -31698,16 +32352,16 @@
     <w:abstractNumId w:val="46"/>
   </w:num>
   <w:num w:numId="26" w16cid:durableId="1891066006">
-    <w:abstractNumId w:val="100"/>
+    <w:abstractNumId w:val="101"/>
   </w:num>
   <w:num w:numId="27" w16cid:durableId="455022706">
-    <w:abstractNumId w:val="106"/>
+    <w:abstractNumId w:val="107"/>
   </w:num>
   <w:num w:numId="28" w16cid:durableId="826939615">
     <w:abstractNumId w:val="7"/>
   </w:num>
   <w:num w:numId="29" w16cid:durableId="244848398">
-    <w:abstractNumId w:val="108"/>
+    <w:abstractNumId w:val="109"/>
   </w:num>
   <w:num w:numId="30" w16cid:durableId="1133256623">
     <w:abstractNumId w:val="32"/>
@@ -31716,37 +32370,37 @@
     <w:abstractNumId w:val="21"/>
   </w:num>
   <w:num w:numId="32" w16cid:durableId="1336491417">
-    <w:abstractNumId w:val="92"/>
+    <w:abstractNumId w:val="93"/>
   </w:num>
   <w:num w:numId="33" w16cid:durableId="909115797">
-    <w:abstractNumId w:val="82"/>
+    <w:abstractNumId w:val="83"/>
   </w:num>
   <w:num w:numId="34" w16cid:durableId="1497113050">
-    <w:abstractNumId w:val="109"/>
+    <w:abstractNumId w:val="110"/>
   </w:num>
   <w:num w:numId="35" w16cid:durableId="1603797873">
-    <w:abstractNumId w:val="98"/>
+    <w:abstractNumId w:val="99"/>
   </w:num>
   <w:num w:numId="36" w16cid:durableId="1343319196">
-    <w:abstractNumId w:val="69"/>
+    <w:abstractNumId w:val="70"/>
   </w:num>
   <w:num w:numId="37" w16cid:durableId="1996058481">
-    <w:abstractNumId w:val="116"/>
+    <w:abstractNumId w:val="117"/>
   </w:num>
   <w:num w:numId="38" w16cid:durableId="284436130">
     <w:abstractNumId w:val="27"/>
   </w:num>
   <w:num w:numId="39" w16cid:durableId="992759133">
-    <w:abstractNumId w:val="101"/>
+    <w:abstractNumId w:val="102"/>
   </w:num>
   <w:num w:numId="40" w16cid:durableId="1060708748">
     <w:abstractNumId w:val="58"/>
   </w:num>
   <w:num w:numId="41" w16cid:durableId="1482384172">
-    <w:abstractNumId w:val="68"/>
+    <w:abstractNumId w:val="69"/>
   </w:num>
   <w:num w:numId="42" w16cid:durableId="308440354">
-    <w:abstractNumId w:val="85"/>
+    <w:abstractNumId w:val="86"/>
   </w:num>
   <w:num w:numId="43" w16cid:durableId="1247232488">
     <w:abstractNumId w:val="11"/>
@@ -31758,19 +32412,19 @@
     <w:abstractNumId w:val="3"/>
   </w:num>
   <w:num w:numId="46" w16cid:durableId="1621764922">
-    <w:abstractNumId w:val="81"/>
+    <w:abstractNumId w:val="82"/>
   </w:num>
   <w:num w:numId="47" w16cid:durableId="1894534262">
-    <w:abstractNumId w:val="123"/>
+    <w:abstractNumId w:val="124"/>
   </w:num>
   <w:num w:numId="48" w16cid:durableId="1804417964">
     <w:abstractNumId w:val="30"/>
   </w:num>
   <w:num w:numId="49" w16cid:durableId="1199466914">
-    <w:abstractNumId w:val="121"/>
+    <w:abstractNumId w:val="122"/>
   </w:num>
   <w:num w:numId="50" w16cid:durableId="895893798">
-    <w:abstractNumId w:val="73"/>
+    <w:abstractNumId w:val="74"/>
   </w:num>
   <w:num w:numId="51" w16cid:durableId="162748658">
     <w:abstractNumId w:val="8"/>
@@ -31779,34 +32433,34 @@
     <w:abstractNumId w:val="0"/>
   </w:num>
   <w:num w:numId="53" w16cid:durableId="1763646068">
-    <w:abstractNumId w:val="89"/>
+    <w:abstractNumId w:val="90"/>
   </w:num>
   <w:num w:numId="54" w16cid:durableId="1207134300">
     <w:abstractNumId w:val="36"/>
   </w:num>
   <w:num w:numId="55" w16cid:durableId="873005170">
-    <w:abstractNumId w:val="86"/>
+    <w:abstractNumId w:val="87"/>
   </w:num>
   <w:num w:numId="56" w16cid:durableId="1308169849">
-    <w:abstractNumId w:val="77"/>
+    <w:abstractNumId w:val="78"/>
   </w:num>
   <w:num w:numId="57" w16cid:durableId="357968050">
-    <w:abstractNumId w:val="93"/>
+    <w:abstractNumId w:val="94"/>
   </w:num>
   <w:num w:numId="58" w16cid:durableId="1895892093">
-    <w:abstractNumId w:val="120"/>
+    <w:abstractNumId w:val="121"/>
   </w:num>
   <w:num w:numId="59" w16cid:durableId="1027221841">
-    <w:abstractNumId w:val="110"/>
+    <w:abstractNumId w:val="111"/>
   </w:num>
   <w:num w:numId="60" w16cid:durableId="2069063080">
-    <w:abstractNumId w:val="78"/>
+    <w:abstractNumId w:val="79"/>
   </w:num>
   <w:num w:numId="61" w16cid:durableId="49771116">
     <w:abstractNumId w:val="56"/>
   </w:num>
   <w:num w:numId="62" w16cid:durableId="1448159084">
-    <w:abstractNumId w:val="118"/>
+    <w:abstractNumId w:val="119"/>
   </w:num>
   <w:num w:numId="63" w16cid:durableId="1575122264">
     <w:abstractNumId w:val="10"/>
@@ -31818,7 +32472,7 @@
     <w:abstractNumId w:val="55"/>
   </w:num>
   <w:num w:numId="66" w16cid:durableId="339043224">
-    <w:abstractNumId w:val="96"/>
+    <w:abstractNumId w:val="97"/>
   </w:num>
   <w:num w:numId="67" w16cid:durableId="1496143401">
     <w:abstractNumId w:val="17"/>
@@ -31827,13 +32481,13 @@
     <w:abstractNumId w:val="57"/>
   </w:num>
   <w:num w:numId="69" w16cid:durableId="636647002">
-    <w:abstractNumId w:val="70"/>
+    <w:abstractNumId w:val="71"/>
   </w:num>
   <w:num w:numId="70" w16cid:durableId="1385714199">
     <w:abstractNumId w:val="47"/>
   </w:num>
   <w:num w:numId="71" w16cid:durableId="2077898425">
-    <w:abstractNumId w:val="111"/>
+    <w:abstractNumId w:val="112"/>
   </w:num>
   <w:num w:numId="72" w16cid:durableId="444547860">
     <w:abstractNumId w:val="28"/>
@@ -31845,19 +32499,19 @@
     <w:abstractNumId w:val="16"/>
   </w:num>
   <w:num w:numId="75" w16cid:durableId="1010185719">
-    <w:abstractNumId w:val="72"/>
+    <w:abstractNumId w:val="73"/>
   </w:num>
   <w:num w:numId="76" w16cid:durableId="68312096">
-    <w:abstractNumId w:val="119"/>
+    <w:abstractNumId w:val="120"/>
   </w:num>
   <w:num w:numId="77" w16cid:durableId="813985498">
     <w:abstractNumId w:val="19"/>
   </w:num>
   <w:num w:numId="78" w16cid:durableId="1472091110">
-    <w:abstractNumId w:val="115"/>
+    <w:abstractNumId w:val="116"/>
   </w:num>
   <w:num w:numId="79" w16cid:durableId="1560744818">
-    <w:abstractNumId w:val="113"/>
+    <w:abstractNumId w:val="114"/>
   </w:num>
   <w:num w:numId="80" w16cid:durableId="2133285104">
     <w:abstractNumId w:val="43"/>
@@ -31866,10 +32520,10 @@
     <w:abstractNumId w:val="42"/>
   </w:num>
   <w:num w:numId="82" w16cid:durableId="1894808844">
-    <w:abstractNumId w:val="122"/>
+    <w:abstractNumId w:val="123"/>
   </w:num>
   <w:num w:numId="83" w16cid:durableId="154609397">
-    <w:abstractNumId w:val="127"/>
+    <w:abstractNumId w:val="128"/>
   </w:num>
   <w:num w:numId="84" w16cid:durableId="904415263">
     <w:abstractNumId w:val="59"/>
@@ -31878,7 +32532,7 @@
     <w:abstractNumId w:val="13"/>
   </w:num>
   <w:num w:numId="86" w16cid:durableId="1041907343">
-    <w:abstractNumId w:val="75"/>
+    <w:abstractNumId w:val="76"/>
   </w:num>
   <w:num w:numId="87" w16cid:durableId="637536826">
     <w:abstractNumId w:val="39"/>
@@ -31887,19 +32541,19 @@
     <w:abstractNumId w:val="25"/>
   </w:num>
   <w:num w:numId="89" w16cid:durableId="219024226">
-    <w:abstractNumId w:val="128"/>
+    <w:abstractNumId w:val="129"/>
   </w:num>
   <w:num w:numId="90" w16cid:durableId="1387878547">
-    <w:abstractNumId w:val="91"/>
+    <w:abstractNumId w:val="92"/>
   </w:num>
   <w:num w:numId="91" w16cid:durableId="320280345">
-    <w:abstractNumId w:val="79"/>
+    <w:abstractNumId w:val="80"/>
   </w:num>
   <w:num w:numId="92" w16cid:durableId="891773784">
     <w:abstractNumId w:val="54"/>
   </w:num>
   <w:num w:numId="93" w16cid:durableId="1600140324">
-    <w:abstractNumId w:val="124"/>
+    <w:abstractNumId w:val="125"/>
   </w:num>
   <w:num w:numId="94" w16cid:durableId="803352876">
     <w:abstractNumId w:val="9"/>
@@ -31908,19 +32562,19 @@
     <w:abstractNumId w:val="49"/>
   </w:num>
   <w:num w:numId="96" w16cid:durableId="1258364294">
-    <w:abstractNumId w:val="80"/>
+    <w:abstractNumId w:val="81"/>
   </w:num>
   <w:num w:numId="97" w16cid:durableId="1542744364">
-    <w:abstractNumId w:val="74"/>
+    <w:abstractNumId w:val="75"/>
   </w:num>
   <w:num w:numId="98" w16cid:durableId="1179391935">
+    <w:abstractNumId w:val="66"/>
+  </w:num>
+  <w:num w:numId="99" w16cid:durableId="1507403615">
     <w:abstractNumId w:val="65"/>
   </w:num>
-  <w:num w:numId="99" w16cid:durableId="1507403615">
-    <w:abstractNumId w:val="64"/>
-  </w:num>
   <w:num w:numId="100" w16cid:durableId="2095470275">
-    <w:abstractNumId w:val="104"/>
+    <w:abstractNumId w:val="105"/>
   </w:num>
   <w:num w:numId="101" w16cid:durableId="1136216192">
     <w:abstractNumId w:val="53"/>
@@ -31929,19 +32583,19 @@
     <w:abstractNumId w:val="29"/>
   </w:num>
   <w:num w:numId="103" w16cid:durableId="1147824221">
-    <w:abstractNumId w:val="112"/>
+    <w:abstractNumId w:val="113"/>
   </w:num>
   <w:num w:numId="104" w16cid:durableId="1785152204">
     <w:abstractNumId w:val="20"/>
   </w:num>
   <w:num w:numId="105" w16cid:durableId="2107965728">
-    <w:abstractNumId w:val="71"/>
+    <w:abstractNumId w:val="72"/>
   </w:num>
   <w:num w:numId="106" w16cid:durableId="1994990968">
-    <w:abstractNumId w:val="105"/>
+    <w:abstractNumId w:val="106"/>
   </w:num>
   <w:num w:numId="107" w16cid:durableId="1303272197">
-    <w:abstractNumId w:val="94"/>
+    <w:abstractNumId w:val="95"/>
   </w:num>
   <w:num w:numId="108" w16cid:durableId="1555314431">
     <w:abstractNumId w:val="22"/>
@@ -31950,10 +32604,10 @@
     <w:abstractNumId w:val="38"/>
   </w:num>
   <w:num w:numId="110" w16cid:durableId="1747335696">
-    <w:abstractNumId w:val="99"/>
+    <w:abstractNumId w:val="100"/>
   </w:num>
   <w:num w:numId="111" w16cid:durableId="1733119241">
-    <w:abstractNumId w:val="62"/>
+    <w:abstractNumId w:val="63"/>
   </w:num>
   <w:num w:numId="112" w16cid:durableId="1455444160">
     <w:abstractNumId w:val="24"/>
@@ -31974,16 +32628,16 @@
     <w:abstractNumId w:val="51"/>
   </w:num>
   <w:num w:numId="118" w16cid:durableId="1912035400">
-    <w:abstractNumId w:val="114"/>
+    <w:abstractNumId w:val="115"/>
   </w:num>
   <w:num w:numId="119" w16cid:durableId="46225977">
     <w:abstractNumId w:val="31"/>
   </w:num>
   <w:num w:numId="120" w16cid:durableId="1129326893">
-    <w:abstractNumId w:val="117"/>
+    <w:abstractNumId w:val="118"/>
   </w:num>
   <w:num w:numId="121" w16cid:durableId="683021237">
-    <w:abstractNumId w:val="95"/>
+    <w:abstractNumId w:val="96"/>
   </w:num>
   <w:num w:numId="122" w16cid:durableId="156462817">
     <w:abstractNumId w:val="45"/>
@@ -31995,19 +32649,22 @@
     <w:abstractNumId w:val="2"/>
   </w:num>
   <w:num w:numId="125" w16cid:durableId="1644654324">
-    <w:abstractNumId w:val="126"/>
+    <w:abstractNumId w:val="127"/>
   </w:num>
   <w:num w:numId="126" w16cid:durableId="1665547422">
-    <w:abstractNumId w:val="107"/>
+    <w:abstractNumId w:val="108"/>
   </w:num>
   <w:num w:numId="127" w16cid:durableId="147132538">
     <w:abstractNumId w:val="52"/>
   </w:num>
   <w:num w:numId="128" w16cid:durableId="953633194">
-    <w:abstractNumId w:val="61"/>
+    <w:abstractNumId w:val="62"/>
   </w:num>
   <w:num w:numId="129" w16cid:durableId="2107647076">
-    <w:abstractNumId w:val="88"/>
+    <w:abstractNumId w:val="89"/>
+  </w:num>
+  <w:num w:numId="130" w16cid:durableId="1521625066">
+    <w:abstractNumId w:val="60"/>
   </w:num>
 </w:numbering>
 </file>

</xml_diff>